<commit_message>
Deploying to gh-pages from @ Bibek-Luitel/bibek-luitel.github.io@d4b63b1bb62f1c1659d37f95c594a6e54346c59a 🚀
</commit_message>
<xml_diff>
--- a/assets/pdf/cv_full_bibekluitel.docx
+++ b/assets/pdf/cv_full_bibekluitel.docx
@@ -163,7 +163,23 @@
           <w:sz w:val="22"/>
           <w:szCs w:val="22"/>
         </w:rPr>
+        <w:t>(</w:t>
+      </w:r>
+      <w:r>
+        <w:rPr>
+          <w:rFonts w:ascii="Times New Roman" w:hAnsi="Times New Roman" w:cs="Times New Roman"/>
+          <w:sz w:val="22"/>
+          <w:szCs w:val="22"/>
+        </w:rPr>
         <w:t>Expected</w:t>
+      </w:r>
+      <w:r>
+        <w:rPr>
+          <w:rFonts w:ascii="Times New Roman" w:hAnsi="Times New Roman" w:cs="Times New Roman"/>
+          <w:sz w:val="22"/>
+          <w:szCs w:val="22"/>
+        </w:rPr>
+        <w:t>)</w:t>
       </w:r>
       <w:r>
         <w:rPr>
@@ -284,6 +300,35 @@
           <w:szCs w:val="22"/>
         </w:rPr>
         <w:t>X</w:t>
+      </w:r>
+    </w:p>
+    <w:p>
+      <w:pPr>
+        <w:pStyle w:val="ListParagraph"/>
+        <w:spacing w:after="120" w:line="240" w:lineRule="auto"/>
+        <w:rPr>
+          <w:rFonts w:ascii="Times New Roman" w:hAnsi="Times New Roman" w:cs="Times New Roman"/>
+          <w:sz w:val="22"/>
+          <w:szCs w:val="22"/>
+        </w:rPr>
+      </w:pPr>
+      <w:r>
+        <w:rPr>
+          <w:rFonts w:ascii="Times New Roman" w:hAnsi="Times New Roman" w:cs="Times New Roman"/>
+          <w:b/>
+          <w:bCs/>
+          <w:sz w:val="22"/>
+          <w:szCs w:val="22"/>
+        </w:rPr>
+        <w:t>Concentration</w:t>
+      </w:r>
+      <w:r>
+        <w:rPr>
+          <w:rFonts w:ascii="Times New Roman" w:hAnsi="Times New Roman" w:cs="Times New Roman"/>
+          <w:sz w:val="22"/>
+          <w:szCs w:val="22"/>
+        </w:rPr>
+        <w:t>: Higher Education Administration</w:t>
       </w:r>
     </w:p>
     <w:p>
@@ -300,10 +345,20 @@
       <w:r>
         <w:rPr>
           <w:rFonts w:ascii="Times New Roman" w:hAnsi="Times New Roman" w:cs="Times New Roman"/>
-          <w:sz w:val="22"/>
-          <w:szCs w:val="22"/>
-        </w:rPr>
-        <w:t xml:space="preserve">Dissertation: </w:t>
+          <w:b/>
+          <w:bCs/>
+          <w:sz w:val="22"/>
+          <w:szCs w:val="22"/>
+        </w:rPr>
+        <w:t>Dissertation</w:t>
+      </w:r>
+      <w:r>
+        <w:rPr>
+          <w:rFonts w:ascii="Times New Roman" w:hAnsi="Times New Roman" w:cs="Times New Roman"/>
+          <w:sz w:val="22"/>
+          <w:szCs w:val="22"/>
+        </w:rPr>
+        <w:t xml:space="preserve">: </w:t>
       </w:r>
       <w:r>
         <w:rPr>
@@ -702,7 +757,22 @@
           <w:szCs w:val="22"/>
         </w:rPr>
         <w:tab/>
-        <w:t>Aug 2022</w:t>
+      </w:r>
+      <w:r>
+        <w:rPr>
+          <w:rFonts w:ascii="Times New Roman" w:hAnsi="Times New Roman" w:cs="Times New Roman"/>
+          <w:sz w:val="22"/>
+          <w:szCs w:val="22"/>
+        </w:rPr>
+        <w:t>Sept</w:t>
+      </w:r>
+      <w:r>
+        <w:rPr>
+          <w:rFonts w:ascii="Times New Roman" w:hAnsi="Times New Roman" w:cs="Times New Roman"/>
+          <w:sz w:val="22"/>
+          <w:szCs w:val="22"/>
+        </w:rPr>
+        <w:t xml:space="preserve"> 2022</w:t>
       </w:r>
       <w:r>
         <w:rPr>
@@ -1345,25 +1415,7 @@
           <w:sz w:val="22"/>
           <w:szCs w:val="22"/>
         </w:rPr>
-        <w:t xml:space="preserve">Trained 150 enumerators in </w:t>
-      </w:r>
-      <w:proofErr w:type="spellStart"/>
-      <w:r>
-        <w:rPr>
-          <w:rFonts w:ascii="Times New Roman" w:hAnsi="Times New Roman" w:cs="Times New Roman"/>
-          <w:sz w:val="22"/>
-          <w:szCs w:val="22"/>
-        </w:rPr>
-        <w:t>CSPro</w:t>
-      </w:r>
-      <w:proofErr w:type="spellEnd"/>
-      <w:r>
-        <w:rPr>
-          <w:rFonts w:ascii="Times New Roman" w:hAnsi="Times New Roman" w:cs="Times New Roman"/>
-          <w:sz w:val="22"/>
-          <w:szCs w:val="22"/>
-        </w:rPr>
-        <w:t xml:space="preserve"> (CAPI) and supervised the implementation of a 2500-household survey across diverse field sites.</w:t>
+        <w:t>Trained 150 enumerators in CSPro (CAPI) and supervised the implementation of a 2500-household survey across diverse field sites.</w:t>
       </w:r>
     </w:p>
     <w:p>
@@ -2012,7 +2064,15 @@
           <w:b/>
           <w:bCs/>
         </w:rPr>
-        <w:t xml:space="preserve"> Edited</w:t>
+        <w:t xml:space="preserve"> E</w:t>
+      </w:r>
+      <w:r>
+        <w:rPr>
+          <w:rFonts w:ascii="Times New Roman" w:hAnsi="Times New Roman" w:cs="Times New Roman"/>
+          <w:b/>
+          <w:bCs/>
+        </w:rPr>
+        <w:t>ditor</w:t>
       </w:r>
       <w:r>
         <w:rPr>
@@ -2065,27 +2125,7 @@
           <w:sz w:val="22"/>
           <w:szCs w:val="22"/>
         </w:rPr>
-        <w:t xml:space="preserve">Las voces </w:t>
-      </w:r>
-      <w:proofErr w:type="spellStart"/>
-      <w:r>
-        <w:rPr>
-          <w:rFonts w:ascii="Times New Roman" w:hAnsi="Times New Roman" w:cs="Times New Roman"/>
-          <w:i/>
-          <w:sz w:val="22"/>
-          <w:szCs w:val="22"/>
-        </w:rPr>
-        <w:t>nuevas</w:t>
-      </w:r>
-      <w:proofErr w:type="spellEnd"/>
-      <w:r>
-        <w:rPr>
-          <w:rFonts w:ascii="Times New Roman" w:hAnsi="Times New Roman" w:cs="Times New Roman"/>
-          <w:i/>
-          <w:sz w:val="22"/>
-          <w:szCs w:val="22"/>
-        </w:rPr>
-        <w:t>: Emerging scholarship on Latinas in leadership</w:t>
+        <w:t>Las voces nuevas: Emerging scholarship on Latinas in leadership</w:t>
       </w:r>
       <w:r>
         <w:rPr>
@@ -2198,6 +2238,14 @@
         </w:rPr>
         <w:t>Book</w:t>
       </w:r>
+      <w:r>
+        <w:rPr>
+          <w:rFonts w:ascii="Times New Roman" w:hAnsi="Times New Roman" w:cs="Times New Roman"/>
+          <w:b/>
+          <w:bCs/>
+        </w:rPr>
+        <w:t xml:space="preserve"> Author</w:t>
+      </w:r>
     </w:p>
     <w:p>
       <w:pPr>
@@ -2233,27 +2281,7 @@
           <w:sz w:val="22"/>
           <w:szCs w:val="22"/>
         </w:rPr>
-        <w:t xml:space="preserve">Interim impact assessment of COVID-19 to underrepresented (Indigenous, Dalit, and </w:t>
-      </w:r>
-      <w:proofErr w:type="spellStart"/>
-      <w:r>
-        <w:rPr>
-          <w:rFonts w:ascii="Times New Roman" w:hAnsi="Times New Roman" w:cs="Times New Roman"/>
-          <w:i/>
-          <w:sz w:val="22"/>
-          <w:szCs w:val="22"/>
-        </w:rPr>
-        <w:t>Madheshi</w:t>
-      </w:r>
-      <w:proofErr w:type="spellEnd"/>
-      <w:r>
-        <w:rPr>
-          <w:rFonts w:ascii="Times New Roman" w:hAnsi="Times New Roman" w:cs="Times New Roman"/>
-          <w:i/>
-          <w:sz w:val="22"/>
-          <w:szCs w:val="22"/>
-        </w:rPr>
-        <w:t xml:space="preserve">) people with disabilities in Nepal. </w:t>
+        <w:t xml:space="preserve">Interim impact assessment of COVID-19 to underrepresented (Indigenous, Dalit, and Madheshi) people with disabilities in Nepal. </w:t>
       </w:r>
       <w:r>
         <w:rPr>
@@ -2957,25 +2985,7 @@
           <w:sz w:val="22"/>
           <w:szCs w:val="22"/>
         </w:rPr>
-        <w:t xml:space="preserve">., Khatiwada, R., Sinha, B., </w:t>
-      </w:r>
-      <w:proofErr w:type="spellStart"/>
-      <w:r>
-        <w:rPr>
-          <w:rFonts w:ascii="Times New Roman" w:hAnsi="Times New Roman" w:cs="Times New Roman"/>
-          <w:sz w:val="22"/>
-          <w:szCs w:val="22"/>
-        </w:rPr>
-        <w:t>Amgai</w:t>
-      </w:r>
-      <w:proofErr w:type="spellEnd"/>
-      <w:r>
-        <w:rPr>
-          <w:rFonts w:ascii="Times New Roman" w:hAnsi="Times New Roman" w:cs="Times New Roman"/>
-          <w:sz w:val="22"/>
-          <w:szCs w:val="22"/>
-        </w:rPr>
-        <w:t xml:space="preserve">, T. (2022). </w:t>
+        <w:t xml:space="preserve">., Khatiwada, R., Sinha, B., Amgai, T. (2022). </w:t>
       </w:r>
       <w:r>
         <w:rPr>
@@ -4053,25 +4063,7 @@
           <w:sz w:val="22"/>
           <w:szCs w:val="22"/>
         </w:rPr>
-        <w:t>Meyer-</w:t>
-      </w:r>
-      <w:proofErr w:type="spellStart"/>
-      <w:r>
-        <w:rPr>
-          <w:rFonts w:ascii="Times New Roman" w:hAnsi="Times New Roman" w:cs="Times New Roman"/>
-          <w:sz w:val="22"/>
-          <w:szCs w:val="22"/>
-        </w:rPr>
-        <w:t>Sahling</w:t>
-      </w:r>
-      <w:proofErr w:type="spellEnd"/>
-      <w:r>
-        <w:rPr>
-          <w:rFonts w:ascii="Times New Roman" w:hAnsi="Times New Roman" w:cs="Times New Roman"/>
-          <w:sz w:val="22"/>
-          <w:szCs w:val="22"/>
-        </w:rPr>
-        <w:t>, JH, Schuster, C., Mikkelsen, K.S.,</w:t>
+        <w:t>Meyer-Sahling, JH, Schuster, C., Mikkelsen, K.S.,</w:t>
       </w:r>
       <w:r>
         <w:rPr>
@@ -4275,18 +4267,8 @@
           <w:sz w:val="22"/>
           <w:szCs w:val="22"/>
         </w:rPr>
-        <w:t xml:space="preserve">Anti- Corruption Evidence </w:t>
-      </w:r>
-      <w:proofErr w:type="spellStart"/>
-      <w:r>
-        <w:rPr>
-          <w:rFonts w:ascii="Times New Roman" w:hAnsi="Times New Roman" w:cs="Times New Roman"/>
-          <w:sz w:val="22"/>
-          <w:szCs w:val="22"/>
-        </w:rPr>
-        <w:t>Programme</w:t>
-      </w:r>
-      <w:proofErr w:type="spellEnd"/>
+        <w:t>Anti- Corruption Evidence Programme</w:t>
+      </w:r>
       <w:r>
         <w:rPr>
           <w:rFonts w:ascii="Times New Roman" w:hAnsi="Times New Roman" w:cs="Times New Roman"/>
@@ -5836,7 +5818,6 @@
         </w:rPr>
         <w:t xml:space="preserve"> (</w:t>
       </w:r>
-      <w:proofErr w:type="gramStart"/>
       <w:r>
         <w:rPr>
           <w:rFonts w:ascii="Times New Roman" w:hAnsi="Times New Roman" w:cs="Times New Roman"/>
@@ -5855,9 +5836,8 @@
           <w:sz w:val="22"/>
           <w:szCs w:val="22"/>
         </w:rPr>
-        <w:t>aster’s</w:t>
-      </w:r>
-      <w:proofErr w:type="gramEnd"/>
+        <w:t xml:space="preserve">aster’s </w:t>
+      </w:r>
       <w:r>
         <w:rPr>
           <w:rFonts w:ascii="Times New Roman" w:hAnsi="Times New Roman" w:cs="Times New Roman"/>
@@ -5866,7 +5846,7 @@
           <w:sz w:val="22"/>
           <w:szCs w:val="22"/>
         </w:rPr>
-        <w:t xml:space="preserve"> </w:t>
+        <w:t>L</w:t>
       </w:r>
       <w:r>
         <w:rPr>
@@ -5876,7 +5856,7 @@
           <w:sz w:val="22"/>
           <w:szCs w:val="22"/>
         </w:rPr>
-        <w:t>L</w:t>
+        <w:t>evel)</w:t>
       </w:r>
       <w:r>
         <w:rPr>
@@ -5886,7 +5866,7 @@
           <w:sz w:val="22"/>
           <w:szCs w:val="22"/>
         </w:rPr>
-        <w:t>evel)</w:t>
+        <w:t xml:space="preserve"> Course</w:t>
       </w:r>
       <w:r>
         <w:rPr>
@@ -5896,7 +5876,7 @@
           <w:sz w:val="22"/>
           <w:szCs w:val="22"/>
         </w:rPr>
-        <w:t xml:space="preserve"> Course</w:t>
+        <w:t xml:space="preserve"> Taught</w:t>
       </w:r>
     </w:p>
     <w:p>
@@ -6052,29 +6032,7 @@
           <w:sz w:val="22"/>
           <w:szCs w:val="22"/>
         </w:rPr>
-        <w:t xml:space="preserve">IB&amp;MS College, </w:t>
-      </w:r>
-      <w:proofErr w:type="spellStart"/>
-      <w:r>
-        <w:rPr>
-          <w:rFonts w:ascii="Times New Roman" w:hAnsi="Times New Roman" w:cs="Times New Roman"/>
-          <w:i/>
-          <w:iCs/>
-          <w:sz w:val="22"/>
-          <w:szCs w:val="22"/>
-        </w:rPr>
-        <w:t>Bharathiar</w:t>
-      </w:r>
-      <w:proofErr w:type="spellEnd"/>
-      <w:r>
-        <w:rPr>
-          <w:rFonts w:ascii="Times New Roman" w:hAnsi="Times New Roman" w:cs="Times New Roman"/>
-          <w:i/>
-          <w:iCs/>
-          <w:sz w:val="22"/>
-          <w:szCs w:val="22"/>
-        </w:rPr>
-        <w:t xml:space="preserve"> University</w:t>
+        <w:t>IB&amp;MS College, Bharathiar University</w:t>
       </w:r>
       <w:r>
         <w:rPr>
@@ -6262,7 +6220,6 @@
           <w:szCs w:val="22"/>
         </w:rPr>
       </w:pPr>
-      <w:proofErr w:type="spellStart"/>
       <w:r>
         <w:rPr>
           <w:rFonts w:ascii="Times New Roman" w:hAnsi="Times New Roman" w:cs="Times New Roman"/>
@@ -6271,18 +6228,7 @@
           <w:sz w:val="22"/>
           <w:szCs w:val="22"/>
         </w:rPr>
-        <w:t>Kavre</w:t>
-      </w:r>
-      <w:proofErr w:type="spellEnd"/>
-      <w:r>
-        <w:rPr>
-          <w:rFonts w:ascii="Times New Roman" w:hAnsi="Times New Roman" w:cs="Times New Roman"/>
-          <w:i/>
-          <w:iCs/>
-          <w:sz w:val="22"/>
-          <w:szCs w:val="22"/>
-        </w:rPr>
-        <w:t xml:space="preserve"> Multiple Campus, Tribhuvan University, Nepal </w:t>
+        <w:t xml:space="preserve">Kavre Multiple Campus, Tribhuvan University, Nepal </w:t>
       </w:r>
       <w:r>
         <w:rPr>
@@ -6360,7 +6306,6 @@
         </w:rPr>
         <w:t xml:space="preserve"> (</w:t>
       </w:r>
-      <w:proofErr w:type="gramStart"/>
       <w:r>
         <w:rPr>
           <w:rFonts w:ascii="Times New Roman" w:hAnsi="Times New Roman" w:cs="Times New Roman"/>
@@ -6379,9 +6324,8 @@
           <w:sz w:val="22"/>
           <w:szCs w:val="22"/>
         </w:rPr>
-        <w:t>achelor’s</w:t>
-      </w:r>
-      <w:proofErr w:type="gramEnd"/>
+        <w:t xml:space="preserve">achelor’s </w:t>
+      </w:r>
       <w:r>
         <w:rPr>
           <w:rFonts w:ascii="Times New Roman" w:hAnsi="Times New Roman" w:cs="Times New Roman"/>
@@ -6390,7 +6334,7 @@
           <w:sz w:val="22"/>
           <w:szCs w:val="22"/>
         </w:rPr>
-        <w:t xml:space="preserve"> </w:t>
+        <w:t>L</w:t>
       </w:r>
       <w:r>
         <w:rPr>
@@ -6400,7 +6344,7 @@
           <w:sz w:val="22"/>
           <w:szCs w:val="22"/>
         </w:rPr>
-        <w:t>L</w:t>
+        <w:t>evel)</w:t>
       </w:r>
       <w:r>
         <w:rPr>
@@ -6410,7 +6354,7 @@
           <w:sz w:val="22"/>
           <w:szCs w:val="22"/>
         </w:rPr>
-        <w:t>evel)</w:t>
+        <w:t xml:space="preserve"> Course</w:t>
       </w:r>
       <w:r>
         <w:rPr>
@@ -6420,7 +6364,7 @@
           <w:sz w:val="22"/>
           <w:szCs w:val="22"/>
         </w:rPr>
-        <w:t xml:space="preserve"> Course</w:t>
+        <w:t xml:space="preserve"> Taught</w:t>
       </w:r>
     </w:p>
     <w:p>
@@ -8183,23 +8127,13 @@
           <w:szCs w:val="22"/>
         </w:rPr>
       </w:pPr>
-      <w:proofErr w:type="spellStart"/>
-      <w:r>
-        <w:rPr>
-          <w:rFonts w:ascii="Times New Roman" w:hAnsi="Times New Roman" w:cs="Times New Roman"/>
-          <w:sz w:val="22"/>
-          <w:szCs w:val="22"/>
-        </w:rPr>
-        <w:t>Bomjon</w:t>
-      </w:r>
-      <w:proofErr w:type="spellEnd"/>
-      <w:r>
-        <w:rPr>
-          <w:rFonts w:ascii="Times New Roman" w:hAnsi="Times New Roman" w:cs="Times New Roman"/>
-          <w:sz w:val="22"/>
-          <w:szCs w:val="22"/>
-        </w:rPr>
-        <w:t xml:space="preserve">, Yamima. (2020, January). </w:t>
+      <w:r>
+        <w:rPr>
+          <w:rFonts w:ascii="Times New Roman" w:hAnsi="Times New Roman" w:cs="Times New Roman"/>
+          <w:sz w:val="22"/>
+          <w:szCs w:val="22"/>
+        </w:rPr>
+        <w:t xml:space="preserve">Bomjon, Yamima. (2020, January). </w:t>
       </w:r>
       <w:r>
         <w:rPr>
@@ -8277,7 +8211,6 @@
         </w:rPr>
         <w:t xml:space="preserve"> </w:t>
       </w:r>
-      <w:proofErr w:type="spellStart"/>
       <w:r>
         <w:rPr>
           <w:rFonts w:ascii="Times New Roman" w:hAnsi="Times New Roman" w:cs="Times New Roman"/>
@@ -8287,7 +8220,6 @@
         </w:rPr>
         <w:t>Lisankhu</w:t>
       </w:r>
-      <w:proofErr w:type="spellEnd"/>
       <w:r>
         <w:rPr>
           <w:rFonts w:ascii="Times New Roman" w:hAnsi="Times New Roman" w:cs="Times New Roman"/>
@@ -8355,7 +8287,6 @@
         </w:rPr>
         <w:t xml:space="preserve"> </w:t>
       </w:r>
-      <w:proofErr w:type="spellStart"/>
       <w:r>
         <w:rPr>
           <w:rFonts w:ascii="Times New Roman" w:hAnsi="Times New Roman" w:cs="Times New Roman"/>
@@ -8365,7 +8296,6 @@
         </w:rPr>
         <w:t>Sindhupalchowk</w:t>
       </w:r>
-      <w:proofErr w:type="spellEnd"/>
       <w:r>
         <w:rPr>
           <w:rFonts w:ascii="Times New Roman" w:hAnsi="Times New Roman" w:cs="Times New Roman"/>
@@ -9432,43 +9362,7 @@
           <w:sz w:val="22"/>
           <w:szCs w:val="22"/>
         </w:rPr>
-        <w:t xml:space="preserve">: Qualtrics, </w:t>
-      </w:r>
-      <w:proofErr w:type="spellStart"/>
-      <w:r>
-        <w:rPr>
-          <w:rFonts w:ascii="Times New Roman" w:hAnsi="Times New Roman"/>
-          <w:sz w:val="22"/>
-          <w:szCs w:val="22"/>
-        </w:rPr>
-        <w:t>KoBo</w:t>
-      </w:r>
-      <w:proofErr w:type="spellEnd"/>
-      <w:r>
-        <w:rPr>
-          <w:rFonts w:ascii="Times New Roman" w:hAnsi="Times New Roman"/>
-          <w:sz w:val="22"/>
-          <w:szCs w:val="22"/>
-        </w:rPr>
-        <w:t xml:space="preserve"> Toolbox, </w:t>
-      </w:r>
-      <w:proofErr w:type="spellStart"/>
-      <w:r>
-        <w:rPr>
-          <w:rFonts w:ascii="Times New Roman" w:hAnsi="Times New Roman"/>
-          <w:sz w:val="22"/>
-          <w:szCs w:val="22"/>
-        </w:rPr>
-        <w:t>CSPro</w:t>
-      </w:r>
-      <w:proofErr w:type="spellEnd"/>
-      <w:r>
-        <w:rPr>
-          <w:rFonts w:ascii="Times New Roman" w:hAnsi="Times New Roman"/>
-          <w:sz w:val="22"/>
-          <w:szCs w:val="22"/>
-        </w:rPr>
-        <w:t>.</w:t>
+        <w:t>: Qualtrics, KoBo Toolbox, CSPro.</w:t>
       </w:r>
     </w:p>
     <w:p>
@@ -9953,21 +9847,7 @@
         <w:rPr>
           <w:rFonts w:ascii="Times New Roman" w:hAnsi="Times New Roman" w:cs="Times New Roman"/>
         </w:rPr>
-        <w:t>, Trained enumerators, and field supervisor to collect quality data using CAPI (</w:t>
-      </w:r>
-      <w:proofErr w:type="spellStart"/>
-      <w:r>
-        <w:rPr>
-          <w:rFonts w:ascii="Times New Roman" w:hAnsi="Times New Roman" w:cs="Times New Roman"/>
-        </w:rPr>
-        <w:t>CSPro</w:t>
-      </w:r>
-      <w:proofErr w:type="spellEnd"/>
-      <w:r>
-        <w:rPr>
-          <w:rFonts w:ascii="Times New Roman" w:hAnsi="Times New Roman" w:cs="Times New Roman"/>
-        </w:rPr>
-        <w:t>), Social Impact Inc.</w:t>
+        <w:t>, Trained enumerators, and field supervisor to collect quality data using CAPI (CSPro), Social Impact Inc.</w:t>
       </w:r>
     </w:p>
     <w:p>
@@ -10004,14 +9884,12 @@
         </w:rPr>
         <w:t xml:space="preserve">, </w:t>
       </w:r>
-      <w:proofErr w:type="gramStart"/>
       <w:r>
         <w:rPr>
           <w:rFonts w:ascii="Times New Roman" w:hAnsi="Times New Roman" w:cs="Times New Roman"/>
         </w:rPr>
         <w:t>Delivered</w:t>
       </w:r>
-      <w:proofErr w:type="gramEnd"/>
       <w:r>
         <w:rPr>
           <w:rFonts w:ascii="Times New Roman" w:hAnsi="Times New Roman" w:cs="Times New Roman"/>
@@ -10288,21 +10166,7 @@
         <w:rPr>
           <w:bCs/>
         </w:rPr>
-        <w:t xml:space="preserve">, Community Rebuilding Project, Rotary Club of </w:t>
-      </w:r>
-      <w:proofErr w:type="spellStart"/>
-      <w:r>
-        <w:rPr>
-          <w:bCs/>
-        </w:rPr>
-        <w:t>Jawalakhel</w:t>
-      </w:r>
-      <w:proofErr w:type="spellEnd"/>
-      <w:r>
-        <w:rPr>
-          <w:bCs/>
-        </w:rPr>
-        <w:t>,</w:t>
+        <w:t>, Community Rebuilding Project, Rotary Club of Jawalakhel,</w:t>
       </w:r>
       <w:r>
         <w:rPr>
@@ -10351,21 +10215,7 @@
           <w:bCs/>
         </w:rPr>
         <w:tab/>
-        <w:t xml:space="preserve">Secretary, Rotary Club of </w:t>
-      </w:r>
-      <w:proofErr w:type="spellStart"/>
-      <w:r>
-        <w:rPr>
-          <w:bCs/>
-        </w:rPr>
-        <w:t>Dhulikhel</w:t>
-      </w:r>
-      <w:proofErr w:type="spellEnd"/>
-      <w:r>
-        <w:rPr>
-          <w:bCs/>
-        </w:rPr>
-        <w:t>, Nepal</w:t>
+        <w:t>Secretary, Rotary Club of Dhulikhel, Nepal</w:t>
       </w:r>
     </w:p>
     <w:p>
@@ -10385,6 +10235,9 @@
       </w:pPr>
       <w:r>
         <w:t>PROFESSIONAL AFFILIATIONS</w:t>
+      </w:r>
+      <w:r>
+        <w:t>/MEMBERSHIP</w:t>
       </w:r>
     </w:p>
     <w:p>

</xml_diff>

<commit_message>
Deploying to gh-pages from @ Bibek-Luitel/bibek-luitel.github.io@a9fbe43c7ce8cff0186c9f7990f9a9e53dadf947 🚀
</commit_message>
<xml_diff>
--- a/assets/pdf/cv_full_bibekluitel.docx
+++ b/assets/pdf/cv_full_bibekluitel.docx
@@ -583,7 +583,23 @@
           <w:sz w:val="22"/>
           <w:szCs w:val="22"/>
         </w:rPr>
-        <w:t>and polity relating to higher education financing.</w:t>
+        <w:t>and poli</w:t>
+      </w:r>
+      <w:r>
+        <w:rPr>
+          <w:rFonts w:ascii="Times New Roman" w:hAnsi="Times New Roman"/>
+          <w:sz w:val="22"/>
+          <w:szCs w:val="22"/>
+        </w:rPr>
+        <w:t>c</w:t>
+      </w:r>
+      <w:r>
+        <w:rPr>
+          <w:rFonts w:ascii="Times New Roman" w:hAnsi="Times New Roman"/>
+          <w:sz w:val="22"/>
+          <w:szCs w:val="22"/>
+        </w:rPr>
+        <w:t>y relating to higher education financing.</w:t>
       </w:r>
     </w:p>
     <w:p>

</xml_diff>

<commit_message>
Deploying to gh-pages from @ Bibek-Luitel/bibek-luitel.github.io@ce9582005b1b708e2b613735cc0c36557215b2d5 🚀
</commit_message>
<xml_diff>
--- a/assets/pdf/cv_full_bibekluitel.docx
+++ b/assets/pdf/cv_full_bibekluitel.docx
@@ -163,31 +163,7 @@
           <w:sz w:val="22"/>
           <w:szCs w:val="22"/>
         </w:rPr>
-        <w:t>(</w:t>
-      </w:r>
-      <w:r>
-        <w:rPr>
-          <w:rFonts w:ascii="Times New Roman" w:hAnsi="Times New Roman" w:cs="Times New Roman"/>
-          <w:sz w:val="22"/>
-          <w:szCs w:val="22"/>
-        </w:rPr>
-        <w:t>Expected</w:t>
-      </w:r>
-      <w:r>
-        <w:rPr>
-          <w:rFonts w:ascii="Times New Roman" w:hAnsi="Times New Roman" w:cs="Times New Roman"/>
-          <w:sz w:val="22"/>
-          <w:szCs w:val="22"/>
-        </w:rPr>
-        <w:t>)</w:t>
-      </w:r>
-      <w:r>
-        <w:rPr>
-          <w:rFonts w:ascii="Times New Roman" w:hAnsi="Times New Roman" w:cs="Times New Roman"/>
-          <w:sz w:val="22"/>
-          <w:szCs w:val="22"/>
-        </w:rPr>
-        <w:t xml:space="preserve"> </w:t>
+        <w:t xml:space="preserve">(Expected) </w:t>
       </w:r>
       <w:r>
         <w:rPr>
@@ -196,6 +172,14 @@
           <w:szCs w:val="22"/>
         </w:rPr>
         <w:t>Dec 2025</w:t>
+      </w:r>
+      <w:r>
+        <w:rPr>
+          <w:rFonts w:ascii="Times New Roman" w:hAnsi="Times New Roman" w:cs="Times New Roman"/>
+          <w:sz w:val="22"/>
+          <w:szCs w:val="22"/>
+        </w:rPr>
+        <w:t xml:space="preserve"> </w:t>
       </w:r>
     </w:p>
     <w:p>
@@ -351,6 +335,16 @@
           <w:szCs w:val="22"/>
         </w:rPr>
         <w:t>Dissertation</w:t>
+      </w:r>
+      <w:r>
+        <w:rPr>
+          <w:rFonts w:ascii="Times New Roman" w:hAnsi="Times New Roman" w:cs="Times New Roman"/>
+          <w:b/>
+          <w:bCs/>
+          <w:sz w:val="22"/>
+          <w:szCs w:val="22"/>
+        </w:rPr>
+        <w:t xml:space="preserve"> Title</w:t>
       </w:r>
       <w:r>
         <w:rPr>
@@ -437,7 +431,15 @@
           <w:sz w:val="22"/>
           <w:szCs w:val="22"/>
         </w:rPr>
-        <w:t>, 2007</w:t>
+        <w:t xml:space="preserve">, </w:t>
+      </w:r>
+      <w:r>
+        <w:rPr>
+          <w:rFonts w:ascii="Times New Roman" w:hAnsi="Times New Roman" w:cs="Times New Roman"/>
+          <w:sz w:val="22"/>
+          <w:szCs w:val="22"/>
+        </w:rPr>
+        <w:t>2007</w:t>
       </w:r>
     </w:p>
     <w:p>
@@ -494,7 +496,15 @@
           <w:sz w:val="22"/>
           <w:szCs w:val="22"/>
         </w:rPr>
-        <w:t>, 200</w:t>
+        <w:t xml:space="preserve">, </w:t>
+      </w:r>
+      <w:r>
+        <w:rPr>
+          <w:rFonts w:ascii="Times New Roman" w:hAnsi="Times New Roman" w:cs="Times New Roman"/>
+          <w:sz w:val="22"/>
+          <w:szCs w:val="22"/>
+        </w:rPr>
+        <w:t>200</w:t>
       </w:r>
       <w:r>
         <w:rPr>
@@ -677,6 +687,281 @@
       </w:pPr>
       <w:r>
         <w:t>PROFESSIONAL EXPERIENCE</w:t>
+      </w:r>
+    </w:p>
+    <w:p>
+      <w:pPr>
+        <w:tabs>
+          <w:tab w:val="right" w:pos="9360"/>
+        </w:tabs>
+        <w:spacing w:after="0" w:line="240" w:lineRule="auto"/>
+        <w:ind w:firstLine="360"/>
+        <w:rPr>
+          <w:rFonts w:ascii="Times New Roman" w:hAnsi="Times New Roman" w:cs="Times New Roman"/>
+          <w:b/>
+          <w:bCs/>
+          <w:color w:val="000000" w:themeColor="text1"/>
+          <w:sz w:val="22"/>
+          <w:szCs w:val="22"/>
+        </w:rPr>
+      </w:pPr>
+      <w:r>
+        <w:rPr>
+          <w:rFonts w:ascii="Times New Roman" w:hAnsi="Times New Roman" w:cs="Times New Roman"/>
+          <w:b/>
+          <w:bCs/>
+          <w:color w:val="000000" w:themeColor="text1"/>
+          <w:sz w:val="22"/>
+          <w:szCs w:val="22"/>
+        </w:rPr>
+        <w:t>Program Assistant</w:t>
+      </w:r>
+      <w:r>
+        <w:rPr>
+          <w:rFonts w:ascii="Times New Roman" w:hAnsi="Times New Roman" w:cs="Times New Roman"/>
+          <w:b/>
+          <w:bCs/>
+          <w:color w:val="000000" w:themeColor="text1"/>
+          <w:sz w:val="22"/>
+          <w:szCs w:val="22"/>
+        </w:rPr>
+        <w:t xml:space="preserve"> | </w:t>
+      </w:r>
+      <w:r>
+        <w:rPr>
+          <w:rFonts w:ascii="Times New Roman" w:hAnsi="Times New Roman" w:cs="Times New Roman"/>
+          <w:b/>
+          <w:bCs/>
+          <w:color w:val="000000" w:themeColor="text1"/>
+          <w:sz w:val="22"/>
+          <w:szCs w:val="22"/>
+        </w:rPr>
+        <w:t>Charl</w:t>
+      </w:r>
+      <w:r>
+        <w:rPr>
+          <w:rFonts w:ascii="Times New Roman" w:hAnsi="Times New Roman" w:cs="Times New Roman"/>
+          <w:b/>
+          <w:bCs/>
+          <w:color w:val="000000" w:themeColor="text1"/>
+          <w:sz w:val="22"/>
+          <w:szCs w:val="22"/>
+        </w:rPr>
+        <w:t>e</w:t>
+      </w:r>
+      <w:r>
+        <w:rPr>
+          <w:rFonts w:ascii="Times New Roman" w:hAnsi="Times New Roman" w:cs="Times New Roman"/>
+          <w:b/>
+          <w:bCs/>
+          <w:color w:val="000000" w:themeColor="text1"/>
+          <w:sz w:val="22"/>
+          <w:szCs w:val="22"/>
+        </w:rPr>
+        <w:t>s Butt Scholarship for Aspiring Teachers</w:t>
+      </w:r>
+    </w:p>
+    <w:p>
+      <w:pPr>
+        <w:tabs>
+          <w:tab w:val="right" w:pos="9360"/>
+        </w:tabs>
+        <w:spacing w:after="120" w:line="240" w:lineRule="auto"/>
+        <w:ind w:firstLine="360"/>
+        <w:rPr>
+          <w:rFonts w:ascii="Times New Roman" w:hAnsi="Times New Roman" w:cs="Times New Roman"/>
+          <w:color w:val="000000" w:themeColor="text1"/>
+          <w:sz w:val="22"/>
+          <w:szCs w:val="22"/>
+        </w:rPr>
+      </w:pPr>
+      <w:r>
+        <w:rPr>
+          <w:rFonts w:ascii="Times New Roman" w:hAnsi="Times New Roman" w:cs="Times New Roman"/>
+          <w:i/>
+          <w:iCs/>
+          <w:color w:val="000000" w:themeColor="text1"/>
+          <w:sz w:val="22"/>
+          <w:szCs w:val="22"/>
+        </w:rPr>
+        <w:t>Curriculum, Instruction, and Learning Sciences</w:t>
+      </w:r>
+      <w:r>
+        <w:rPr>
+          <w:rFonts w:ascii="Times New Roman" w:hAnsi="Times New Roman" w:cs="Times New Roman"/>
+          <w:i/>
+          <w:iCs/>
+          <w:color w:val="000000" w:themeColor="text1"/>
+          <w:sz w:val="22"/>
+          <w:szCs w:val="22"/>
+        </w:rPr>
+        <w:t xml:space="preserve"> Department</w:t>
+      </w:r>
+      <w:r>
+        <w:rPr>
+          <w:rFonts w:ascii="Times New Roman" w:hAnsi="Times New Roman" w:cs="Times New Roman"/>
+          <w:i/>
+          <w:iCs/>
+          <w:color w:val="000000" w:themeColor="text1"/>
+          <w:sz w:val="22"/>
+          <w:szCs w:val="22"/>
+        </w:rPr>
+        <w:t>, TAMU</w:t>
+      </w:r>
+      <w:r>
+        <w:rPr>
+          <w:rFonts w:ascii="Times New Roman" w:hAnsi="Times New Roman" w:cs="Times New Roman"/>
+          <w:i/>
+          <w:iCs/>
+          <w:color w:val="000000" w:themeColor="text1"/>
+          <w:sz w:val="22"/>
+          <w:szCs w:val="22"/>
+        </w:rPr>
+        <w:t>-</w:t>
+      </w:r>
+      <w:r>
+        <w:rPr>
+          <w:rFonts w:ascii="Times New Roman" w:hAnsi="Times New Roman" w:cs="Times New Roman"/>
+          <w:i/>
+          <w:iCs/>
+          <w:color w:val="000000" w:themeColor="text1"/>
+          <w:sz w:val="22"/>
+          <w:szCs w:val="22"/>
+        </w:rPr>
+        <w:t>CC</w:t>
+      </w:r>
+      <w:r>
+        <w:rPr>
+          <w:rFonts w:ascii="Times New Roman" w:hAnsi="Times New Roman" w:cs="Times New Roman"/>
+          <w:color w:val="000000" w:themeColor="text1"/>
+          <w:sz w:val="22"/>
+          <w:szCs w:val="22"/>
+        </w:rPr>
+        <w:tab/>
+        <w:t>Sept 2025 – Present</w:t>
+      </w:r>
+    </w:p>
+    <w:p>
+      <w:pPr>
+        <w:pStyle w:val="ListParagraph"/>
+        <w:numPr>
+          <w:ilvl w:val="0"/>
+          <w:numId w:val="19"/>
+        </w:numPr>
+        <w:tabs>
+          <w:tab w:val="right" w:pos="9360"/>
+        </w:tabs>
+        <w:spacing w:after="120" w:line="240" w:lineRule="auto"/>
+        <w:contextualSpacing w:val="0"/>
+        <w:rPr>
+          <w:rFonts w:ascii="Times New Roman" w:hAnsi="Times New Roman" w:cs="Times New Roman"/>
+          <w:color w:val="000000" w:themeColor="text1"/>
+          <w:sz w:val="22"/>
+          <w:szCs w:val="22"/>
+        </w:rPr>
+      </w:pPr>
+      <w:r>
+        <w:rPr>
+          <w:rFonts w:ascii="Times New Roman" w:hAnsi="Times New Roman" w:cs="Times New Roman"/>
+          <w:color w:val="000000" w:themeColor="text1"/>
+          <w:sz w:val="22"/>
+          <w:szCs w:val="22"/>
+        </w:rPr>
+        <w:t>Coordinated program activities and provided administrative support for 22 Charles Butt Scholarship recipients at Texas A&amp;M University–Corpus Christi.</w:t>
+      </w:r>
+    </w:p>
+    <w:p>
+      <w:pPr>
+        <w:pStyle w:val="ListParagraph"/>
+        <w:numPr>
+          <w:ilvl w:val="0"/>
+          <w:numId w:val="19"/>
+        </w:numPr>
+        <w:tabs>
+          <w:tab w:val="right" w:pos="9360"/>
+        </w:tabs>
+        <w:spacing w:after="120" w:line="240" w:lineRule="auto"/>
+        <w:contextualSpacing w:val="0"/>
+        <w:rPr>
+          <w:rFonts w:ascii="Times New Roman" w:hAnsi="Times New Roman" w:cs="Times New Roman"/>
+          <w:color w:val="000000" w:themeColor="text1"/>
+          <w:sz w:val="22"/>
+          <w:szCs w:val="22"/>
+        </w:rPr>
+      </w:pPr>
+      <w:r>
+        <w:rPr>
+          <w:rFonts w:ascii="Times New Roman" w:hAnsi="Times New Roman" w:cs="Times New Roman"/>
+          <w:color w:val="000000" w:themeColor="text1"/>
+          <w:sz w:val="22"/>
+          <w:szCs w:val="22"/>
+        </w:rPr>
+        <w:t>Assisted in organizing scholar engagement events, workshops, and mentoring sessions to enhance professional and academic development.</w:t>
+      </w:r>
+    </w:p>
+    <w:p>
+      <w:pPr>
+        <w:pStyle w:val="ListParagraph"/>
+        <w:numPr>
+          <w:ilvl w:val="0"/>
+          <w:numId w:val="19"/>
+        </w:numPr>
+        <w:tabs>
+          <w:tab w:val="right" w:pos="9360"/>
+        </w:tabs>
+        <w:spacing w:after="120" w:line="240" w:lineRule="auto"/>
+        <w:contextualSpacing w:val="0"/>
+        <w:rPr>
+          <w:rFonts w:ascii="Times New Roman" w:hAnsi="Times New Roman" w:cs="Times New Roman"/>
+          <w:color w:val="000000" w:themeColor="text1"/>
+          <w:sz w:val="22"/>
+          <w:szCs w:val="22"/>
+        </w:rPr>
+      </w:pPr>
+      <w:r>
+        <w:rPr>
+          <w:rFonts w:ascii="Times New Roman" w:hAnsi="Times New Roman" w:cs="Times New Roman"/>
+          <w:color w:val="000000" w:themeColor="text1"/>
+          <w:sz w:val="22"/>
+          <w:szCs w:val="22"/>
+        </w:rPr>
+        <w:t xml:space="preserve">Maintained program records, communication, and logistics between scholars, faculty mentors, and the </w:t>
+      </w:r>
+      <w:r>
+        <w:rPr>
+          <w:rFonts w:ascii="Times New Roman" w:hAnsi="Times New Roman" w:cs="Times New Roman"/>
+          <w:color w:val="000000" w:themeColor="text1"/>
+          <w:sz w:val="22"/>
+          <w:szCs w:val="22"/>
+        </w:rPr>
+        <w:t xml:space="preserve">TAMUCC </w:t>
+      </w:r>
+      <w:r>
+        <w:rPr>
+          <w:rFonts w:ascii="Times New Roman" w:hAnsi="Times New Roman" w:cs="Times New Roman"/>
+          <w:color w:val="000000" w:themeColor="text1"/>
+          <w:sz w:val="22"/>
+          <w:szCs w:val="22"/>
+        </w:rPr>
+        <w:t xml:space="preserve">Charles Butt </w:t>
+      </w:r>
+      <w:r>
+        <w:rPr>
+          <w:rFonts w:ascii="Times New Roman" w:hAnsi="Times New Roman" w:cs="Times New Roman"/>
+          <w:color w:val="000000" w:themeColor="text1"/>
+          <w:sz w:val="22"/>
+          <w:szCs w:val="22"/>
+        </w:rPr>
+        <w:t>Scholarship</w:t>
+      </w:r>
+      <w:r>
+        <w:rPr>
+          <w:rFonts w:ascii="Times New Roman" w:hAnsi="Times New Roman" w:cs="Times New Roman"/>
+          <w:color w:val="000000" w:themeColor="text1"/>
+          <w:sz w:val="22"/>
+          <w:szCs w:val="22"/>
+        </w:rPr>
+        <w:t xml:space="preserve"> team.</w:t>
       </w:r>
     </w:p>
     <w:p>
@@ -910,7 +1195,11 @@
           <w:szCs w:val="22"/>
         </w:rPr>
       </w:pPr>
-      <w:r>
+    </w:p>
+    <w:p>
+      <w:pPr>
+        <w:spacing w:after="0" w:line="240" w:lineRule="auto"/>
+        <w:ind w:left="-86" w:firstLine="446"/>
         <w:rPr>
           <w:rFonts w:ascii="Times New Roman" w:hAnsi="Times New Roman" w:cs="Times New Roman"/>
           <w:b/>
@@ -918,6 +1207,16 @@
           <w:sz w:val="22"/>
           <w:szCs w:val="22"/>
         </w:rPr>
+      </w:pPr>
+      <w:r>
+        <w:rPr>
+          <w:rFonts w:ascii="Times New Roman" w:hAnsi="Times New Roman" w:cs="Times New Roman"/>
+          <w:b/>
+          <w:bCs/>
+          <w:sz w:val="22"/>
+          <w:szCs w:val="22"/>
+        </w:rPr>
+        <w:lastRenderedPageBreak/>
         <w:t>Sr. Monitoring &amp; Evaluation Specialist</w:t>
       </w:r>
     </w:p>
@@ -1096,27 +1395,6 @@
     </w:p>
     <w:p>
       <w:pPr>
-        <w:rPr>
-          <w:rFonts w:ascii="Times New Roman" w:hAnsi="Times New Roman" w:cs="Times New Roman"/>
-          <w:b/>
-          <w:bCs/>
-          <w:sz w:val="22"/>
-          <w:szCs w:val="22"/>
-        </w:rPr>
-      </w:pPr>
-      <w:r>
-        <w:rPr>
-          <w:rFonts w:ascii="Times New Roman" w:hAnsi="Times New Roman" w:cs="Times New Roman"/>
-          <w:b/>
-          <w:bCs/>
-          <w:sz w:val="22"/>
-          <w:szCs w:val="22"/>
-        </w:rPr>
-        <w:br w:type="page"/>
-      </w:r>
-    </w:p>
-    <w:p>
-      <w:pPr>
         <w:spacing w:after="0" w:line="240" w:lineRule="auto"/>
         <w:ind w:firstLine="360"/>
         <w:rPr>
@@ -1133,7 +1411,6 @@
           <w:sz w:val="22"/>
           <w:szCs w:val="22"/>
         </w:rPr>
-        <w:lastRenderedPageBreak/>
         <w:t>Principal Investigator</w:t>
       </w:r>
     </w:p>
@@ -1929,6 +2206,7 @@
           <w:sz w:val="22"/>
           <w:szCs w:val="22"/>
         </w:rPr>
+        <w:lastRenderedPageBreak/>
         <w:t>Co-l</w:t>
       </w:r>
       <w:r>
@@ -2013,27 +2291,6 @@
         </w:rPr>
         <w:t xml:space="preserve">Coordinated with the PI and survey director, managed project logistics and correspondence, and prepared reports and presentations. </w:t>
       </w:r>
-      <w:r>
-        <w:rPr>
-          <w:rFonts w:ascii="Times New Roman" w:hAnsi="Times New Roman" w:cs="Times New Roman"/>
-          <w:sz w:val="22"/>
-          <w:szCs w:val="22"/>
-        </w:rPr>
-        <w:t xml:space="preserve"> </w:t>
-      </w:r>
-    </w:p>
-    <w:p>
-      <w:pPr>
-        <w:rPr>
-          <w:rFonts w:ascii="Times New Roman" w:hAnsi="Times New Roman" w:cs="Times New Roman"/>
-        </w:rPr>
-      </w:pPr>
-      <w:r>
-        <w:rPr>
-          <w:rFonts w:ascii="Times New Roman" w:hAnsi="Times New Roman" w:cs="Times New Roman"/>
-        </w:rPr>
-        <w:br w:type="page"/>
-      </w:r>
     </w:p>
     <w:p>
       <w:pPr>
@@ -2080,7 +2337,7 @@
           <w:b/>
           <w:bCs/>
         </w:rPr>
-        <w:t xml:space="preserve"> E</w:t>
+        <w:t xml:space="preserve"> Edit</w:t>
       </w:r>
       <w:r>
         <w:rPr>
@@ -2088,7 +2345,7 @@
           <w:b/>
           <w:bCs/>
         </w:rPr>
-        <w:t>ditor</w:t>
+        <w:t>or</w:t>
       </w:r>
       <w:r>
         <w:rPr>
@@ -4283,7 +4540,15 @@
           <w:sz w:val="22"/>
           <w:szCs w:val="22"/>
         </w:rPr>
-        <w:t>Anti- Corruption Evidence Programme</w:t>
+        <w:t xml:space="preserve">Anti- Corruption Evidence </w:t>
+      </w:r>
+      <w:r>
+        <w:rPr>
+          <w:rFonts w:ascii="Times New Roman" w:hAnsi="Times New Roman" w:cs="Times New Roman"/>
+          <w:sz w:val="22"/>
+          <w:szCs w:val="22"/>
+        </w:rPr>
+        <w:t>Program</w:t>
       </w:r>
       <w:r>
         <w:rPr>
@@ -4812,7 +5077,6 @@
           <w:sz w:val="22"/>
           <w:szCs w:val="22"/>
         </w:rPr>
-        <w:lastRenderedPageBreak/>
         <w:t xml:space="preserve">Luitel, B. </w:t>
       </w:r>
       <w:r>
@@ -5781,7 +6045,7 @@
           <w:sz w:val="22"/>
           <w:szCs w:val="22"/>
         </w:rPr>
-        <w:t>Advising students, guiding academic and professional development, and fostering a supportive and intellectually stimulating learning environment.</w:t>
+        <w:t>Advising students, guiding academic and professional development, and fostering a supportive and stimulating learning environment.</w:t>
       </w:r>
     </w:p>
     <w:p>
@@ -5834,6 +6098,7 @@
         </w:rPr>
         <w:t xml:space="preserve"> (</w:t>
       </w:r>
+      <w:proofErr w:type="gramStart"/>
       <w:r>
         <w:rPr>
           <w:rFonts w:ascii="Times New Roman" w:hAnsi="Times New Roman" w:cs="Times New Roman"/>
@@ -5852,7 +6117,18 @@
           <w:sz w:val="22"/>
           <w:szCs w:val="22"/>
         </w:rPr>
-        <w:t xml:space="preserve">aster’s </w:t>
+        <w:t>aster’s</w:t>
+      </w:r>
+      <w:proofErr w:type="gramEnd"/>
+      <w:r>
+        <w:rPr>
+          <w:rFonts w:ascii="Times New Roman" w:hAnsi="Times New Roman" w:cs="Times New Roman"/>
+          <w:b/>
+          <w:bCs/>
+          <w:sz w:val="22"/>
+          <w:szCs w:val="22"/>
+        </w:rPr>
+        <w:t xml:space="preserve"> </w:t>
       </w:r>
       <w:r>
         <w:rPr>
@@ -5918,7 +6194,67 @@
           <w:sz w:val="22"/>
           <w:szCs w:val="22"/>
         </w:rPr>
-        <w:t>K&amp;K International College, Tribhuvan University</w:t>
+        <w:t>K</w:t>
+      </w:r>
+      <w:r>
+        <w:rPr>
+          <w:rFonts w:ascii="Times New Roman" w:hAnsi="Times New Roman" w:cs="Times New Roman"/>
+          <w:i/>
+          <w:iCs/>
+          <w:sz w:val="22"/>
+          <w:szCs w:val="22"/>
+        </w:rPr>
+        <w:t xml:space="preserve">anti </w:t>
+      </w:r>
+      <w:r>
+        <w:rPr>
+          <w:rFonts w:ascii="Times New Roman" w:hAnsi="Times New Roman" w:cs="Times New Roman"/>
+          <w:i/>
+          <w:iCs/>
+          <w:sz w:val="22"/>
+          <w:szCs w:val="22"/>
+        </w:rPr>
+        <w:t>&amp;</w:t>
+      </w:r>
+      <w:r>
+        <w:rPr>
+          <w:rFonts w:ascii="Times New Roman" w:hAnsi="Times New Roman" w:cs="Times New Roman"/>
+          <w:i/>
+          <w:iCs/>
+          <w:sz w:val="22"/>
+          <w:szCs w:val="22"/>
+        </w:rPr>
+        <w:t xml:space="preserve"> </w:t>
+      </w:r>
+      <w:r>
+        <w:rPr>
+          <w:rFonts w:ascii="Times New Roman" w:hAnsi="Times New Roman" w:cs="Times New Roman"/>
+          <w:i/>
+          <w:iCs/>
+          <w:sz w:val="22"/>
+          <w:szCs w:val="22"/>
+        </w:rPr>
+        <w:t>K</w:t>
+      </w:r>
+      <w:r>
+        <w:rPr>
+          <w:rFonts w:ascii="Times New Roman" w:hAnsi="Times New Roman" w:cs="Times New Roman"/>
+          <w:i/>
+          <w:iCs/>
+          <w:sz w:val="22"/>
+          <w:szCs w:val="22"/>
+        </w:rPr>
+        <w:t>unja</w:t>
+      </w:r>
+      <w:r>
+        <w:rPr>
+          <w:rFonts w:ascii="Times New Roman" w:hAnsi="Times New Roman" w:cs="Times New Roman"/>
+          <w:i/>
+          <w:iCs/>
+          <w:sz w:val="22"/>
+          <w:szCs w:val="22"/>
+        </w:rPr>
+        <w:t xml:space="preserve"> International College, Tribhuvan University</w:t>
       </w:r>
       <w:r>
         <w:rPr>
@@ -6048,7 +6384,47 @@
           <w:sz w:val="22"/>
           <w:szCs w:val="22"/>
         </w:rPr>
-        <w:t>IB&amp;MS College, Bharathiar University</w:t>
+        <w:t>IB</w:t>
+      </w:r>
+      <w:r>
+        <w:rPr>
+          <w:rFonts w:ascii="Times New Roman" w:hAnsi="Times New Roman" w:cs="Times New Roman"/>
+          <w:i/>
+          <w:iCs/>
+          <w:sz w:val="22"/>
+          <w:szCs w:val="22"/>
+        </w:rPr>
+        <w:t xml:space="preserve"> </w:t>
+      </w:r>
+      <w:r>
+        <w:rPr>
+          <w:rFonts w:ascii="Times New Roman" w:hAnsi="Times New Roman" w:cs="Times New Roman"/>
+          <w:i/>
+          <w:iCs/>
+          <w:sz w:val="22"/>
+          <w:szCs w:val="22"/>
+        </w:rPr>
+        <w:t>&amp;</w:t>
+      </w:r>
+      <w:r>
+        <w:rPr>
+          <w:rFonts w:ascii="Times New Roman" w:hAnsi="Times New Roman" w:cs="Times New Roman"/>
+          <w:i/>
+          <w:iCs/>
+          <w:sz w:val="22"/>
+          <w:szCs w:val="22"/>
+        </w:rPr>
+        <w:t xml:space="preserve"> </w:t>
+      </w:r>
+      <w:r>
+        <w:rPr>
+          <w:rFonts w:ascii="Times New Roman" w:hAnsi="Times New Roman" w:cs="Times New Roman"/>
+          <w:i/>
+          <w:iCs/>
+          <w:sz w:val="22"/>
+          <w:szCs w:val="22"/>
+        </w:rPr>
+        <w:t>MS College, Bharathiar University</w:t>
       </w:r>
       <w:r>
         <w:rPr>
@@ -6322,6 +6698,7 @@
         </w:rPr>
         <w:t xml:space="preserve"> (</w:t>
       </w:r>
+      <w:proofErr w:type="gramStart"/>
       <w:r>
         <w:rPr>
           <w:rFonts w:ascii="Times New Roman" w:hAnsi="Times New Roman" w:cs="Times New Roman"/>
@@ -6340,7 +6717,18 @@
           <w:sz w:val="22"/>
           <w:szCs w:val="22"/>
         </w:rPr>
-        <w:t xml:space="preserve">achelor’s </w:t>
+        <w:t>achelor’s</w:t>
+      </w:r>
+      <w:proofErr w:type="gramEnd"/>
+      <w:r>
+        <w:rPr>
+          <w:rFonts w:ascii="Times New Roman" w:hAnsi="Times New Roman" w:cs="Times New Roman"/>
+          <w:b/>
+          <w:bCs/>
+          <w:sz w:val="22"/>
+          <w:szCs w:val="22"/>
+        </w:rPr>
+        <w:t xml:space="preserve"> </w:t>
       </w:r>
       <w:r>
         <w:rPr>
@@ -6500,6 +6888,7 @@
           <w:sz w:val="22"/>
           <w:szCs w:val="22"/>
         </w:rPr>
+        <w:lastRenderedPageBreak/>
         <w:t xml:space="preserve">IMM 205: </w:t>
       </w:r>
       <w:r>
@@ -6590,17 +6979,6 @@
     </w:p>
     <w:p>
       <w:pPr>
-        <w:pBdr>
-          <w:bottom w:val="single" w:sz="6" w:space="1" w:color="auto"/>
-        </w:pBdr>
-        <w:spacing w:after="0" w:line="240" w:lineRule="auto"/>
-        <w:rPr>
-          <w:rFonts w:ascii="Times New Roman" w:hAnsi="Times New Roman" w:cs="Times New Roman"/>
-        </w:rPr>
-      </w:pPr>
-    </w:p>
-    <w:p>
-      <w:pPr>
         <w:pStyle w:val="Heading1"/>
       </w:pPr>
       <w:r>
@@ -8513,6 +8891,7 @@
           <w:sz w:val="22"/>
           <w:szCs w:val="22"/>
         </w:rPr>
+        <w:lastRenderedPageBreak/>
         <w:t>Editorial</w:t>
       </w:r>
     </w:p>
@@ -8705,6 +9084,118 @@
           <w:szCs w:val="22"/>
         </w:rPr>
       </w:pPr>
+      <w:r>
+        <w:rPr>
+          <w:rFonts w:ascii="Times New Roman" w:hAnsi="Times New Roman" w:cs="Times New Roman"/>
+          <w:b/>
+          <w:bCs/>
+          <w:sz w:val="22"/>
+          <w:szCs w:val="22"/>
+        </w:rPr>
+        <w:t>Reviewer</w:t>
+      </w:r>
+    </w:p>
+    <w:p>
+      <w:pPr>
+        <w:spacing w:after="120" w:line="240" w:lineRule="auto"/>
+        <w:ind w:left="1440" w:hanging="720"/>
+        <w:rPr>
+          <w:rFonts w:ascii="Times New Roman" w:hAnsi="Times New Roman" w:cs="Times New Roman"/>
+          <w:sz w:val="22"/>
+          <w:szCs w:val="22"/>
+        </w:rPr>
+      </w:pPr>
+      <w:r>
+        <w:rPr>
+          <w:rFonts w:ascii="Times New Roman" w:hAnsi="Times New Roman" w:cs="Times New Roman"/>
+          <w:sz w:val="22"/>
+          <w:szCs w:val="22"/>
+        </w:rPr>
+        <w:t xml:space="preserve">2025 </w:t>
+      </w:r>
+      <w:r>
+        <w:rPr>
+          <w:rFonts w:ascii="Times New Roman" w:hAnsi="Times New Roman" w:cs="Times New Roman"/>
+          <w:sz w:val="22"/>
+          <w:szCs w:val="22"/>
+        </w:rPr>
+        <w:tab/>
+      </w:r>
+      <w:r>
+        <w:rPr>
+          <w:rFonts w:ascii="Times New Roman" w:hAnsi="Times New Roman" w:cs="Times New Roman"/>
+          <w:sz w:val="22"/>
+          <w:szCs w:val="22"/>
+        </w:rPr>
+        <w:t>Proposal Reviewer, Southwest Educational Research Association (SERA) Annual</w:t>
+      </w:r>
+      <w:r>
+        <w:rPr>
+          <w:rFonts w:ascii="Times New Roman" w:hAnsi="Times New Roman" w:cs="Times New Roman"/>
+          <w:sz w:val="22"/>
+          <w:szCs w:val="22"/>
+        </w:rPr>
+        <w:t xml:space="preserve"> </w:t>
+      </w:r>
+      <w:r>
+        <w:rPr>
+          <w:rFonts w:ascii="Times New Roman" w:hAnsi="Times New Roman" w:cs="Times New Roman"/>
+          <w:sz w:val="22"/>
+          <w:szCs w:val="22"/>
+        </w:rPr>
+        <w:t>Conference</w:t>
+      </w:r>
+    </w:p>
+    <w:p>
+      <w:pPr>
+        <w:spacing w:after="120" w:line="240" w:lineRule="auto"/>
+        <w:ind w:left="1440" w:hanging="720"/>
+        <w:rPr>
+          <w:rFonts w:ascii="Times New Roman" w:hAnsi="Times New Roman" w:cs="Times New Roman"/>
+          <w:sz w:val="22"/>
+          <w:szCs w:val="22"/>
+        </w:rPr>
+      </w:pPr>
+      <w:r>
+        <w:rPr>
+          <w:rFonts w:ascii="Times New Roman" w:hAnsi="Times New Roman" w:cs="Times New Roman"/>
+          <w:sz w:val="22"/>
+          <w:szCs w:val="22"/>
+        </w:rPr>
+        <w:t xml:space="preserve">2024 </w:t>
+      </w:r>
+      <w:r>
+        <w:rPr>
+          <w:rFonts w:ascii="Times New Roman" w:hAnsi="Times New Roman" w:cs="Times New Roman"/>
+          <w:sz w:val="22"/>
+          <w:szCs w:val="22"/>
+        </w:rPr>
+        <w:tab/>
+      </w:r>
+      <w:r>
+        <w:rPr>
+          <w:rFonts w:ascii="Times New Roman" w:hAnsi="Times New Roman" w:cs="Times New Roman"/>
+          <w:sz w:val="22"/>
+          <w:szCs w:val="22"/>
+        </w:rPr>
+        <w:t xml:space="preserve">Proposal Reviewer, International Council of </w:t>
+      </w:r>
+      <w:r>
+        <w:rPr>
+          <w:rFonts w:ascii="Times New Roman" w:hAnsi="Times New Roman" w:cs="Times New Roman"/>
+          <w:sz w:val="22"/>
+          <w:szCs w:val="22"/>
+        </w:rPr>
+        <w:t>Professors of Educational</w:t>
+      </w:r>
+      <w:r>
+        <w:rPr>
+          <w:rFonts w:ascii="Times New Roman" w:hAnsi="Times New Roman" w:cs="Times New Roman"/>
+          <w:sz w:val="22"/>
+          <w:szCs w:val="22"/>
+        </w:rPr>
+        <w:t xml:space="preserve"> Leadership (ICPEL) Annual Conference</w:t>
+      </w:r>
     </w:p>
     <w:p>
       <w:pPr>
@@ -8718,11 +9209,7 @@
           <w:szCs w:val="22"/>
         </w:rPr>
       </w:pPr>
-    </w:p>
-    <w:p>
-      <w:pPr>
-        <w:spacing w:after="120" w:line="240" w:lineRule="auto"/>
-        <w:ind w:firstLine="360"/>
+      <w:r>
         <w:rPr>
           <w:rFonts w:ascii="Times New Roman" w:hAnsi="Times New Roman" w:cs="Times New Roman"/>
           <w:b/>
@@ -8730,16 +9217,7 @@
           <w:sz w:val="22"/>
           <w:szCs w:val="22"/>
         </w:rPr>
-      </w:pPr>
-      <w:r>
-        <w:rPr>
-          <w:rFonts w:ascii="Times New Roman" w:hAnsi="Times New Roman" w:cs="Times New Roman"/>
-          <w:b/>
-          <w:bCs/>
-          <w:sz w:val="22"/>
-          <w:szCs w:val="22"/>
-        </w:rPr>
-        <w:t>Reviewer</w:t>
+        <w:t>National/Local Service</w:t>
       </w:r>
     </w:p>
     <w:p>
@@ -8758,7 +9236,7 @@
           <w:sz w:val="22"/>
           <w:szCs w:val="22"/>
         </w:rPr>
-        <w:t xml:space="preserve">2025 </w:t>
+        <w:t xml:space="preserve">2024 </w:t>
       </w:r>
       <w:r>
         <w:rPr>
@@ -8774,132 +9252,7 @@
           <w:sz w:val="22"/>
           <w:szCs w:val="22"/>
         </w:rPr>
-        <w:t>Proposal Reviewer, Southwest Educational Research Association (SERA) Annual</w:t>
-      </w:r>
-      <w:r>
-        <w:rPr>
-          <w:rFonts w:ascii="Times New Roman" w:hAnsi="Times New Roman" w:cs="Times New Roman"/>
-          <w:sz w:val="22"/>
-          <w:szCs w:val="22"/>
-        </w:rPr>
-        <w:t xml:space="preserve"> </w:t>
-      </w:r>
-      <w:r>
-        <w:rPr>
-          <w:rFonts w:ascii="Times New Roman" w:hAnsi="Times New Roman" w:cs="Times New Roman"/>
-          <w:sz w:val="22"/>
-          <w:szCs w:val="22"/>
-        </w:rPr>
-        <w:t>Conference</w:t>
-      </w:r>
-    </w:p>
-    <w:p>
-      <w:pPr>
-        <w:spacing w:after="120" w:line="240" w:lineRule="auto"/>
-        <w:ind w:left="1440" w:hanging="720"/>
-        <w:rPr>
-          <w:rFonts w:ascii="Times New Roman" w:hAnsi="Times New Roman" w:cs="Times New Roman"/>
-          <w:sz w:val="22"/>
-          <w:szCs w:val="22"/>
-        </w:rPr>
-      </w:pPr>
-      <w:r>
-        <w:rPr>
-          <w:rFonts w:ascii="Times New Roman" w:hAnsi="Times New Roman" w:cs="Times New Roman"/>
-          <w:sz w:val="22"/>
-          <w:szCs w:val="22"/>
-        </w:rPr>
-        <w:t xml:space="preserve">2024 </w:t>
-      </w:r>
-      <w:r>
-        <w:rPr>
-          <w:rFonts w:ascii="Times New Roman" w:hAnsi="Times New Roman" w:cs="Times New Roman"/>
-          <w:sz w:val="22"/>
-          <w:szCs w:val="22"/>
-        </w:rPr>
-        <w:tab/>
-      </w:r>
-      <w:r>
-        <w:rPr>
-          <w:rFonts w:ascii="Times New Roman" w:hAnsi="Times New Roman" w:cs="Times New Roman"/>
-          <w:sz w:val="22"/>
-          <w:szCs w:val="22"/>
-        </w:rPr>
-        <w:t xml:space="preserve">Proposal Reviewer, International Council of </w:t>
-      </w:r>
-      <w:r>
-        <w:rPr>
-          <w:rFonts w:ascii="Times New Roman" w:hAnsi="Times New Roman" w:cs="Times New Roman"/>
-          <w:sz w:val="22"/>
-          <w:szCs w:val="22"/>
-        </w:rPr>
-        <w:t>Professors of Educational</w:t>
-      </w:r>
-      <w:r>
-        <w:rPr>
-          <w:rFonts w:ascii="Times New Roman" w:hAnsi="Times New Roman" w:cs="Times New Roman"/>
-          <w:sz w:val="22"/>
-          <w:szCs w:val="22"/>
-        </w:rPr>
-        <w:t xml:space="preserve"> Leadership (ICPEL) Annual Conference</w:t>
-      </w:r>
-    </w:p>
-    <w:p>
-      <w:pPr>
-        <w:spacing w:after="120" w:line="240" w:lineRule="auto"/>
-        <w:ind w:firstLine="360"/>
-        <w:rPr>
-          <w:rFonts w:ascii="Times New Roman" w:hAnsi="Times New Roman" w:cs="Times New Roman"/>
-          <w:b/>
-          <w:bCs/>
-          <w:sz w:val="22"/>
-          <w:szCs w:val="22"/>
-        </w:rPr>
-      </w:pPr>
-      <w:r>
-        <w:rPr>
-          <w:rFonts w:ascii="Times New Roman" w:hAnsi="Times New Roman" w:cs="Times New Roman"/>
-          <w:b/>
-          <w:bCs/>
-          <w:sz w:val="22"/>
-          <w:szCs w:val="22"/>
-        </w:rPr>
-        <w:t>National/Local Service</w:t>
-      </w:r>
-    </w:p>
-    <w:p>
-      <w:pPr>
-        <w:spacing w:after="120" w:line="240" w:lineRule="auto"/>
-        <w:ind w:left="1440" w:hanging="720"/>
-        <w:rPr>
-          <w:rFonts w:ascii="Times New Roman" w:hAnsi="Times New Roman" w:cs="Times New Roman"/>
-          <w:sz w:val="22"/>
-          <w:szCs w:val="22"/>
-        </w:rPr>
-      </w:pPr>
-      <w:r>
-        <w:rPr>
-          <w:rFonts w:ascii="Times New Roman" w:hAnsi="Times New Roman" w:cs="Times New Roman"/>
-          <w:sz w:val="22"/>
-          <w:szCs w:val="22"/>
-        </w:rPr>
-        <w:t xml:space="preserve">2024 </w:t>
-      </w:r>
-      <w:r>
-        <w:rPr>
-          <w:rFonts w:ascii="Times New Roman" w:hAnsi="Times New Roman" w:cs="Times New Roman"/>
-          <w:sz w:val="22"/>
-          <w:szCs w:val="22"/>
-        </w:rPr>
-        <w:tab/>
-      </w:r>
-      <w:r>
-        <w:rPr>
-          <w:rFonts w:ascii="Times New Roman" w:hAnsi="Times New Roman" w:cs="Times New Roman"/>
-          <w:sz w:val="22"/>
-          <w:szCs w:val="22"/>
-        </w:rPr>
-        <w:t>Committee Member, NREA (National Rural Education Association) Community Empowerment &amp; Belonging Committee.</w:t>
+        <w:t>Member, NREA (National Rural Education Association) Community Empowerment Committee.</w:t>
       </w:r>
     </w:p>
     <w:p>
@@ -9550,23 +9903,31 @@
         <w:ind w:left="1800" w:hanging="1440"/>
         <w:rPr>
           <w:rFonts w:ascii="Times New Roman" w:hAnsi="Times New Roman" w:cs="Times New Roman"/>
-        </w:rPr>
-      </w:pPr>
-      <w:r>
-        <w:rPr>
-          <w:rFonts w:ascii="Times New Roman" w:hAnsi="Times New Roman" w:cs="Times New Roman"/>
+          <w:sz w:val="22"/>
+          <w:szCs w:val="22"/>
+        </w:rPr>
+      </w:pPr>
+      <w:r>
+        <w:rPr>
+          <w:rFonts w:ascii="Times New Roman" w:hAnsi="Times New Roman" w:cs="Times New Roman"/>
+          <w:sz w:val="22"/>
+          <w:szCs w:val="22"/>
         </w:rPr>
         <w:t>2025</w:t>
       </w:r>
       <w:r>
         <w:rPr>
           <w:rFonts w:ascii="Times New Roman" w:hAnsi="Times New Roman" w:cs="Times New Roman"/>
+          <w:sz w:val="22"/>
+          <w:szCs w:val="22"/>
         </w:rPr>
         <w:t xml:space="preserve"> Feb</w:t>
       </w:r>
       <w:r>
         <w:rPr>
           <w:rFonts w:ascii="Times New Roman" w:hAnsi="Times New Roman" w:cs="Times New Roman"/>
+          <w:sz w:val="22"/>
+          <w:szCs w:val="22"/>
         </w:rPr>
         <w:tab/>
         <w:t>Pathway to Profession (P2P) Symposium, Tarleton State University, Stephenville, Sponsored by Texas A&amp;M University System</w:t>
@@ -9578,23 +9939,31 @@
         <w:ind w:left="1800" w:hanging="1440"/>
         <w:rPr>
           <w:rFonts w:ascii="Times New Roman" w:hAnsi="Times New Roman" w:cs="Times New Roman"/>
-        </w:rPr>
-      </w:pPr>
-      <w:r>
-        <w:rPr>
-          <w:rFonts w:ascii="Times New Roman" w:hAnsi="Times New Roman" w:cs="Times New Roman"/>
+          <w:sz w:val="22"/>
+          <w:szCs w:val="22"/>
+        </w:rPr>
+      </w:pPr>
+      <w:r>
+        <w:rPr>
+          <w:rFonts w:ascii="Times New Roman" w:hAnsi="Times New Roman" w:cs="Times New Roman"/>
+          <w:sz w:val="22"/>
+          <w:szCs w:val="22"/>
         </w:rPr>
         <w:t>2023</w:t>
       </w:r>
       <w:r>
         <w:rPr>
           <w:rFonts w:ascii="Times New Roman" w:hAnsi="Times New Roman" w:cs="Times New Roman"/>
+          <w:sz w:val="22"/>
+          <w:szCs w:val="22"/>
         </w:rPr>
         <w:t xml:space="preserve"> Sept</w:t>
       </w:r>
       <w:r>
         <w:rPr>
           <w:rFonts w:ascii="Times New Roman" w:hAnsi="Times New Roman" w:cs="Times New Roman"/>
+          <w:sz w:val="22"/>
+          <w:szCs w:val="22"/>
         </w:rPr>
         <w:tab/>
         <w:t>Association of Texas Graduate Schools (ATGS) Conference, Texas A&amp;M University-Corpus Christi</w:t>
@@ -9606,11 +9975,15 @@
         <w:ind w:left="1800" w:hanging="1440"/>
         <w:rPr>
           <w:rFonts w:ascii="Times New Roman" w:hAnsi="Times New Roman" w:cs="Times New Roman"/>
-        </w:rPr>
-      </w:pPr>
-      <w:r>
-        <w:rPr>
-          <w:rFonts w:ascii="Times New Roman" w:hAnsi="Times New Roman" w:cs="Times New Roman"/>
+          <w:sz w:val="22"/>
+          <w:szCs w:val="22"/>
+        </w:rPr>
+      </w:pPr>
+      <w:r>
+        <w:rPr>
+          <w:rFonts w:ascii="Times New Roman" w:hAnsi="Times New Roman" w:cs="Times New Roman"/>
+          <w:sz w:val="22"/>
+          <w:szCs w:val="22"/>
         </w:rPr>
         <w:lastRenderedPageBreak/>
         <w:t>2018 June</w:t>
@@ -9618,6 +9991,8 @@
       <w:r>
         <w:rPr>
           <w:rFonts w:ascii="Times New Roman" w:hAnsi="Times New Roman" w:cs="Times New Roman"/>
+          <w:sz w:val="22"/>
+          <w:szCs w:val="22"/>
         </w:rPr>
         <w:tab/>
         <w:t>Workshop on Developing Skills in Management Research, Kathmandu University, Kathmandu</w:t>
@@ -9629,17 +10004,23 @@
         <w:ind w:left="1800" w:hanging="1440"/>
         <w:rPr>
           <w:rFonts w:ascii="Times New Roman" w:hAnsi="Times New Roman" w:cs="Times New Roman"/>
-        </w:rPr>
-      </w:pPr>
-      <w:r>
-        <w:rPr>
-          <w:rFonts w:ascii="Times New Roman" w:hAnsi="Times New Roman" w:cs="Times New Roman"/>
+          <w:sz w:val="22"/>
+          <w:szCs w:val="22"/>
+        </w:rPr>
+      </w:pPr>
+      <w:r>
+        <w:rPr>
+          <w:rFonts w:ascii="Times New Roman" w:hAnsi="Times New Roman" w:cs="Times New Roman"/>
+          <w:sz w:val="22"/>
+          <w:szCs w:val="22"/>
         </w:rPr>
         <w:t xml:space="preserve">2018 March </w:t>
       </w:r>
       <w:r>
         <w:rPr>
           <w:rFonts w:ascii="Times New Roman" w:hAnsi="Times New Roman" w:cs="Times New Roman"/>
+          <w:sz w:val="22"/>
+          <w:szCs w:val="22"/>
         </w:rPr>
         <w:tab/>
         <w:t>Doing Qualitative Data Analysis, Kathmandu University, Kathmandu</w:t>
@@ -9651,17 +10032,23 @@
         <w:ind w:left="1800" w:hanging="1440"/>
         <w:rPr>
           <w:rFonts w:ascii="Times New Roman" w:hAnsi="Times New Roman" w:cs="Times New Roman"/>
-        </w:rPr>
-      </w:pPr>
-      <w:r>
-        <w:rPr>
-          <w:rFonts w:ascii="Times New Roman" w:hAnsi="Times New Roman" w:cs="Times New Roman"/>
+          <w:sz w:val="22"/>
+          <w:szCs w:val="22"/>
+        </w:rPr>
+      </w:pPr>
+      <w:r>
+        <w:rPr>
+          <w:rFonts w:ascii="Times New Roman" w:hAnsi="Times New Roman" w:cs="Times New Roman"/>
+          <w:sz w:val="22"/>
+          <w:szCs w:val="22"/>
         </w:rPr>
         <w:t>2018 Feb</w:t>
       </w:r>
       <w:r>
         <w:rPr>
           <w:rFonts w:ascii="Times New Roman" w:hAnsi="Times New Roman" w:cs="Times New Roman"/>
+          <w:sz w:val="22"/>
+          <w:szCs w:val="22"/>
         </w:rPr>
         <w:tab/>
         <w:t>Participatory Action Research, Kathmandu University, Kathmandu</w:t>
@@ -9673,17 +10060,23 @@
         <w:ind w:left="1800" w:hanging="1440"/>
         <w:rPr>
           <w:rFonts w:ascii="Times New Roman" w:hAnsi="Times New Roman" w:cs="Times New Roman"/>
-        </w:rPr>
-      </w:pPr>
-      <w:r>
-        <w:rPr>
-          <w:rFonts w:ascii="Times New Roman" w:hAnsi="Times New Roman" w:cs="Times New Roman"/>
+          <w:sz w:val="22"/>
+          <w:szCs w:val="22"/>
+        </w:rPr>
+      </w:pPr>
+      <w:r>
+        <w:rPr>
+          <w:rFonts w:ascii="Times New Roman" w:hAnsi="Times New Roman" w:cs="Times New Roman"/>
+          <w:sz w:val="22"/>
+          <w:szCs w:val="22"/>
         </w:rPr>
         <w:t xml:space="preserve">2015 Jan </w:t>
       </w:r>
       <w:r>
         <w:rPr>
           <w:rFonts w:ascii="Times New Roman" w:hAnsi="Times New Roman" w:cs="Times New Roman"/>
+          <w:sz w:val="22"/>
+          <w:szCs w:val="22"/>
         </w:rPr>
         <w:tab/>
         <w:t>Research Methodology and Proposal Writing, Nepal Development and Research Institute, Kathmandu</w:t>
@@ -9695,17 +10088,23 @@
         <w:ind w:left="1800" w:hanging="1440"/>
         <w:rPr>
           <w:rFonts w:ascii="Times New Roman" w:hAnsi="Times New Roman" w:cs="Times New Roman"/>
-        </w:rPr>
-      </w:pPr>
-      <w:r>
-        <w:rPr>
-          <w:rFonts w:ascii="Times New Roman" w:hAnsi="Times New Roman" w:cs="Times New Roman"/>
+          <w:sz w:val="22"/>
+          <w:szCs w:val="22"/>
+        </w:rPr>
+      </w:pPr>
+      <w:r>
+        <w:rPr>
+          <w:rFonts w:ascii="Times New Roman" w:hAnsi="Times New Roman" w:cs="Times New Roman"/>
+          <w:sz w:val="22"/>
+          <w:szCs w:val="22"/>
         </w:rPr>
         <w:t>2014 July</w:t>
       </w:r>
       <w:r>
         <w:rPr>
           <w:rFonts w:ascii="Times New Roman" w:hAnsi="Times New Roman" w:cs="Times New Roman"/>
+          <w:sz w:val="22"/>
+          <w:szCs w:val="22"/>
         </w:rPr>
         <w:tab/>
         <w:t>Programming and Data Analysis in R, Institute for Frontier Studies, Kathmandu</w:t>
@@ -9717,17 +10116,23 @@
         <w:ind w:left="1800" w:hanging="1440"/>
         <w:rPr>
           <w:rFonts w:ascii="Times New Roman" w:hAnsi="Times New Roman" w:cs="Times New Roman"/>
-        </w:rPr>
-      </w:pPr>
-      <w:r>
-        <w:rPr>
-          <w:rFonts w:ascii="Times New Roman" w:hAnsi="Times New Roman" w:cs="Times New Roman"/>
+          <w:sz w:val="22"/>
+          <w:szCs w:val="22"/>
+        </w:rPr>
+      </w:pPr>
+      <w:r>
+        <w:rPr>
+          <w:rFonts w:ascii="Times New Roman" w:hAnsi="Times New Roman" w:cs="Times New Roman"/>
+          <w:sz w:val="22"/>
+          <w:szCs w:val="22"/>
         </w:rPr>
         <w:t>2014 Spr</w:t>
       </w:r>
       <w:r>
         <w:rPr>
           <w:rFonts w:ascii="Times New Roman" w:hAnsi="Times New Roman" w:cs="Times New Roman"/>
+          <w:sz w:val="22"/>
+          <w:szCs w:val="22"/>
         </w:rPr>
         <w:tab/>
         <w:t>Social Science Research and Proposal Writing, Nepa School of Social Science and Humanities, Kathmandu</w:t>
@@ -9739,17 +10144,23 @@
         <w:ind w:left="1800" w:hanging="1440"/>
         <w:rPr>
           <w:rFonts w:ascii="Times New Roman" w:hAnsi="Times New Roman" w:cs="Times New Roman"/>
-        </w:rPr>
-      </w:pPr>
-      <w:r>
-        <w:rPr>
-          <w:rFonts w:ascii="Times New Roman" w:hAnsi="Times New Roman" w:cs="Times New Roman"/>
+          <w:sz w:val="22"/>
+          <w:szCs w:val="22"/>
+        </w:rPr>
+      </w:pPr>
+      <w:r>
+        <w:rPr>
+          <w:rFonts w:ascii="Times New Roman" w:hAnsi="Times New Roman" w:cs="Times New Roman"/>
+          <w:sz w:val="22"/>
+          <w:szCs w:val="22"/>
         </w:rPr>
         <w:t>2013 Fall</w:t>
       </w:r>
       <w:r>
         <w:rPr>
           <w:rFonts w:ascii="Times New Roman" w:hAnsi="Times New Roman" w:cs="Times New Roman"/>
+          <w:sz w:val="22"/>
+          <w:szCs w:val="22"/>
         </w:rPr>
         <w:tab/>
         <w:t>Academic Writing Course: English for Academic Purposes, Nepa School of Social Science and Humanities, Kathmandu</w:t>
@@ -9761,17 +10172,23 @@
         <w:ind w:left="1800" w:hanging="1440"/>
         <w:rPr>
           <w:rFonts w:ascii="Times New Roman" w:hAnsi="Times New Roman" w:cs="Times New Roman"/>
-        </w:rPr>
-      </w:pPr>
-      <w:r>
-        <w:rPr>
-          <w:rFonts w:ascii="Times New Roman" w:hAnsi="Times New Roman" w:cs="Times New Roman"/>
+          <w:sz w:val="22"/>
+          <w:szCs w:val="22"/>
+        </w:rPr>
+      </w:pPr>
+      <w:r>
+        <w:rPr>
+          <w:rFonts w:ascii="Times New Roman" w:hAnsi="Times New Roman" w:cs="Times New Roman"/>
+          <w:sz w:val="22"/>
+          <w:szCs w:val="22"/>
         </w:rPr>
         <w:t>2010 Jan</w:t>
       </w:r>
       <w:r>
         <w:rPr>
           <w:rFonts w:ascii="Times New Roman" w:hAnsi="Times New Roman" w:cs="Times New Roman"/>
+          <w:sz w:val="22"/>
+          <w:szCs w:val="22"/>
         </w:rPr>
         <w:tab/>
         <w:t>Case Writing and Analysis, Tribhuvan University, Kathmandu</w:t>
@@ -9802,17 +10219,23 @@
         <w:ind w:left="1800" w:hanging="1440"/>
         <w:rPr>
           <w:rFonts w:ascii="Times New Roman" w:hAnsi="Times New Roman" w:cs="Times New Roman"/>
-        </w:rPr>
-      </w:pPr>
-      <w:r>
-        <w:rPr>
-          <w:rFonts w:ascii="Times New Roman" w:hAnsi="Times New Roman" w:cs="Times New Roman"/>
+          <w:sz w:val="22"/>
+          <w:szCs w:val="22"/>
+        </w:rPr>
+      </w:pPr>
+      <w:r>
+        <w:rPr>
+          <w:rFonts w:ascii="Times New Roman" w:hAnsi="Times New Roman" w:cs="Times New Roman"/>
+          <w:sz w:val="22"/>
+          <w:szCs w:val="22"/>
         </w:rPr>
         <w:t>2020 Mar</w:t>
       </w:r>
       <w:r>
         <w:rPr>
           <w:rFonts w:ascii="Times New Roman" w:hAnsi="Times New Roman" w:cs="Times New Roman"/>
+          <w:sz w:val="22"/>
+          <w:szCs w:val="22"/>
         </w:rPr>
         <w:tab/>
       </w:r>
@@ -9821,12 +10244,16 @@
           <w:rFonts w:ascii="Times New Roman" w:hAnsi="Times New Roman" w:cs="Times New Roman"/>
           <w:b/>
           <w:bCs/>
+          <w:sz w:val="22"/>
+          <w:szCs w:val="22"/>
         </w:rPr>
         <w:t>Co-trainer</w:t>
       </w:r>
       <w:r>
         <w:rPr>
           <w:rFonts w:ascii="Times New Roman" w:hAnsi="Times New Roman" w:cs="Times New Roman"/>
+          <w:sz w:val="22"/>
+          <w:szCs w:val="22"/>
         </w:rPr>
         <w:t>, Trained research team for enumeration using CAPI (COBO toolbox), National Indigenous Disabled Women Association, Nepal</w:t>
       </w:r>
@@ -9837,17 +10264,23 @@
         <w:ind w:left="1800" w:hanging="1440"/>
         <w:rPr>
           <w:rFonts w:ascii="Times New Roman" w:hAnsi="Times New Roman" w:cs="Times New Roman"/>
-        </w:rPr>
-      </w:pPr>
-      <w:r>
-        <w:rPr>
-          <w:rFonts w:ascii="Times New Roman" w:hAnsi="Times New Roman" w:cs="Times New Roman"/>
+          <w:sz w:val="22"/>
+          <w:szCs w:val="22"/>
+        </w:rPr>
+      </w:pPr>
+      <w:r>
+        <w:rPr>
+          <w:rFonts w:ascii="Times New Roman" w:hAnsi="Times New Roman" w:cs="Times New Roman"/>
+          <w:sz w:val="22"/>
+          <w:szCs w:val="22"/>
         </w:rPr>
         <w:t>2019 May</w:t>
       </w:r>
       <w:r>
         <w:rPr>
           <w:rFonts w:ascii="Times New Roman" w:hAnsi="Times New Roman" w:cs="Times New Roman"/>
+          <w:sz w:val="22"/>
+          <w:szCs w:val="22"/>
         </w:rPr>
         <w:tab/>
       </w:r>
@@ -9856,12 +10289,16 @@
           <w:rFonts w:ascii="Times New Roman" w:hAnsi="Times New Roman" w:cs="Times New Roman"/>
           <w:b/>
           <w:bCs/>
+          <w:sz w:val="22"/>
+          <w:szCs w:val="22"/>
         </w:rPr>
         <w:t>Co-trainer</w:t>
       </w:r>
       <w:r>
         <w:rPr>
           <w:rFonts w:ascii="Times New Roman" w:hAnsi="Times New Roman" w:cs="Times New Roman"/>
+          <w:sz w:val="22"/>
+          <w:szCs w:val="22"/>
         </w:rPr>
         <w:t>, Trained enumerators, and field supervisor to collect quality data using CAPI (CSPro), Social Impact Inc.</w:t>
       </w:r>
@@ -9872,17 +10309,23 @@
         <w:ind w:left="1800" w:hanging="1440"/>
         <w:rPr>
           <w:rFonts w:ascii="Times New Roman" w:hAnsi="Times New Roman" w:cs="Times New Roman"/>
-        </w:rPr>
-      </w:pPr>
-      <w:r>
-        <w:rPr>
-          <w:rFonts w:ascii="Times New Roman" w:hAnsi="Times New Roman" w:cs="Times New Roman"/>
+          <w:sz w:val="22"/>
+          <w:szCs w:val="22"/>
+        </w:rPr>
+      </w:pPr>
+      <w:r>
+        <w:rPr>
+          <w:rFonts w:ascii="Times New Roman" w:hAnsi="Times New Roman" w:cs="Times New Roman"/>
+          <w:sz w:val="22"/>
+          <w:szCs w:val="22"/>
         </w:rPr>
         <w:t xml:space="preserve">2017 Sept </w:t>
       </w:r>
       <w:r>
         <w:rPr>
           <w:rFonts w:ascii="Times New Roman" w:hAnsi="Times New Roman" w:cs="Times New Roman"/>
+          <w:sz w:val="22"/>
+          <w:szCs w:val="22"/>
         </w:rPr>
         <w:tab/>
       </w:r>
@@ -9891,36 +10334,50 @@
           <w:rFonts w:ascii="Times New Roman" w:hAnsi="Times New Roman" w:cs="Times New Roman"/>
           <w:b/>
           <w:bCs/>
+          <w:sz w:val="22"/>
+          <w:szCs w:val="22"/>
         </w:rPr>
         <w:t>Co-trainer</w:t>
       </w:r>
       <w:r>
         <w:rPr>
           <w:rFonts w:ascii="Times New Roman" w:hAnsi="Times New Roman" w:cs="Times New Roman"/>
+          <w:sz w:val="22"/>
+          <w:szCs w:val="22"/>
         </w:rPr>
         <w:t xml:space="preserve">, </w:t>
       </w:r>
-      <w:r>
-        <w:rPr>
-          <w:rFonts w:ascii="Times New Roman" w:hAnsi="Times New Roman" w:cs="Times New Roman"/>
+      <w:proofErr w:type="gramStart"/>
+      <w:r>
+        <w:rPr>
+          <w:rFonts w:ascii="Times New Roman" w:hAnsi="Times New Roman" w:cs="Times New Roman"/>
+          <w:sz w:val="22"/>
+          <w:szCs w:val="22"/>
         </w:rPr>
         <w:t>Delivered</w:t>
       </w:r>
-      <w:r>
-        <w:rPr>
-          <w:rFonts w:ascii="Times New Roman" w:hAnsi="Times New Roman" w:cs="Times New Roman"/>
+      <w:proofErr w:type="gramEnd"/>
+      <w:r>
+        <w:rPr>
+          <w:rFonts w:ascii="Times New Roman" w:hAnsi="Times New Roman" w:cs="Times New Roman"/>
+          <w:sz w:val="22"/>
+          <w:szCs w:val="22"/>
         </w:rPr>
         <w:t xml:space="preserve"> training for the research team to conduct a survey using CAPI (Qualtrics), University of Nottingham</w:t>
       </w:r>
       <w:r>
         <w:rPr>
           <w:rFonts w:ascii="Times New Roman" w:hAnsi="Times New Roman" w:cs="Times New Roman"/>
+          <w:sz w:val="22"/>
+          <w:szCs w:val="22"/>
         </w:rPr>
         <w:t>, Survey in Nepal</w:t>
       </w:r>
       <w:r>
         <w:rPr>
           <w:rFonts w:ascii="Times New Roman" w:hAnsi="Times New Roman" w:cs="Times New Roman"/>
+          <w:sz w:val="22"/>
+          <w:szCs w:val="22"/>
         </w:rPr>
         <w:t xml:space="preserve"> </w:t>
       </w:r>
@@ -9931,17 +10388,23 @@
         <w:ind w:left="1800" w:hanging="1440"/>
         <w:rPr>
           <w:rFonts w:ascii="Times New Roman" w:hAnsi="Times New Roman" w:cs="Times New Roman"/>
-        </w:rPr>
-      </w:pPr>
-      <w:r>
-        <w:rPr>
-          <w:rFonts w:ascii="Times New Roman" w:hAnsi="Times New Roman" w:cs="Times New Roman"/>
+          <w:sz w:val="22"/>
+          <w:szCs w:val="22"/>
+        </w:rPr>
+      </w:pPr>
+      <w:r>
+        <w:rPr>
+          <w:rFonts w:ascii="Times New Roman" w:hAnsi="Times New Roman" w:cs="Times New Roman"/>
+          <w:sz w:val="22"/>
+          <w:szCs w:val="22"/>
         </w:rPr>
         <w:t>2017 May</w:t>
       </w:r>
       <w:r>
         <w:rPr>
           <w:rFonts w:ascii="Times New Roman" w:hAnsi="Times New Roman" w:cs="Times New Roman"/>
+          <w:sz w:val="22"/>
+          <w:szCs w:val="22"/>
         </w:rPr>
         <w:tab/>
       </w:r>
@@ -9950,12 +10413,16 @@
           <w:rFonts w:ascii="Times New Roman" w:hAnsi="Times New Roman" w:cs="Times New Roman"/>
           <w:b/>
           <w:bCs/>
+          <w:sz w:val="22"/>
+          <w:szCs w:val="22"/>
         </w:rPr>
         <w:t>Co-trainer</w:t>
       </w:r>
       <w:r>
         <w:rPr>
           <w:rFonts w:ascii="Times New Roman" w:hAnsi="Times New Roman" w:cs="Times New Roman"/>
+          <w:sz w:val="22"/>
+          <w:szCs w:val="22"/>
         </w:rPr>
         <w:t>, Leadership training for Field Level Employee, Good Neighbor International, Project in Nepal</w:t>
       </w:r>
@@ -9966,17 +10433,23 @@
         <w:ind w:left="1800" w:hanging="1440"/>
         <w:rPr>
           <w:rFonts w:ascii="Times New Roman" w:hAnsi="Times New Roman" w:cs="Times New Roman"/>
-        </w:rPr>
-      </w:pPr>
-      <w:r>
-        <w:rPr>
-          <w:rFonts w:ascii="Times New Roman" w:hAnsi="Times New Roman" w:cs="Times New Roman"/>
+          <w:sz w:val="22"/>
+          <w:szCs w:val="22"/>
+        </w:rPr>
+      </w:pPr>
+      <w:r>
+        <w:rPr>
+          <w:rFonts w:ascii="Times New Roman" w:hAnsi="Times New Roman" w:cs="Times New Roman"/>
+          <w:sz w:val="22"/>
+          <w:szCs w:val="22"/>
         </w:rPr>
         <w:t>2017 Mar</w:t>
       </w:r>
       <w:r>
         <w:rPr>
           <w:rFonts w:ascii="Times New Roman" w:hAnsi="Times New Roman" w:cs="Times New Roman"/>
+          <w:sz w:val="22"/>
+          <w:szCs w:val="22"/>
         </w:rPr>
         <w:tab/>
       </w:r>
@@ -9985,12 +10458,16 @@
           <w:rFonts w:ascii="Times New Roman" w:hAnsi="Times New Roman" w:cs="Times New Roman"/>
           <w:b/>
           <w:bCs/>
+          <w:sz w:val="22"/>
+          <w:szCs w:val="22"/>
         </w:rPr>
         <w:t>Co-trainer</w:t>
       </w:r>
       <w:r>
         <w:rPr>
           <w:rFonts w:ascii="Times New Roman" w:hAnsi="Times New Roman" w:cs="Times New Roman"/>
+          <w:sz w:val="22"/>
+          <w:szCs w:val="22"/>
         </w:rPr>
         <w:t>, Leadership Training for the Inland Revenue Department’s Officers, Inland Revenue Department, Nepal</w:t>
       </w:r>
@@ -10001,17 +10478,23 @@
         <w:ind w:left="1800" w:hanging="1440"/>
         <w:rPr>
           <w:rFonts w:ascii="Times New Roman" w:hAnsi="Times New Roman" w:cs="Times New Roman"/>
-        </w:rPr>
-      </w:pPr>
-      <w:r>
-        <w:rPr>
-          <w:rFonts w:ascii="Times New Roman" w:hAnsi="Times New Roman" w:cs="Times New Roman"/>
+          <w:sz w:val="22"/>
+          <w:szCs w:val="22"/>
+        </w:rPr>
+      </w:pPr>
+      <w:r>
+        <w:rPr>
+          <w:rFonts w:ascii="Times New Roman" w:hAnsi="Times New Roman" w:cs="Times New Roman"/>
+          <w:sz w:val="22"/>
+          <w:szCs w:val="22"/>
         </w:rPr>
         <w:t>2016</w:t>
       </w:r>
       <w:r>
         <w:rPr>
           <w:rFonts w:ascii="Times New Roman" w:hAnsi="Times New Roman" w:cs="Times New Roman"/>
+          <w:sz w:val="22"/>
+          <w:szCs w:val="22"/>
         </w:rPr>
         <w:tab/>
       </w:r>
@@ -10020,12 +10503,16 @@
           <w:rFonts w:ascii="Times New Roman" w:hAnsi="Times New Roman" w:cs="Times New Roman"/>
           <w:b/>
           <w:bCs/>
+          <w:sz w:val="22"/>
+          <w:szCs w:val="22"/>
         </w:rPr>
         <w:t>Facilitator</w:t>
       </w:r>
       <w:r>
         <w:rPr>
           <w:rFonts w:ascii="Times New Roman" w:hAnsi="Times New Roman" w:cs="Times New Roman"/>
+          <w:sz w:val="22"/>
+          <w:szCs w:val="22"/>
         </w:rPr>
         <w:t xml:space="preserve">, Workshop Series on Career Planning and Student Success, Multiple Colleges in Nepal </w:t>
       </w:r>
@@ -10251,9 +10738,6 @@
       </w:pPr>
       <w:r>
         <w:t>PROFESSIONAL AFFILIATIONS</w:t>
-      </w:r>
-      <w:r>
-        <w:t>/MEMBERSHIP</w:t>
       </w:r>
     </w:p>
     <w:p>
@@ -10303,6 +10787,16 @@
         </w:rPr>
         <w:t>Southwest Educational Research Association (SERA)</w:t>
       </w:r>
+    </w:p>
+    <w:p>
+      <w:pPr>
+        <w:spacing w:after="120" w:line="240" w:lineRule="auto"/>
+        <w:rPr>
+          <w:rFonts w:ascii="Times New Roman" w:hAnsi="Times New Roman" w:cs="Times New Roman"/>
+          <w:sz w:val="22"/>
+          <w:szCs w:val="22"/>
+        </w:rPr>
+      </w:pPr>
     </w:p>
     <w:sectPr>
       <w:footerReference w:type="default" r:id="rId9"/>
@@ -10473,7 +10967,7 @@
         <w:sz w:val="20"/>
         <w:szCs w:val="20"/>
       </w:rPr>
-      <w:t>Sept</w:t>
+      <w:t>Oct</w:t>
     </w:r>
     <w:r>
       <w:rPr>
@@ -10777,6 +11271,119 @@
     </w:lvl>
   </w:abstractNum>
   <w:abstractNum w:abstractNumId="2" w15:restartNumberingAfterBreak="0">
+    <w:nsid w:val="176A6D0F"/>
+    <w:multiLevelType w:val="hybridMultilevel"/>
+    <w:tmpl w:val="367EF354"/>
+    <w:lvl w:ilvl="0" w:tplc="04090001">
+      <w:start w:val="1"/>
+      <w:numFmt w:val="bullet"/>
+      <w:lvlText w:val=""/>
+      <w:lvlJc w:val="left"/>
+      <w:pPr>
+        <w:ind w:left="1080" w:hanging="360"/>
+      </w:pPr>
+      <w:rPr>
+        <w:rFonts w:ascii="Symbol" w:hAnsi="Symbol" w:hint="default"/>
+      </w:rPr>
+    </w:lvl>
+    <w:lvl w:ilvl="1" w:tplc="04090003" w:tentative="1">
+      <w:start w:val="1"/>
+      <w:numFmt w:val="bullet"/>
+      <w:lvlText w:val="o"/>
+      <w:lvlJc w:val="left"/>
+      <w:pPr>
+        <w:ind w:left="1800" w:hanging="360"/>
+      </w:pPr>
+      <w:rPr>
+        <w:rFonts w:ascii="Courier New" w:hAnsi="Courier New" w:cs="Courier New" w:hint="default"/>
+      </w:rPr>
+    </w:lvl>
+    <w:lvl w:ilvl="2" w:tplc="04090005" w:tentative="1">
+      <w:start w:val="1"/>
+      <w:numFmt w:val="bullet"/>
+      <w:lvlText w:val=""/>
+      <w:lvlJc w:val="left"/>
+      <w:pPr>
+        <w:ind w:left="2520" w:hanging="360"/>
+      </w:pPr>
+      <w:rPr>
+        <w:rFonts w:ascii="Wingdings" w:hAnsi="Wingdings" w:hint="default"/>
+      </w:rPr>
+    </w:lvl>
+    <w:lvl w:ilvl="3" w:tplc="04090001" w:tentative="1">
+      <w:start w:val="1"/>
+      <w:numFmt w:val="bullet"/>
+      <w:lvlText w:val=""/>
+      <w:lvlJc w:val="left"/>
+      <w:pPr>
+        <w:ind w:left="3240" w:hanging="360"/>
+      </w:pPr>
+      <w:rPr>
+        <w:rFonts w:ascii="Symbol" w:hAnsi="Symbol" w:hint="default"/>
+      </w:rPr>
+    </w:lvl>
+    <w:lvl w:ilvl="4" w:tplc="04090003" w:tentative="1">
+      <w:start w:val="1"/>
+      <w:numFmt w:val="bullet"/>
+      <w:lvlText w:val="o"/>
+      <w:lvlJc w:val="left"/>
+      <w:pPr>
+        <w:ind w:left="3960" w:hanging="360"/>
+      </w:pPr>
+      <w:rPr>
+        <w:rFonts w:ascii="Courier New" w:hAnsi="Courier New" w:cs="Courier New" w:hint="default"/>
+      </w:rPr>
+    </w:lvl>
+    <w:lvl w:ilvl="5" w:tplc="04090005" w:tentative="1">
+      <w:start w:val="1"/>
+      <w:numFmt w:val="bullet"/>
+      <w:lvlText w:val=""/>
+      <w:lvlJc w:val="left"/>
+      <w:pPr>
+        <w:ind w:left="4680" w:hanging="360"/>
+      </w:pPr>
+      <w:rPr>
+        <w:rFonts w:ascii="Wingdings" w:hAnsi="Wingdings" w:hint="default"/>
+      </w:rPr>
+    </w:lvl>
+    <w:lvl w:ilvl="6" w:tplc="04090001" w:tentative="1">
+      <w:start w:val="1"/>
+      <w:numFmt w:val="bullet"/>
+      <w:lvlText w:val=""/>
+      <w:lvlJc w:val="left"/>
+      <w:pPr>
+        <w:ind w:left="5400" w:hanging="360"/>
+      </w:pPr>
+      <w:rPr>
+        <w:rFonts w:ascii="Symbol" w:hAnsi="Symbol" w:hint="default"/>
+      </w:rPr>
+    </w:lvl>
+    <w:lvl w:ilvl="7" w:tplc="04090003" w:tentative="1">
+      <w:start w:val="1"/>
+      <w:numFmt w:val="bullet"/>
+      <w:lvlText w:val="o"/>
+      <w:lvlJc w:val="left"/>
+      <w:pPr>
+        <w:ind w:left="6120" w:hanging="360"/>
+      </w:pPr>
+      <w:rPr>
+        <w:rFonts w:ascii="Courier New" w:hAnsi="Courier New" w:cs="Courier New" w:hint="default"/>
+      </w:rPr>
+    </w:lvl>
+    <w:lvl w:ilvl="8" w:tplc="04090005" w:tentative="1">
+      <w:start w:val="1"/>
+      <w:numFmt w:val="bullet"/>
+      <w:lvlText w:val=""/>
+      <w:lvlJc w:val="left"/>
+      <w:pPr>
+        <w:ind w:left="6840" w:hanging="360"/>
+      </w:pPr>
+      <w:rPr>
+        <w:rFonts w:ascii="Wingdings" w:hAnsi="Wingdings" w:hint="default"/>
+      </w:rPr>
+    </w:lvl>
+  </w:abstractNum>
+  <w:abstractNum w:abstractNumId="3" w15:restartNumberingAfterBreak="0">
     <w:nsid w:val="1F51175C"/>
     <w:multiLevelType w:val="hybridMultilevel"/>
     <w:tmpl w:val="95347554"/>
@@ -10792,7 +11399,7 @@
         <w:rFonts w:ascii="Symbol" w:hAnsi="Symbol" w:hint="default"/>
       </w:rPr>
     </w:lvl>
-    <w:lvl w:ilvl="1" w:tplc="04090003" w:tentative="1">
+    <w:lvl w:ilvl="1" w:tplc="04090003">
       <w:start w:val="1"/>
       <w:numFmt w:val="bullet"/>
       <w:lvlText w:val="o"/>
@@ -10804,7 +11411,7 @@
         <w:rFonts w:ascii="Courier New" w:hAnsi="Courier New" w:cs="Courier New" w:hint="default"/>
       </w:rPr>
     </w:lvl>
-    <w:lvl w:ilvl="2" w:tplc="04090005" w:tentative="1">
+    <w:lvl w:ilvl="2" w:tplc="04090005">
       <w:start w:val="1"/>
       <w:numFmt w:val="bullet"/>
       <w:lvlText w:val=""/>
@@ -10889,7 +11496,7 @@
       </w:rPr>
     </w:lvl>
   </w:abstractNum>
-  <w:abstractNum w:abstractNumId="3" w15:restartNumberingAfterBreak="0">
+  <w:abstractNum w:abstractNumId="4" w15:restartNumberingAfterBreak="0">
     <w:nsid w:val="21560AD7"/>
     <w:multiLevelType w:val="hybridMultilevel"/>
     <w:tmpl w:val="03226C98"/>
@@ -11002,7 +11609,7 @@
       </w:rPr>
     </w:lvl>
   </w:abstractNum>
-  <w:abstractNum w:abstractNumId="4" w15:restartNumberingAfterBreak="0">
+  <w:abstractNum w:abstractNumId="5" w15:restartNumberingAfterBreak="0">
     <w:nsid w:val="24D650B1"/>
     <w:multiLevelType w:val="hybridMultilevel"/>
     <w:tmpl w:val="A412E38A"/>
@@ -11115,7 +11722,7 @@
       </w:rPr>
     </w:lvl>
   </w:abstractNum>
-  <w:abstractNum w:abstractNumId="5" w15:restartNumberingAfterBreak="0">
+  <w:abstractNum w:abstractNumId="6" w15:restartNumberingAfterBreak="0">
     <w:nsid w:val="31763F57"/>
     <w:multiLevelType w:val="hybridMultilevel"/>
     <w:tmpl w:val="51BE43EE"/>
@@ -11228,7 +11835,120 @@
       </w:rPr>
     </w:lvl>
   </w:abstractNum>
-  <w:abstractNum w:abstractNumId="6" w15:restartNumberingAfterBreak="0">
+  <w:abstractNum w:abstractNumId="7" w15:restartNumberingAfterBreak="0">
+    <w:nsid w:val="347F1E24"/>
+    <w:multiLevelType w:val="hybridMultilevel"/>
+    <w:tmpl w:val="E7CE5014"/>
+    <w:lvl w:ilvl="0" w:tplc="04090001">
+      <w:start w:val="1"/>
+      <w:numFmt w:val="bullet"/>
+      <w:lvlText w:val=""/>
+      <w:lvlJc w:val="left"/>
+      <w:pPr>
+        <w:ind w:left="1080" w:hanging="360"/>
+      </w:pPr>
+      <w:rPr>
+        <w:rFonts w:ascii="Symbol" w:hAnsi="Symbol" w:hint="default"/>
+      </w:rPr>
+    </w:lvl>
+    <w:lvl w:ilvl="1" w:tplc="04090003" w:tentative="1">
+      <w:start w:val="1"/>
+      <w:numFmt w:val="bullet"/>
+      <w:lvlText w:val="o"/>
+      <w:lvlJc w:val="left"/>
+      <w:pPr>
+        <w:ind w:left="1800" w:hanging="360"/>
+      </w:pPr>
+      <w:rPr>
+        <w:rFonts w:ascii="Courier New" w:hAnsi="Courier New" w:cs="Courier New" w:hint="default"/>
+      </w:rPr>
+    </w:lvl>
+    <w:lvl w:ilvl="2" w:tplc="04090005" w:tentative="1">
+      <w:start w:val="1"/>
+      <w:numFmt w:val="bullet"/>
+      <w:lvlText w:val=""/>
+      <w:lvlJc w:val="left"/>
+      <w:pPr>
+        <w:ind w:left="2520" w:hanging="360"/>
+      </w:pPr>
+      <w:rPr>
+        <w:rFonts w:ascii="Wingdings" w:hAnsi="Wingdings" w:hint="default"/>
+      </w:rPr>
+    </w:lvl>
+    <w:lvl w:ilvl="3" w:tplc="04090001" w:tentative="1">
+      <w:start w:val="1"/>
+      <w:numFmt w:val="bullet"/>
+      <w:lvlText w:val=""/>
+      <w:lvlJc w:val="left"/>
+      <w:pPr>
+        <w:ind w:left="3240" w:hanging="360"/>
+      </w:pPr>
+      <w:rPr>
+        <w:rFonts w:ascii="Symbol" w:hAnsi="Symbol" w:hint="default"/>
+      </w:rPr>
+    </w:lvl>
+    <w:lvl w:ilvl="4" w:tplc="04090003" w:tentative="1">
+      <w:start w:val="1"/>
+      <w:numFmt w:val="bullet"/>
+      <w:lvlText w:val="o"/>
+      <w:lvlJc w:val="left"/>
+      <w:pPr>
+        <w:ind w:left="3960" w:hanging="360"/>
+      </w:pPr>
+      <w:rPr>
+        <w:rFonts w:ascii="Courier New" w:hAnsi="Courier New" w:cs="Courier New" w:hint="default"/>
+      </w:rPr>
+    </w:lvl>
+    <w:lvl w:ilvl="5" w:tplc="04090005" w:tentative="1">
+      <w:start w:val="1"/>
+      <w:numFmt w:val="bullet"/>
+      <w:lvlText w:val=""/>
+      <w:lvlJc w:val="left"/>
+      <w:pPr>
+        <w:ind w:left="4680" w:hanging="360"/>
+      </w:pPr>
+      <w:rPr>
+        <w:rFonts w:ascii="Wingdings" w:hAnsi="Wingdings" w:hint="default"/>
+      </w:rPr>
+    </w:lvl>
+    <w:lvl w:ilvl="6" w:tplc="04090001" w:tentative="1">
+      <w:start w:val="1"/>
+      <w:numFmt w:val="bullet"/>
+      <w:lvlText w:val=""/>
+      <w:lvlJc w:val="left"/>
+      <w:pPr>
+        <w:ind w:left="5400" w:hanging="360"/>
+      </w:pPr>
+      <w:rPr>
+        <w:rFonts w:ascii="Symbol" w:hAnsi="Symbol" w:hint="default"/>
+      </w:rPr>
+    </w:lvl>
+    <w:lvl w:ilvl="7" w:tplc="04090003" w:tentative="1">
+      <w:start w:val="1"/>
+      <w:numFmt w:val="bullet"/>
+      <w:lvlText w:val="o"/>
+      <w:lvlJc w:val="left"/>
+      <w:pPr>
+        <w:ind w:left="6120" w:hanging="360"/>
+      </w:pPr>
+      <w:rPr>
+        <w:rFonts w:ascii="Courier New" w:hAnsi="Courier New" w:cs="Courier New" w:hint="default"/>
+      </w:rPr>
+    </w:lvl>
+    <w:lvl w:ilvl="8" w:tplc="04090005" w:tentative="1">
+      <w:start w:val="1"/>
+      <w:numFmt w:val="bullet"/>
+      <w:lvlText w:val=""/>
+      <w:lvlJc w:val="left"/>
+      <w:pPr>
+        <w:ind w:left="6840" w:hanging="360"/>
+      </w:pPr>
+      <w:rPr>
+        <w:rFonts w:ascii="Wingdings" w:hAnsi="Wingdings" w:hint="default"/>
+      </w:rPr>
+    </w:lvl>
+  </w:abstractNum>
+  <w:abstractNum w:abstractNumId="8" w15:restartNumberingAfterBreak="0">
     <w:nsid w:val="38607ABE"/>
     <w:multiLevelType w:val="hybridMultilevel"/>
     <w:tmpl w:val="227A0B70"/>
@@ -11341,7 +12061,7 @@
       </w:rPr>
     </w:lvl>
   </w:abstractNum>
-  <w:abstractNum w:abstractNumId="7" w15:restartNumberingAfterBreak="0">
+  <w:abstractNum w:abstractNumId="9" w15:restartNumberingAfterBreak="0">
     <w:nsid w:val="41C7434B"/>
     <w:multiLevelType w:val="multilevel"/>
     <w:tmpl w:val="D29AF170"/>
@@ -11490,7 +12210,7 @@
       </w:rPr>
     </w:lvl>
   </w:abstractNum>
-  <w:abstractNum w:abstractNumId="8" w15:restartNumberingAfterBreak="0">
+  <w:abstractNum w:abstractNumId="10" w15:restartNumberingAfterBreak="0">
     <w:nsid w:val="4DBA1898"/>
     <w:multiLevelType w:val="hybridMultilevel"/>
     <w:tmpl w:val="6FEAF894"/>
@@ -11603,7 +12323,7 @@
       </w:rPr>
     </w:lvl>
   </w:abstractNum>
-  <w:abstractNum w:abstractNumId="9" w15:restartNumberingAfterBreak="0">
+  <w:abstractNum w:abstractNumId="11" w15:restartNumberingAfterBreak="0">
     <w:nsid w:val="4E4B4CDC"/>
     <w:multiLevelType w:val="hybridMultilevel"/>
     <w:tmpl w:val="CD72313C"/>
@@ -11716,7 +12436,7 @@
       </w:rPr>
     </w:lvl>
   </w:abstractNum>
-  <w:abstractNum w:abstractNumId="10" w15:restartNumberingAfterBreak="0">
+  <w:abstractNum w:abstractNumId="12" w15:restartNumberingAfterBreak="0">
     <w:nsid w:val="61C6467C"/>
     <w:multiLevelType w:val="hybridMultilevel"/>
     <w:tmpl w:val="B2EE06F6"/>
@@ -11829,7 +12549,7 @@
       </w:rPr>
     </w:lvl>
   </w:abstractNum>
-  <w:abstractNum w:abstractNumId="11" w15:restartNumberingAfterBreak="0">
+  <w:abstractNum w:abstractNumId="13" w15:restartNumberingAfterBreak="0">
     <w:nsid w:val="62C7348D"/>
     <w:multiLevelType w:val="hybridMultilevel"/>
     <w:tmpl w:val="869465C4"/>
@@ -11942,7 +12662,7 @@
       </w:rPr>
     </w:lvl>
   </w:abstractNum>
-  <w:abstractNum w:abstractNumId="12" w15:restartNumberingAfterBreak="0">
+  <w:abstractNum w:abstractNumId="14" w15:restartNumberingAfterBreak="0">
     <w:nsid w:val="67935119"/>
     <w:multiLevelType w:val="hybridMultilevel"/>
     <w:tmpl w:val="8A8CA90C"/>
@@ -12055,7 +12775,120 @@
       </w:rPr>
     </w:lvl>
   </w:abstractNum>
-  <w:abstractNum w:abstractNumId="13" w15:restartNumberingAfterBreak="0">
+  <w:abstractNum w:abstractNumId="15" w15:restartNumberingAfterBreak="0">
+    <w:nsid w:val="6C0E166A"/>
+    <w:multiLevelType w:val="hybridMultilevel"/>
+    <w:tmpl w:val="187A899E"/>
+    <w:lvl w:ilvl="0" w:tplc="04090001">
+      <w:start w:val="1"/>
+      <w:numFmt w:val="bullet"/>
+      <w:lvlText w:val=""/>
+      <w:lvlJc w:val="left"/>
+      <w:pPr>
+        <w:ind w:left="1080" w:hanging="360"/>
+      </w:pPr>
+      <w:rPr>
+        <w:rFonts w:ascii="Symbol" w:hAnsi="Symbol" w:hint="default"/>
+      </w:rPr>
+    </w:lvl>
+    <w:lvl w:ilvl="1" w:tplc="04090003" w:tentative="1">
+      <w:start w:val="1"/>
+      <w:numFmt w:val="bullet"/>
+      <w:lvlText w:val="o"/>
+      <w:lvlJc w:val="left"/>
+      <w:pPr>
+        <w:ind w:left="1800" w:hanging="360"/>
+      </w:pPr>
+      <w:rPr>
+        <w:rFonts w:ascii="Courier New" w:hAnsi="Courier New" w:cs="Courier New" w:hint="default"/>
+      </w:rPr>
+    </w:lvl>
+    <w:lvl w:ilvl="2" w:tplc="04090005" w:tentative="1">
+      <w:start w:val="1"/>
+      <w:numFmt w:val="bullet"/>
+      <w:lvlText w:val=""/>
+      <w:lvlJc w:val="left"/>
+      <w:pPr>
+        <w:ind w:left="2520" w:hanging="360"/>
+      </w:pPr>
+      <w:rPr>
+        <w:rFonts w:ascii="Wingdings" w:hAnsi="Wingdings" w:hint="default"/>
+      </w:rPr>
+    </w:lvl>
+    <w:lvl w:ilvl="3" w:tplc="04090001" w:tentative="1">
+      <w:start w:val="1"/>
+      <w:numFmt w:val="bullet"/>
+      <w:lvlText w:val=""/>
+      <w:lvlJc w:val="left"/>
+      <w:pPr>
+        <w:ind w:left="3240" w:hanging="360"/>
+      </w:pPr>
+      <w:rPr>
+        <w:rFonts w:ascii="Symbol" w:hAnsi="Symbol" w:hint="default"/>
+      </w:rPr>
+    </w:lvl>
+    <w:lvl w:ilvl="4" w:tplc="04090003" w:tentative="1">
+      <w:start w:val="1"/>
+      <w:numFmt w:val="bullet"/>
+      <w:lvlText w:val="o"/>
+      <w:lvlJc w:val="left"/>
+      <w:pPr>
+        <w:ind w:left="3960" w:hanging="360"/>
+      </w:pPr>
+      <w:rPr>
+        <w:rFonts w:ascii="Courier New" w:hAnsi="Courier New" w:cs="Courier New" w:hint="default"/>
+      </w:rPr>
+    </w:lvl>
+    <w:lvl w:ilvl="5" w:tplc="04090005" w:tentative="1">
+      <w:start w:val="1"/>
+      <w:numFmt w:val="bullet"/>
+      <w:lvlText w:val=""/>
+      <w:lvlJc w:val="left"/>
+      <w:pPr>
+        <w:ind w:left="4680" w:hanging="360"/>
+      </w:pPr>
+      <w:rPr>
+        <w:rFonts w:ascii="Wingdings" w:hAnsi="Wingdings" w:hint="default"/>
+      </w:rPr>
+    </w:lvl>
+    <w:lvl w:ilvl="6" w:tplc="04090001" w:tentative="1">
+      <w:start w:val="1"/>
+      <w:numFmt w:val="bullet"/>
+      <w:lvlText w:val=""/>
+      <w:lvlJc w:val="left"/>
+      <w:pPr>
+        <w:ind w:left="5400" w:hanging="360"/>
+      </w:pPr>
+      <w:rPr>
+        <w:rFonts w:ascii="Symbol" w:hAnsi="Symbol" w:hint="default"/>
+      </w:rPr>
+    </w:lvl>
+    <w:lvl w:ilvl="7" w:tplc="04090003" w:tentative="1">
+      <w:start w:val="1"/>
+      <w:numFmt w:val="bullet"/>
+      <w:lvlText w:val="o"/>
+      <w:lvlJc w:val="left"/>
+      <w:pPr>
+        <w:ind w:left="6120" w:hanging="360"/>
+      </w:pPr>
+      <w:rPr>
+        <w:rFonts w:ascii="Courier New" w:hAnsi="Courier New" w:cs="Courier New" w:hint="default"/>
+      </w:rPr>
+    </w:lvl>
+    <w:lvl w:ilvl="8" w:tplc="04090005" w:tentative="1">
+      <w:start w:val="1"/>
+      <w:numFmt w:val="bullet"/>
+      <w:lvlText w:val=""/>
+      <w:lvlJc w:val="left"/>
+      <w:pPr>
+        <w:ind w:left="6840" w:hanging="360"/>
+      </w:pPr>
+      <w:rPr>
+        <w:rFonts w:ascii="Wingdings" w:hAnsi="Wingdings" w:hint="default"/>
+      </w:rPr>
+    </w:lvl>
+  </w:abstractNum>
+  <w:abstractNum w:abstractNumId="16" w15:restartNumberingAfterBreak="0">
     <w:nsid w:val="71257A51"/>
     <w:multiLevelType w:val="hybridMultilevel"/>
     <w:tmpl w:val="AD400156"/>
@@ -12168,7 +13001,7 @@
       </w:rPr>
     </w:lvl>
   </w:abstractNum>
-  <w:abstractNum w:abstractNumId="14" w15:restartNumberingAfterBreak="0">
+  <w:abstractNum w:abstractNumId="17" w15:restartNumberingAfterBreak="0">
     <w:nsid w:val="736B2FA7"/>
     <w:multiLevelType w:val="hybridMultilevel"/>
     <w:tmpl w:val="B15E1490"/>
@@ -12281,7 +13114,7 @@
       </w:rPr>
     </w:lvl>
   </w:abstractNum>
-  <w:abstractNum w:abstractNumId="15" w15:restartNumberingAfterBreak="0">
+  <w:abstractNum w:abstractNumId="18" w15:restartNumberingAfterBreak="0">
     <w:nsid w:val="779F4EAB"/>
     <w:multiLevelType w:val="hybridMultilevel"/>
     <w:tmpl w:val="82207A7A"/>
@@ -12395,51 +13228,60 @@
     </w:lvl>
   </w:abstractNum>
   <w:num w:numId="1" w16cid:durableId="1092970415">
-    <w:abstractNumId w:val="12"/>
+    <w:abstractNumId w:val="14"/>
   </w:num>
   <w:num w:numId="2" w16cid:durableId="551770584">
-    <w:abstractNumId w:val="13"/>
+    <w:abstractNumId w:val="16"/>
   </w:num>
   <w:num w:numId="3" w16cid:durableId="585723708">
+    <w:abstractNumId w:val="5"/>
+  </w:num>
+  <w:num w:numId="4" w16cid:durableId="1544366970">
     <w:abstractNumId w:val="4"/>
   </w:num>
-  <w:num w:numId="4" w16cid:durableId="1544366970">
-    <w:abstractNumId w:val="3"/>
-  </w:num>
   <w:num w:numId="5" w16cid:durableId="2134209492">
-    <w:abstractNumId w:val="8"/>
+    <w:abstractNumId w:val="10"/>
   </w:num>
   <w:num w:numId="6" w16cid:durableId="497382053">
-    <w:abstractNumId w:val="14"/>
+    <w:abstractNumId w:val="17"/>
   </w:num>
   <w:num w:numId="7" w16cid:durableId="461533883">
-    <w:abstractNumId w:val="5"/>
+    <w:abstractNumId w:val="6"/>
   </w:num>
   <w:num w:numId="8" w16cid:durableId="743799996">
     <w:abstractNumId w:val="1"/>
   </w:num>
   <w:num w:numId="9" w16cid:durableId="792332854">
-    <w:abstractNumId w:val="15"/>
+    <w:abstractNumId w:val="18"/>
   </w:num>
   <w:num w:numId="10" w16cid:durableId="76832236">
     <w:abstractNumId w:val="0"/>
   </w:num>
   <w:num w:numId="11" w16cid:durableId="2030132572">
+    <w:abstractNumId w:val="9"/>
+  </w:num>
+  <w:num w:numId="12" w16cid:durableId="1787499629">
+    <w:abstractNumId w:val="11"/>
+  </w:num>
+  <w:num w:numId="13" w16cid:durableId="609897584">
+    <w:abstractNumId w:val="8"/>
+  </w:num>
+  <w:num w:numId="14" w16cid:durableId="1394504437">
+    <w:abstractNumId w:val="13"/>
+  </w:num>
+  <w:num w:numId="15" w16cid:durableId="1498840164">
+    <w:abstractNumId w:val="12"/>
+  </w:num>
+  <w:num w:numId="16" w16cid:durableId="1790584938">
+    <w:abstractNumId w:val="3"/>
+  </w:num>
+  <w:num w:numId="17" w16cid:durableId="1663116866">
+    <w:abstractNumId w:val="15"/>
+  </w:num>
+  <w:num w:numId="18" w16cid:durableId="1072702890">
     <w:abstractNumId w:val="7"/>
   </w:num>
-  <w:num w:numId="12" w16cid:durableId="1787499629">
-    <w:abstractNumId w:val="9"/>
-  </w:num>
-  <w:num w:numId="13" w16cid:durableId="609897584">
-    <w:abstractNumId w:val="6"/>
-  </w:num>
-  <w:num w:numId="14" w16cid:durableId="1394504437">
-    <w:abstractNumId w:val="11"/>
-  </w:num>
-  <w:num w:numId="15" w16cid:durableId="1498840164">
-    <w:abstractNumId w:val="10"/>
-  </w:num>
-  <w:num w:numId="16" w16cid:durableId="1790584938">
+  <w:num w:numId="19" w16cid:durableId="2029024260">
     <w:abstractNumId w:val="2"/>
   </w:num>
 </w:numbering>

</xml_diff>

<commit_message>
Deploying to gh-pages from @ Bibek-Luitel/bibek-luitel.github.io@127a1bcf3c4b4349016c4b8b60fc48cd127316d1 🚀
</commit_message>
<xml_diff>
--- a/assets/pdf/cv_full_bibekluitel.docx
+++ b/assets/pdf/cv_full_bibekluitel.docx
@@ -468,73 +468,136 @@
     </w:p>
     <w:p>
       <w:pPr>
+        <w:pBdr>
+          <w:bottom w:val="single" w:sz="6" w:space="1" w:color="auto"/>
+        </w:pBdr>
+        <w:spacing w:after="0" w:line="240" w:lineRule="auto"/>
+        <w:rPr>
+          <w:rFonts w:ascii="Times New Roman" w:hAnsi="Times New Roman" w:cs="Times New Roman"/>
+        </w:rPr>
+      </w:pPr>
+    </w:p>
+    <w:p>
+      <w:pPr>
+        <w:pStyle w:val="Heading1"/>
+      </w:pPr>
+      <w:r>
+        <w:t>RESEARCH</w:t>
+      </w:r>
+      <w:r>
+        <w:t xml:space="preserve"> AND ANALYTICAL</w:t>
+      </w:r>
+      <w:r>
+        <w:t xml:space="preserve"> SKILLS</w:t>
+      </w:r>
+    </w:p>
+    <w:p>
+      <w:pPr>
         <w:pStyle w:val="ListParagraph"/>
         <w:numPr>
           <w:ilvl w:val="0"/>
           <w:numId w:val="1"/>
         </w:numPr>
-        <w:spacing w:after="120" w:line="240" w:lineRule="auto"/>
-        <w:rPr>
-          <w:rFonts w:ascii="Times New Roman" w:hAnsi="Times New Roman" w:cs="Times New Roman"/>
-          <w:sz w:val="22"/>
-          <w:szCs w:val="22"/>
-        </w:rPr>
-      </w:pPr>
-      <w:r>
-        <w:rPr>
-          <w:rFonts w:ascii="Times New Roman" w:hAnsi="Times New Roman" w:cs="Times New Roman"/>
+        <w:spacing w:after="0" w:line="240" w:lineRule="auto"/>
+        <w:rPr>
+          <w:rFonts w:ascii="Times New Roman" w:hAnsi="Times New Roman" w:cs="Times New Roman"/>
+        </w:rPr>
+      </w:pPr>
+      <w:r>
+        <w:rPr>
+          <w:rFonts w:ascii="Times New Roman" w:hAnsi="Times New Roman"/>
           <w:b/>
           <w:bCs/>
           <w:sz w:val="22"/>
           <w:szCs w:val="22"/>
         </w:rPr>
-        <w:t>Bachelor of Business Studies (B.B.S.)</w:t>
-      </w:r>
-      <w:r>
-        <w:rPr>
-          <w:rFonts w:ascii="Times New Roman" w:hAnsi="Times New Roman" w:cs="Times New Roman"/>
-          <w:sz w:val="22"/>
-          <w:szCs w:val="22"/>
-        </w:rPr>
-        <w:t xml:space="preserve">, </w:t>
-      </w:r>
-      <w:r>
-        <w:rPr>
-          <w:rFonts w:ascii="Times New Roman" w:hAnsi="Times New Roman" w:cs="Times New Roman"/>
-          <w:sz w:val="22"/>
-          <w:szCs w:val="22"/>
-        </w:rPr>
-        <w:t>200</w:t>
-      </w:r>
-      <w:r>
-        <w:rPr>
-          <w:rFonts w:ascii="Times New Roman" w:hAnsi="Times New Roman" w:cs="Times New Roman"/>
-          <w:sz w:val="22"/>
-          <w:szCs w:val="22"/>
-        </w:rPr>
-        <w:t>2</w:t>
+        <w:t>Program Strategy</w:t>
+      </w:r>
+      <w:r>
+        <w:rPr>
+          <w:rFonts w:ascii="Times New Roman" w:hAnsi="Times New Roman"/>
+          <w:sz w:val="22"/>
+          <w:szCs w:val="22"/>
+        </w:rPr>
+        <w:t>: Expertise in program design, evaluation, grant writing, project management, and stakeholder collaboration.</w:t>
       </w:r>
     </w:p>
     <w:p>
       <w:pPr>
         <w:pStyle w:val="ListParagraph"/>
+        <w:numPr>
+          <w:ilvl w:val="0"/>
+          <w:numId w:val="1"/>
+        </w:numPr>
         <w:spacing w:after="0" w:line="240" w:lineRule="auto"/>
-        <w:contextualSpacing w:val="0"/>
-        <w:rPr>
-          <w:rFonts w:ascii="Times New Roman" w:hAnsi="Times New Roman" w:cs="Times New Roman"/>
-          <w:i/>
-          <w:iCs/>
-        </w:rPr>
-      </w:pPr>
-      <w:r>
-        <w:rPr>
-          <w:rFonts w:ascii="Times New Roman" w:hAnsi="Times New Roman" w:cs="Times New Roman"/>
-          <w:i/>
-          <w:iCs/>
-          <w:sz w:val="22"/>
-          <w:szCs w:val="22"/>
-        </w:rPr>
-        <w:t>Tribhuvan University, Kathmandu, Nepal</w:t>
+        <w:rPr>
+          <w:rFonts w:ascii="Times New Roman" w:hAnsi="Times New Roman" w:cs="Times New Roman"/>
+        </w:rPr>
+      </w:pPr>
+      <w:r>
+        <w:rPr>
+          <w:rFonts w:ascii="Times New Roman" w:hAnsi="Times New Roman"/>
+          <w:b/>
+          <w:bCs/>
+          <w:sz w:val="22"/>
+          <w:szCs w:val="22"/>
+        </w:rPr>
+        <w:t>Research Methods</w:t>
+      </w:r>
+      <w:r>
+        <w:rPr>
+          <w:rFonts w:ascii="Times New Roman" w:hAnsi="Times New Roman"/>
+          <w:sz w:val="22"/>
+          <w:szCs w:val="22"/>
+        </w:rPr>
+        <w:t>: Proficient in quantitative, qualitative, and mixed-methods research, monitoring, and impact evaluation.</w:t>
+      </w:r>
+    </w:p>
+    <w:p>
+      <w:pPr>
+        <w:pStyle w:val="ListParagraph"/>
+        <w:numPr>
+          <w:ilvl w:val="0"/>
+          <w:numId w:val="1"/>
+        </w:numPr>
+        <w:spacing w:after="0" w:line="240" w:lineRule="auto"/>
+        <w:rPr>
+          <w:rFonts w:ascii="Times New Roman" w:hAnsi="Times New Roman" w:cs="Times New Roman"/>
+        </w:rPr>
+      </w:pPr>
+      <w:r>
+        <w:rPr>
+          <w:rFonts w:ascii="Times New Roman" w:hAnsi="Times New Roman"/>
+          <w:b/>
+          <w:bCs/>
+          <w:sz w:val="22"/>
+          <w:szCs w:val="22"/>
+        </w:rPr>
+        <w:t>Data Analysis</w:t>
+      </w:r>
+      <w:r>
+        <w:rPr>
+          <w:rFonts w:ascii="Times New Roman" w:hAnsi="Times New Roman"/>
+          <w:sz w:val="22"/>
+          <w:szCs w:val="22"/>
+        </w:rPr>
+        <w:t>: Skilled in descriptive, inferential, multivariate, and hierarchical modeling, machine learning, and qualitative analysis</w:t>
+      </w:r>
+      <w:r>
+        <w:rPr>
+          <w:rFonts w:ascii="Times New Roman" w:hAnsi="Times New Roman"/>
+          <w:sz w:val="22"/>
+          <w:szCs w:val="22"/>
+        </w:rPr>
+        <w:t>,</w:t>
+      </w:r>
+      <w:r>
+        <w:rPr>
+          <w:rFonts w:ascii="Times New Roman" w:hAnsi="Times New Roman"/>
+          <w:sz w:val="22"/>
+          <w:szCs w:val="22"/>
+        </w:rPr>
+        <w:t xml:space="preserve"> including interviews and thematic coding.</w:t>
       </w:r>
     </w:p>
     <w:p>
@@ -550,10 +613,28 @@
     </w:p>
     <w:p>
       <w:pPr>
-        <w:pStyle w:val="Heading1"/>
-      </w:pPr>
-      <w:r>
-        <w:t>RESEARCH INTEREST AND EXPERTISE</w:t>
+        <w:spacing w:after="80" w:line="240" w:lineRule="auto"/>
+        <w:rPr>
+          <w:rFonts w:ascii="Times New Roman" w:hAnsi="Times New Roman"/>
+          <w:b/>
+          <w:bCs/>
+        </w:rPr>
+      </w:pPr>
+      <w:r>
+        <w:rPr>
+          <w:rFonts w:ascii="Times New Roman" w:hAnsi="Times New Roman"/>
+          <w:b/>
+          <w:bCs/>
+        </w:rPr>
+        <w:t>TECHNICAL</w:t>
+      </w:r>
+      <w:r>
+        <w:rPr>
+          <w:rFonts w:ascii="Times New Roman" w:hAnsi="Times New Roman"/>
+          <w:b/>
+          <w:bCs/>
+        </w:rPr>
+        <w:t xml:space="preserve"> AND DATA SKILLS</w:t>
       </w:r>
     </w:p>
     <w:p>
@@ -561,55 +642,30 @@
         <w:pStyle w:val="ListParagraph"/>
         <w:numPr>
           <w:ilvl w:val="0"/>
-          <w:numId w:val="16"/>
+          <w:numId w:val="21"/>
         </w:numPr>
-        <w:spacing w:after="80" w:line="240" w:lineRule="auto"/>
-        <w:contextualSpacing w:val="0"/>
+        <w:spacing w:after="0" w:line="240" w:lineRule="auto"/>
+        <w:rPr>
+          <w:rFonts w:ascii="Times New Roman" w:hAnsi="Times New Roman" w:cs="Times New Roman"/>
+        </w:rPr>
+      </w:pPr>
+      <w:r>
         <w:rPr>
           <w:rFonts w:ascii="Times New Roman" w:hAnsi="Times New Roman"/>
-          <w:sz w:val="22"/>
-          <w:szCs w:val="22"/>
-        </w:rPr>
-      </w:pPr>
+          <w:b/>
+          <w:bCs/>
+          <w:sz w:val="22"/>
+          <w:szCs w:val="22"/>
+        </w:rPr>
+        <w:t>Analytical Tools</w:t>
+      </w:r>
       <w:r>
         <w:rPr>
           <w:rFonts w:ascii="Times New Roman" w:hAnsi="Times New Roman"/>
           <w:sz w:val="22"/>
           <w:szCs w:val="22"/>
         </w:rPr>
-        <w:t>Higher education finance with a focus on student debt, financial aid</w:t>
-      </w:r>
-      <w:r>
-        <w:rPr>
-          <w:rFonts w:ascii="Times New Roman" w:hAnsi="Times New Roman"/>
-          <w:sz w:val="22"/>
-          <w:szCs w:val="22"/>
-        </w:rPr>
-        <w:t xml:space="preserve"> </w:t>
-      </w:r>
-      <w:r>
-        <w:rPr>
-          <w:rFonts w:ascii="Times New Roman" w:hAnsi="Times New Roman"/>
-          <w:sz w:val="22"/>
-          <w:szCs w:val="22"/>
-        </w:rPr>
-        <w:t>and poli</w:t>
-      </w:r>
-      <w:r>
-        <w:rPr>
-          <w:rFonts w:ascii="Times New Roman" w:hAnsi="Times New Roman"/>
-          <w:sz w:val="22"/>
-          <w:szCs w:val="22"/>
-        </w:rPr>
-        <w:t>c</w:t>
-      </w:r>
-      <w:r>
-        <w:rPr>
-          <w:rFonts w:ascii="Times New Roman" w:hAnsi="Times New Roman"/>
-          <w:sz w:val="22"/>
-          <w:szCs w:val="22"/>
-        </w:rPr>
-        <w:t>y relating to higher education financing.</w:t>
+        <w:t>: Proficient in R, Python, SQL, Tableau, Power BI, SPSS, and JAMOVI for data management and analysis.</w:t>
       </w:r>
     </w:p>
     <w:p>
@@ -617,31 +673,30 @@
         <w:pStyle w:val="ListParagraph"/>
         <w:numPr>
           <w:ilvl w:val="0"/>
-          <w:numId w:val="16"/>
+          <w:numId w:val="21"/>
         </w:numPr>
-        <w:spacing w:after="80" w:line="240" w:lineRule="auto"/>
-        <w:contextualSpacing w:val="0"/>
+        <w:spacing w:after="0" w:line="240" w:lineRule="auto"/>
+        <w:rPr>
+          <w:rFonts w:ascii="Times New Roman" w:hAnsi="Times New Roman" w:cs="Times New Roman"/>
+        </w:rPr>
+      </w:pPr>
+      <w:r>
         <w:rPr>
           <w:rFonts w:ascii="Times New Roman" w:hAnsi="Times New Roman"/>
-          <w:sz w:val="22"/>
-          <w:szCs w:val="22"/>
-        </w:rPr>
-      </w:pPr>
+          <w:b/>
+          <w:bCs/>
+          <w:sz w:val="22"/>
+          <w:szCs w:val="22"/>
+        </w:rPr>
+        <w:t>Survey &amp; Data Systems</w:t>
+      </w:r>
       <w:r>
         <w:rPr>
           <w:rFonts w:ascii="Times New Roman" w:hAnsi="Times New Roman"/>
           <w:sz w:val="22"/>
           <w:szCs w:val="22"/>
         </w:rPr>
-        <w:t>Quantitative and qualitative research design and analysis, including multilevel modeling</w:t>
-      </w:r>
-      <w:r>
-        <w:rPr>
-          <w:rFonts w:ascii="Times New Roman" w:hAnsi="Times New Roman"/>
-          <w:sz w:val="22"/>
-          <w:szCs w:val="22"/>
-        </w:rPr>
-        <w:t xml:space="preserve"> in educational settings.</w:t>
+        <w:t>: Skilled in Qualtrics, KoBo Toolbox, CSPro, and large-scale educational datasets such as NPSAS and IPEDS.</w:t>
       </w:r>
     </w:p>
     <w:p>
@@ -649,23 +704,78 @@
         <w:pStyle w:val="ListParagraph"/>
         <w:numPr>
           <w:ilvl w:val="0"/>
-          <w:numId w:val="16"/>
+          <w:numId w:val="21"/>
         </w:numPr>
         <w:spacing w:after="0" w:line="240" w:lineRule="auto"/>
-        <w:contextualSpacing w:val="0"/>
+        <w:rPr>
+          <w:rFonts w:ascii="Times New Roman" w:hAnsi="Times New Roman" w:cs="Times New Roman"/>
+        </w:rPr>
+      </w:pPr>
+      <w:r>
         <w:rPr>
           <w:rFonts w:ascii="Times New Roman" w:hAnsi="Times New Roman"/>
-          <w:sz w:val="22"/>
-          <w:szCs w:val="22"/>
-        </w:rPr>
-      </w:pPr>
+          <w:b/>
+          <w:bCs/>
+          <w:sz w:val="22"/>
+          <w:szCs w:val="22"/>
+        </w:rPr>
+        <w:t>Productivity &amp; Learning Platforms</w:t>
+      </w:r>
       <w:r>
         <w:rPr>
           <w:rFonts w:ascii="Times New Roman" w:hAnsi="Times New Roman"/>
           <w:sz w:val="22"/>
           <w:szCs w:val="22"/>
         </w:rPr>
-        <w:t>Application of machine learning and deep learning to explore patterns and outcomes in educational data.</w:t>
+        <w:t>: Experienced with MS Office 365</w:t>
+      </w:r>
+      <w:r>
+        <w:rPr>
+          <w:rFonts w:ascii="Times New Roman" w:hAnsi="Times New Roman"/>
+          <w:sz w:val="22"/>
+          <w:szCs w:val="22"/>
+        </w:rPr>
+        <w:t xml:space="preserve"> suite</w:t>
+      </w:r>
+      <w:r>
+        <w:rPr>
+          <w:rFonts w:ascii="Times New Roman" w:hAnsi="Times New Roman"/>
+          <w:sz w:val="22"/>
+          <w:szCs w:val="22"/>
+        </w:rPr>
+        <w:t xml:space="preserve">, Google Workspace, </w:t>
+      </w:r>
+      <w:r>
+        <w:rPr>
+          <w:rFonts w:ascii="Times New Roman" w:hAnsi="Times New Roman"/>
+          <w:sz w:val="22"/>
+          <w:szCs w:val="22"/>
+        </w:rPr>
+        <w:t>LMS (</w:t>
+      </w:r>
+      <w:r>
+        <w:rPr>
+          <w:rFonts w:ascii="Times New Roman" w:hAnsi="Times New Roman"/>
+          <w:sz w:val="22"/>
+          <w:szCs w:val="22"/>
+        </w:rPr>
+        <w:t>Canvas, and Blackboard</w:t>
+      </w:r>
+      <w:r>
+        <w:rPr>
+          <w:rFonts w:ascii="Times New Roman" w:hAnsi="Times New Roman"/>
+          <w:sz w:val="22"/>
+          <w:szCs w:val="22"/>
+        </w:rPr>
+        <w:t>)</w:t>
+      </w:r>
+      <w:r>
+        <w:rPr>
+          <w:rFonts w:ascii="Times New Roman" w:hAnsi="Times New Roman"/>
+          <w:sz w:val="22"/>
+          <w:szCs w:val="22"/>
+        </w:rPr>
+        <w:t>.</w:t>
       </w:r>
     </w:p>
     <w:p>
@@ -676,8 +786,6 @@
         <w:spacing w:after="0" w:line="240" w:lineRule="auto"/>
         <w:rPr>
           <w:rFonts w:ascii="Times New Roman" w:hAnsi="Times New Roman" w:cs="Times New Roman"/>
-          <w:b/>
-          <w:bCs/>
         </w:rPr>
       </w:pPr>
     </w:p>
@@ -867,7 +975,25 @@
           <w:sz w:val="22"/>
           <w:szCs w:val="22"/>
         </w:rPr>
-        <w:t>Coordinated program activities and provided administrative support for 22 Charles Butt Scholarship recipients at Texas A&amp;M University–Corpus Christi.</w:t>
+        <w:t>Coordinated program activities and provided a</w:t>
+      </w:r>
+      <w:r>
+        <w:rPr>
+          <w:rFonts w:ascii="Times New Roman" w:hAnsi="Times New Roman" w:cs="Times New Roman"/>
+          <w:color w:val="000000" w:themeColor="text1"/>
+          <w:sz w:val="22"/>
+          <w:szCs w:val="22"/>
+        </w:rPr>
+        <w:t>dministrative</w:t>
+      </w:r>
+      <w:r>
+        <w:rPr>
+          <w:rFonts w:ascii="Times New Roman" w:hAnsi="Times New Roman" w:cs="Times New Roman"/>
+          <w:color w:val="000000" w:themeColor="text1"/>
+          <w:sz w:val="22"/>
+          <w:szCs w:val="22"/>
+        </w:rPr>
+        <w:t xml:space="preserve"> support for 22 Charles Butt Scholarship recipients at Texas A&amp;M University–Corpus Christi.</w:t>
       </w:r>
     </w:p>
     <w:p>
@@ -1130,7 +1256,39 @@
           <w:sz w:val="22"/>
           <w:szCs w:val="22"/>
         </w:rPr>
-        <w:t>Maintained student records and ensured compliance with Texas Education Agency (TEA) standards for audit reporting.</w:t>
+        <w:t xml:space="preserve">Oversaw </w:t>
+      </w:r>
+      <w:r>
+        <w:rPr>
+          <w:rFonts w:ascii="Times New Roman" w:hAnsi="Times New Roman" w:cs="Times New Roman"/>
+          <w:sz w:val="22"/>
+          <w:szCs w:val="22"/>
+        </w:rPr>
+        <w:t>to ensure</w:t>
+      </w:r>
+      <w:r>
+        <w:rPr>
+          <w:rFonts w:ascii="Times New Roman" w:hAnsi="Times New Roman" w:cs="Times New Roman"/>
+          <w:sz w:val="22"/>
+          <w:szCs w:val="22"/>
+        </w:rPr>
+        <w:t xml:space="preserve"> program compliance and accountability for about 80 principalship students in alignment with TEA standards</w:t>
+      </w:r>
+      <w:r>
+        <w:rPr>
+          <w:rFonts w:ascii="Times New Roman" w:hAnsi="Times New Roman" w:cs="Times New Roman"/>
+          <w:sz w:val="22"/>
+          <w:szCs w:val="22"/>
+        </w:rPr>
+        <w:t xml:space="preserve"> and audit requirements</w:t>
+      </w:r>
+      <w:r>
+        <w:rPr>
+          <w:rFonts w:ascii="Times New Roman" w:hAnsi="Times New Roman" w:cs="Times New Roman"/>
+          <w:sz w:val="22"/>
+          <w:szCs w:val="22"/>
+        </w:rPr>
+        <w:t xml:space="preserve">. </w:t>
       </w:r>
     </w:p>
     <w:p>
@@ -1155,6 +1313,7 @@
           <w:sz w:val="22"/>
           <w:szCs w:val="22"/>
         </w:rPr>
+        <w:lastRenderedPageBreak/>
         <w:t>Assisted faculty with research on teaching and learning, including literature review, data analysis, and manuscript preparation.</w:t>
       </w:r>
     </w:p>
@@ -1195,6 +1354,176 @@
           <w:szCs w:val="22"/>
         </w:rPr>
       </w:pPr>
+      <w:r>
+        <w:rPr>
+          <w:rFonts w:ascii="Times New Roman" w:hAnsi="Times New Roman" w:cs="Times New Roman"/>
+          <w:b/>
+          <w:bCs/>
+          <w:sz w:val="22"/>
+          <w:szCs w:val="22"/>
+        </w:rPr>
+        <w:t>Sr. Market System Analyst</w:t>
+      </w:r>
+    </w:p>
+    <w:p>
+      <w:pPr>
+        <w:tabs>
+          <w:tab w:val="right" w:pos="9360"/>
+        </w:tabs>
+        <w:spacing w:after="120" w:line="240" w:lineRule="auto"/>
+        <w:ind w:left="-86" w:firstLine="446"/>
+        <w:rPr>
+          <w:rFonts w:ascii="Times New Roman" w:hAnsi="Times New Roman" w:cs="Times New Roman"/>
+          <w:sz w:val="22"/>
+          <w:szCs w:val="22"/>
+        </w:rPr>
+      </w:pPr>
+      <w:r>
+        <w:rPr>
+          <w:rFonts w:ascii="Times New Roman" w:hAnsi="Times New Roman" w:cs="Times New Roman"/>
+          <w:i/>
+          <w:iCs/>
+          <w:sz w:val="22"/>
+          <w:szCs w:val="22"/>
+        </w:rPr>
+        <w:t>J.E. Austin Associates Inc., Virginia, USA (remote)</w:t>
+      </w:r>
+      <w:r>
+        <w:rPr>
+          <w:rFonts w:ascii="Times New Roman" w:hAnsi="Times New Roman" w:cs="Times New Roman"/>
+          <w:sz w:val="22"/>
+          <w:szCs w:val="22"/>
+        </w:rPr>
+        <w:t xml:space="preserve"> </w:t>
+      </w:r>
+      <w:r>
+        <w:rPr>
+          <w:rFonts w:ascii="Times New Roman" w:hAnsi="Times New Roman" w:cs="Times New Roman"/>
+          <w:sz w:val="22"/>
+          <w:szCs w:val="22"/>
+        </w:rPr>
+        <w:tab/>
+        <w:t>June 2022–July 2022</w:t>
+      </w:r>
+    </w:p>
+    <w:p>
+      <w:pPr>
+        <w:pStyle w:val="ListParagraph"/>
+        <w:numPr>
+          <w:ilvl w:val="0"/>
+          <w:numId w:val="1"/>
+        </w:numPr>
+        <w:spacing w:after="80" w:line="240" w:lineRule="auto"/>
+        <w:contextualSpacing w:val="0"/>
+        <w:rPr>
+          <w:rFonts w:ascii="Times New Roman" w:hAnsi="Times New Roman" w:cs="Times New Roman"/>
+          <w:sz w:val="22"/>
+          <w:szCs w:val="22"/>
+        </w:rPr>
+      </w:pPr>
+      <w:r>
+        <w:rPr>
+          <w:rFonts w:ascii="Times New Roman" w:hAnsi="Times New Roman" w:cs="Times New Roman"/>
+          <w:sz w:val="22"/>
+          <w:szCs w:val="22"/>
+        </w:rPr>
+        <w:t>Designed the methodology and work plan for assessing agriculture value chains</w:t>
+      </w:r>
+      <w:r>
+        <w:rPr>
+          <w:rFonts w:ascii="Times New Roman" w:hAnsi="Times New Roman" w:cs="Times New Roman"/>
+          <w:sz w:val="22"/>
+          <w:szCs w:val="22"/>
+        </w:rPr>
+        <w:t xml:space="preserve"> of </w:t>
+      </w:r>
+      <w:r>
+        <w:rPr>
+          <w:rFonts w:ascii="Times New Roman" w:hAnsi="Times New Roman" w:cs="Times New Roman"/>
+          <w:sz w:val="22"/>
+          <w:szCs w:val="22"/>
+        </w:rPr>
+        <w:t>cardamom, ginger, and lentil</w:t>
+      </w:r>
+      <w:r>
+        <w:rPr>
+          <w:rFonts w:ascii="Times New Roman" w:hAnsi="Times New Roman" w:cs="Times New Roman"/>
+          <w:sz w:val="22"/>
+          <w:szCs w:val="22"/>
+        </w:rPr>
+        <w:t xml:space="preserve">, </w:t>
+      </w:r>
+      <w:r>
+        <w:rPr>
+          <w:rFonts w:ascii="Times New Roman" w:hAnsi="Times New Roman" w:cs="Times New Roman"/>
+          <w:sz w:val="22"/>
+          <w:szCs w:val="22"/>
+        </w:rPr>
+        <w:t>emphasizing policy review, market access, and Agri-finance.</w:t>
+      </w:r>
+    </w:p>
+    <w:p>
+      <w:pPr>
+        <w:pStyle w:val="ListParagraph"/>
+        <w:numPr>
+          <w:ilvl w:val="0"/>
+          <w:numId w:val="1"/>
+        </w:numPr>
+        <w:spacing w:after="80" w:line="240" w:lineRule="auto"/>
+        <w:contextualSpacing w:val="0"/>
+        <w:rPr>
+          <w:rFonts w:ascii="Times New Roman" w:hAnsi="Times New Roman" w:cs="Times New Roman"/>
+          <w:sz w:val="22"/>
+          <w:szCs w:val="22"/>
+        </w:rPr>
+      </w:pPr>
+      <w:r>
+        <w:rPr>
+          <w:rFonts w:ascii="Times New Roman" w:hAnsi="Times New Roman" w:cs="Times New Roman"/>
+          <w:sz w:val="22"/>
+          <w:szCs w:val="22"/>
+        </w:rPr>
+        <w:t xml:space="preserve">Led stakeholder consultations with agribusinesses, chambers of commerce, </w:t>
+      </w:r>
+      <w:r>
+        <w:rPr>
+          <w:rFonts w:ascii="Times New Roman" w:hAnsi="Times New Roman" w:cs="Times New Roman"/>
+          <w:sz w:val="22"/>
+          <w:szCs w:val="22"/>
+        </w:rPr>
+        <w:t>and policymakers, identifying systemic constraints and analyzing</w:t>
+      </w:r>
+      <w:r>
+        <w:rPr>
+          <w:rFonts w:ascii="Times New Roman" w:hAnsi="Times New Roman" w:cs="Times New Roman"/>
+          <w:sz w:val="22"/>
+          <w:szCs w:val="22"/>
+        </w:rPr>
+        <w:t xml:space="preserve"> financial linkages in the Agri-finance ecosystem.</w:t>
+      </w:r>
+    </w:p>
+    <w:p>
+      <w:pPr>
+        <w:pStyle w:val="ListParagraph"/>
+        <w:numPr>
+          <w:ilvl w:val="0"/>
+          <w:numId w:val="1"/>
+        </w:numPr>
+        <w:spacing w:after="0" w:line="240" w:lineRule="auto"/>
+        <w:rPr>
+          <w:rFonts w:ascii="Times New Roman" w:hAnsi="Times New Roman" w:cs="Times New Roman"/>
+          <w:sz w:val="22"/>
+          <w:szCs w:val="22"/>
+        </w:rPr>
+      </w:pPr>
+      <w:r>
+        <w:rPr>
+          <w:rFonts w:ascii="Times New Roman" w:hAnsi="Times New Roman" w:cs="Times New Roman"/>
+          <w:sz w:val="22"/>
+          <w:szCs w:val="22"/>
+        </w:rPr>
+        <w:t>Contributed to the Agriculture Market Systems Assessment report and coordinated progress tracking with the principal investigator on value chain and Agri-finance development.</w:t>
+      </w:r>
     </w:p>
     <w:p>
       <w:pPr>
@@ -1208,7 +1537,11 @@
           <w:szCs w:val="22"/>
         </w:rPr>
       </w:pPr>
-      <w:r>
+    </w:p>
+    <w:p>
+      <w:pPr>
+        <w:spacing w:after="0" w:line="240" w:lineRule="auto"/>
+        <w:ind w:left="-86" w:firstLine="446"/>
         <w:rPr>
           <w:rFonts w:ascii="Times New Roman" w:hAnsi="Times New Roman" w:cs="Times New Roman"/>
           <w:b/>
@@ -1216,7 +1549,15 @@
           <w:sz w:val="22"/>
           <w:szCs w:val="22"/>
         </w:rPr>
-        <w:lastRenderedPageBreak/>
+      </w:pPr>
+      <w:r>
+        <w:rPr>
+          <w:rFonts w:ascii="Times New Roman" w:hAnsi="Times New Roman" w:cs="Times New Roman"/>
+          <w:b/>
+          <w:bCs/>
+          <w:sz w:val="22"/>
+          <w:szCs w:val="22"/>
+        </w:rPr>
         <w:t>Sr. Monitoring &amp; Evaluation Specialist</w:t>
       </w:r>
     </w:p>
@@ -1852,7 +2193,15 @@
           <w:sz w:val="22"/>
           <w:szCs w:val="22"/>
         </w:rPr>
-        <w:t>Design research projects on inclusive education, equity, and child rights; conducted desk review and developed interview guides and survey instruments.</w:t>
+        <w:t>Designed</w:t>
+      </w:r>
+      <w:r>
+        <w:rPr>
+          <w:rFonts w:ascii="Times New Roman" w:hAnsi="Times New Roman" w:cs="Times New Roman"/>
+          <w:sz w:val="22"/>
+          <w:szCs w:val="22"/>
+        </w:rPr>
+        <w:t xml:space="preserve"> research projects on inclusive education, equity, and child rights; conducted desk review and developed interview guides and survey instruments.</w:t>
       </w:r>
     </w:p>
     <w:p>
@@ -1902,6 +2251,7 @@
           <w:sz w:val="22"/>
           <w:szCs w:val="22"/>
         </w:rPr>
+        <w:lastRenderedPageBreak/>
         <w:t>Drafted, edited research reports, facilitated team coordination, and managed stakeholder communications throughout the project cycle.</w:t>
       </w:r>
     </w:p>
@@ -2206,7 +2556,6 @@
           <w:sz w:val="22"/>
           <w:szCs w:val="22"/>
         </w:rPr>
-        <w:lastRenderedPageBreak/>
         <w:t>Co-l</w:t>
       </w:r>
       <w:r>
@@ -2321,6 +2670,8 @@
           <w:rFonts w:ascii="Times New Roman" w:hAnsi="Times New Roman" w:cs="Times New Roman"/>
           <w:b/>
           <w:bCs/>
+          <w:sz w:val="22"/>
+          <w:szCs w:val="22"/>
         </w:rPr>
       </w:pPr>
       <w:r>
@@ -2328,32 +2679,10 @@
           <w:rFonts w:ascii="Times New Roman" w:hAnsi="Times New Roman" w:cs="Times New Roman"/>
           <w:b/>
           <w:bCs/>
-        </w:rPr>
-        <w:t>Journal</w:t>
-      </w:r>
-      <w:r>
-        <w:rPr>
-          <w:rFonts w:ascii="Times New Roman" w:hAnsi="Times New Roman" w:cs="Times New Roman"/>
-          <w:b/>
-          <w:bCs/>
-        </w:rPr>
-        <w:t xml:space="preserve"> Edit</w:t>
-      </w:r>
-      <w:r>
-        <w:rPr>
-          <w:rFonts w:ascii="Times New Roman" w:hAnsi="Times New Roman" w:cs="Times New Roman"/>
-          <w:b/>
-          <w:bCs/>
-        </w:rPr>
-        <w:t>or</w:t>
-      </w:r>
-      <w:r>
-        <w:rPr>
-          <w:rFonts w:ascii="Times New Roman" w:hAnsi="Times New Roman" w:cs="Times New Roman"/>
-          <w:b/>
-          <w:bCs/>
-        </w:rPr>
-        <w:t xml:space="preserve"> (Peer-reviewed)</w:t>
+          <w:sz w:val="22"/>
+          <w:szCs w:val="22"/>
+        </w:rPr>
+        <w:t>Manuscripts in Preparation</w:t>
       </w:r>
     </w:p>
     <w:p>
@@ -2362,135 +2691,140 @@
         <w:ind w:left="1440" w:hanging="720"/>
         <w:rPr>
           <w:rFonts w:ascii="Times New Roman" w:hAnsi="Times New Roman" w:cs="Times New Roman"/>
+          <w:sz w:val="22"/>
+          <w:szCs w:val="22"/>
+        </w:rPr>
+      </w:pPr>
+      <w:r>
+        <w:rPr>
+          <w:rFonts w:ascii="Times New Roman" w:hAnsi="Times New Roman" w:cs="Times New Roman"/>
           <w:b/>
           <w:bCs/>
-        </w:rPr>
-      </w:pPr>
-      <w:r>
-        <w:rPr>
-          <w:rFonts w:ascii="Times New Roman" w:hAnsi="Times New Roman" w:cs="Times New Roman"/>
-          <w:sz w:val="22"/>
-          <w:szCs w:val="22"/>
-        </w:rPr>
-        <w:t xml:space="preserve">Maxwell, G., Lara, D., Benedetti, C., Elliff, D. S., Salunke, V., </w:t>
-      </w:r>
-      <w:r>
-        <w:rPr>
-          <w:rFonts w:ascii="Times New Roman" w:hAnsi="Times New Roman" w:cs="Times New Roman"/>
-          <w:b/>
-          <w:sz w:val="22"/>
-          <w:szCs w:val="22"/>
-        </w:rPr>
-        <w:t>Luitel, B.</w:t>
-      </w:r>
-      <w:r>
-        <w:rPr>
-          <w:rFonts w:ascii="Times New Roman" w:hAnsi="Times New Roman" w:cs="Times New Roman"/>
-          <w:sz w:val="22"/>
-          <w:szCs w:val="22"/>
-        </w:rPr>
-        <w:t xml:space="preserve">, Mejia, A. (Eds.). (2023). </w:t>
-      </w:r>
-      <w:r>
-        <w:rPr>
-          <w:rFonts w:ascii="Times New Roman" w:hAnsi="Times New Roman" w:cs="Times New Roman"/>
-          <w:i/>
-          <w:sz w:val="22"/>
-          <w:szCs w:val="22"/>
-        </w:rPr>
-        <w:t>Las voces nuevas: Emerging scholarship on Latinas in leadership</w:t>
-      </w:r>
-      <w:r>
-        <w:rPr>
-          <w:rFonts w:ascii="Times New Roman" w:hAnsi="Times New Roman" w:cs="Times New Roman"/>
-          <w:sz w:val="22"/>
-          <w:szCs w:val="22"/>
-        </w:rPr>
-        <w:t xml:space="preserve">. </w:t>
-      </w:r>
-      <w:r>
-        <w:rPr>
-          <w:rFonts w:ascii="Times New Roman" w:hAnsi="Times New Roman" w:cs="Times New Roman"/>
-          <w:sz w:val="22"/>
-          <w:szCs w:val="22"/>
-        </w:rPr>
-        <w:t>Consortium for Educational Development, Evaluation and Research</w:t>
-      </w:r>
-      <w:r>
-        <w:rPr>
-          <w:rFonts w:ascii="Times New Roman" w:hAnsi="Times New Roman" w:cs="Times New Roman"/>
-          <w:sz w:val="22"/>
-          <w:szCs w:val="22"/>
-        </w:rPr>
-        <w:t>,</w:t>
-      </w:r>
-      <w:r>
-        <w:rPr>
-          <w:rFonts w:ascii="Times New Roman" w:hAnsi="Times New Roman" w:cs="Times New Roman"/>
-          <w:spacing w:val="-5"/>
-          <w:sz w:val="22"/>
-          <w:szCs w:val="22"/>
-        </w:rPr>
-        <w:t xml:space="preserve"> </w:t>
-      </w:r>
-      <w:r>
-        <w:rPr>
-          <w:rFonts w:ascii="Times New Roman" w:hAnsi="Times New Roman" w:cs="Times New Roman"/>
-          <w:sz w:val="22"/>
-          <w:szCs w:val="22"/>
-        </w:rPr>
-        <w:t>Texas</w:t>
-      </w:r>
-      <w:r>
-        <w:rPr>
-          <w:rFonts w:ascii="Times New Roman" w:hAnsi="Times New Roman" w:cs="Times New Roman"/>
-          <w:spacing w:val="-5"/>
-          <w:sz w:val="22"/>
-          <w:szCs w:val="22"/>
-        </w:rPr>
-        <w:t xml:space="preserve"> </w:t>
-      </w:r>
-      <w:r>
-        <w:rPr>
-          <w:rFonts w:ascii="Times New Roman" w:hAnsi="Times New Roman" w:cs="Times New Roman"/>
-          <w:sz w:val="22"/>
-          <w:szCs w:val="22"/>
-        </w:rPr>
-        <w:t>A&amp;M</w:t>
-      </w:r>
-      <w:r>
-        <w:rPr>
-          <w:rFonts w:ascii="Times New Roman" w:hAnsi="Times New Roman" w:cs="Times New Roman"/>
-          <w:spacing w:val="-6"/>
-          <w:sz w:val="22"/>
-          <w:szCs w:val="22"/>
-        </w:rPr>
-        <w:t xml:space="preserve"> </w:t>
-      </w:r>
-      <w:r>
-        <w:rPr>
-          <w:rFonts w:ascii="Times New Roman" w:hAnsi="Times New Roman" w:cs="Times New Roman"/>
-          <w:sz w:val="22"/>
-          <w:szCs w:val="22"/>
-        </w:rPr>
-        <w:t>University-Corpus</w:t>
-      </w:r>
-      <w:r>
-        <w:rPr>
-          <w:rFonts w:ascii="Times New Roman" w:hAnsi="Times New Roman" w:cs="Times New Roman"/>
-          <w:spacing w:val="-5"/>
-          <w:sz w:val="22"/>
-          <w:szCs w:val="22"/>
-        </w:rPr>
-        <w:t xml:space="preserve"> </w:t>
-      </w:r>
-      <w:r>
-        <w:rPr>
-          <w:rFonts w:ascii="Times New Roman" w:hAnsi="Times New Roman" w:cs="Times New Roman"/>
-          <w:sz w:val="22"/>
-          <w:szCs w:val="22"/>
-        </w:rPr>
-        <w:t>Christi</w:t>
+          <w:sz w:val="22"/>
+          <w:szCs w:val="22"/>
+        </w:rPr>
+        <w:t>Luitel, B</w:t>
+      </w:r>
+      <w:r>
+        <w:rPr>
+          <w:rFonts w:ascii="Times New Roman" w:hAnsi="Times New Roman" w:cs="Times New Roman"/>
+          <w:sz w:val="22"/>
+          <w:szCs w:val="22"/>
+        </w:rPr>
+        <w:t>. (in preparation).</w:t>
+      </w:r>
+      <w:r>
+        <w:rPr>
+          <w:rFonts w:ascii="Times New Roman" w:hAnsi="Times New Roman" w:cs="Times New Roman"/>
+          <w:sz w:val="22"/>
+          <w:szCs w:val="22"/>
+        </w:rPr>
+        <w:t xml:space="preserve"> </w:t>
+      </w:r>
+      <w:r>
+        <w:rPr>
+          <w:rFonts w:ascii="Times New Roman" w:hAnsi="Times New Roman" w:cs="Times New Roman"/>
+          <w:i/>
+          <w:iCs/>
+          <w:sz w:val="22"/>
+          <w:szCs w:val="22"/>
+        </w:rPr>
+        <w:t>A Critical Review of Socioeconomic Stratification and Student Debt in U.S. Higher Education</w:t>
+      </w:r>
+      <w:r>
+        <w:rPr>
+          <w:rFonts w:ascii="Times New Roman" w:hAnsi="Times New Roman" w:cs="Times New Roman"/>
+          <w:sz w:val="22"/>
+          <w:szCs w:val="22"/>
+        </w:rPr>
+        <w:t xml:space="preserve">. Manuscript in preparation, derived from dissertation framework. </w:t>
+      </w:r>
+      <w:r>
+        <w:rPr>
+          <w:rFonts w:ascii="Times New Roman" w:hAnsi="Times New Roman" w:cs="Times New Roman"/>
+          <w:sz w:val="22"/>
+          <w:szCs w:val="22"/>
+        </w:rPr>
+        <w:tab/>
+      </w:r>
+    </w:p>
+    <w:p>
+      <w:pPr>
+        <w:spacing w:after="120" w:line="240" w:lineRule="auto"/>
+        <w:ind w:left="1440" w:hanging="720"/>
+        <w:rPr>
+          <w:rFonts w:ascii="Times New Roman" w:hAnsi="Times New Roman" w:cs="Times New Roman"/>
+          <w:sz w:val="22"/>
+          <w:szCs w:val="22"/>
+        </w:rPr>
+      </w:pPr>
+      <w:r>
+        <w:rPr>
+          <w:rFonts w:ascii="Times New Roman" w:hAnsi="Times New Roman" w:cs="Times New Roman"/>
+          <w:b/>
+          <w:bCs/>
+          <w:sz w:val="22"/>
+          <w:szCs w:val="22"/>
+        </w:rPr>
+        <w:t>Luitel, B</w:t>
+      </w:r>
+      <w:r>
+        <w:rPr>
+          <w:rFonts w:ascii="Times New Roman" w:hAnsi="Times New Roman" w:cs="Times New Roman"/>
+          <w:sz w:val="22"/>
+          <w:szCs w:val="22"/>
+        </w:rPr>
+        <w:t>. (in preparation).</w:t>
+      </w:r>
+      <w:r>
+        <w:rPr>
+          <w:rFonts w:ascii="Times New Roman" w:hAnsi="Times New Roman" w:cs="Times New Roman"/>
+          <w:sz w:val="22"/>
+          <w:szCs w:val="22"/>
+        </w:rPr>
+        <w:t xml:space="preserve"> </w:t>
+      </w:r>
+      <w:r>
+        <w:rPr>
+          <w:rFonts w:ascii="Times New Roman" w:hAnsi="Times New Roman" w:cs="Times New Roman"/>
+          <w:i/>
+          <w:iCs/>
+          <w:sz w:val="22"/>
+          <w:szCs w:val="22"/>
+        </w:rPr>
+        <w:t>Socioeconomic Inequalities in Undergraduate Borrowing: A Hierarchical Linear Model of Student Debt</w:t>
+      </w:r>
+      <w:r>
+        <w:rPr>
+          <w:rFonts w:ascii="Times New Roman" w:hAnsi="Times New Roman" w:cs="Times New Roman"/>
+          <w:sz w:val="22"/>
+          <w:szCs w:val="22"/>
+        </w:rPr>
+        <w:t>.</w:t>
+      </w:r>
+      <w:r>
+        <w:rPr>
+          <w:rFonts w:ascii="Times New Roman" w:hAnsi="Times New Roman" w:cs="Times New Roman"/>
+          <w:sz w:val="22"/>
+          <w:szCs w:val="22"/>
+        </w:rPr>
+        <w:t xml:space="preserve"> </w:t>
+      </w:r>
+      <w:r>
+        <w:rPr>
+          <w:rFonts w:ascii="Times New Roman" w:hAnsi="Times New Roman" w:cs="Times New Roman"/>
+          <w:sz w:val="22"/>
+          <w:szCs w:val="22"/>
+        </w:rPr>
+        <w:t>Manuscript in preparation, based on dissertation research.</w:t>
+      </w:r>
+      <w:r>
+        <w:rPr>
+          <w:rFonts w:ascii="Times New Roman" w:hAnsi="Times New Roman" w:cs="Times New Roman"/>
+          <w:sz w:val="22"/>
+          <w:szCs w:val="22"/>
+        </w:rPr>
+        <w:tab/>
       </w:r>
     </w:p>
     <w:p>
@@ -2501,6 +2835,8 @@
           <w:rFonts w:ascii="Times New Roman" w:hAnsi="Times New Roman" w:cs="Times New Roman"/>
           <w:b/>
           <w:bCs/>
+          <w:sz w:val="22"/>
+          <w:szCs w:val="22"/>
         </w:rPr>
       </w:pPr>
       <w:r>
@@ -2508,16 +2844,40 @@
           <w:rFonts w:ascii="Times New Roman" w:hAnsi="Times New Roman" w:cs="Times New Roman"/>
           <w:b/>
           <w:bCs/>
-        </w:rPr>
-        <w:t>Book</w:t>
+          <w:sz w:val="22"/>
+          <w:szCs w:val="22"/>
+        </w:rPr>
+        <w:t>Journal</w:t>
       </w:r>
       <w:r>
         <w:rPr>
           <w:rFonts w:ascii="Times New Roman" w:hAnsi="Times New Roman" w:cs="Times New Roman"/>
           <w:b/>
           <w:bCs/>
-        </w:rPr>
-        <w:t xml:space="preserve"> Author</w:t>
+          <w:sz w:val="22"/>
+          <w:szCs w:val="22"/>
+        </w:rPr>
+        <w:t xml:space="preserve"> Edit</w:t>
+      </w:r>
+      <w:r>
+        <w:rPr>
+          <w:rFonts w:ascii="Times New Roman" w:hAnsi="Times New Roman" w:cs="Times New Roman"/>
+          <w:b/>
+          <w:bCs/>
+          <w:sz w:val="22"/>
+          <w:szCs w:val="22"/>
+        </w:rPr>
+        <w:t>or</w:t>
+      </w:r>
+      <w:r>
+        <w:rPr>
+          <w:rFonts w:ascii="Times New Roman" w:hAnsi="Times New Roman" w:cs="Times New Roman"/>
+          <w:b/>
+          <w:bCs/>
+          <w:sz w:val="22"/>
+          <w:szCs w:val="22"/>
+        </w:rPr>
+        <w:t xml:space="preserve"> (Peer-reviewed)</w:t>
       </w:r>
     </w:p>
     <w:p>
@@ -2526,10 +2886,20 @@
         <w:ind w:left="1440" w:hanging="720"/>
         <w:rPr>
           <w:rFonts w:ascii="Times New Roman" w:hAnsi="Times New Roman" w:cs="Times New Roman"/>
-          <w:sz w:val="22"/>
-          <w:szCs w:val="22"/>
-        </w:rPr>
-      </w:pPr>
+          <w:b/>
+          <w:bCs/>
+          <w:sz w:val="22"/>
+          <w:szCs w:val="22"/>
+        </w:rPr>
+      </w:pPr>
+      <w:r>
+        <w:rPr>
+          <w:rFonts w:ascii="Times New Roman" w:hAnsi="Times New Roman" w:cs="Times New Roman"/>
+          <w:sz w:val="22"/>
+          <w:szCs w:val="22"/>
+        </w:rPr>
+        <w:t xml:space="preserve">Maxwell, G., Lara, D., Benedetti, C., Elliff, D. S., Salunke, V., </w:t>
+      </w:r>
       <w:r>
         <w:rPr>
           <w:rFonts w:ascii="Times New Roman" w:hAnsi="Times New Roman" w:cs="Times New Roman"/>
@@ -2545,75 +2915,40 @@
           <w:sz w:val="22"/>
           <w:szCs w:val="22"/>
         </w:rPr>
-        <w:t xml:space="preserve">, &amp; Gurung, P. (2021). </w:t>
-      </w:r>
-      <w:r>
-        <w:rPr>
-          <w:rFonts w:ascii="Times New Roman" w:hAnsi="Times New Roman" w:cs="Times New Roman"/>
-          <w:i/>
-          <w:sz w:val="22"/>
-          <w:szCs w:val="22"/>
-        </w:rPr>
-        <w:t xml:space="preserve">Interim impact assessment of COVID-19 to underrepresented (Indigenous, Dalit, and Madheshi) people with disabilities in Nepal. </w:t>
-      </w:r>
-      <w:r>
-        <w:rPr>
-          <w:rFonts w:ascii="Times New Roman" w:hAnsi="Times New Roman" w:cs="Times New Roman"/>
-          <w:sz w:val="22"/>
-          <w:szCs w:val="22"/>
-        </w:rPr>
-        <w:t>National Indigenous Disabled</w:t>
-      </w:r>
-      <w:r>
-        <w:rPr>
-          <w:rFonts w:ascii="Times New Roman" w:hAnsi="Times New Roman" w:cs="Times New Roman"/>
-          <w:spacing w:val="-3"/>
-          <w:sz w:val="22"/>
-          <w:szCs w:val="22"/>
-        </w:rPr>
-        <w:t xml:space="preserve"> </w:t>
-      </w:r>
-      <w:r>
-        <w:rPr>
-          <w:rFonts w:ascii="Times New Roman" w:hAnsi="Times New Roman" w:cs="Times New Roman"/>
-          <w:sz w:val="22"/>
-          <w:szCs w:val="22"/>
-        </w:rPr>
-        <w:t>Women</w:t>
-      </w:r>
-      <w:r>
-        <w:rPr>
-          <w:rFonts w:ascii="Times New Roman" w:hAnsi="Times New Roman" w:cs="Times New Roman"/>
-          <w:spacing w:val="-9"/>
-          <w:sz w:val="22"/>
-          <w:szCs w:val="22"/>
-        </w:rPr>
-        <w:t xml:space="preserve"> </w:t>
-      </w:r>
-      <w:r>
-        <w:rPr>
-          <w:rFonts w:ascii="Times New Roman" w:hAnsi="Times New Roman" w:cs="Times New Roman"/>
-          <w:sz w:val="22"/>
-          <w:szCs w:val="22"/>
-        </w:rPr>
-        <w:t>Association</w:t>
-      </w:r>
-      <w:r>
-        <w:rPr>
-          <w:rFonts w:ascii="Times New Roman" w:hAnsi="Times New Roman" w:cs="Times New Roman"/>
-          <w:spacing w:val="-3"/>
-          <w:sz w:val="22"/>
-          <w:szCs w:val="22"/>
-        </w:rPr>
-        <w:t xml:space="preserve"> </w:t>
-      </w:r>
-      <w:r>
-        <w:rPr>
-          <w:rFonts w:ascii="Times New Roman" w:hAnsi="Times New Roman" w:cs="Times New Roman"/>
-          <w:sz w:val="22"/>
-          <w:szCs w:val="22"/>
-        </w:rPr>
-        <w:t>Nepal</w:t>
+        <w:t xml:space="preserve">, Mejia, A. (Eds.). (2023). </w:t>
+      </w:r>
+      <w:r>
+        <w:rPr>
+          <w:rFonts w:ascii="Times New Roman" w:hAnsi="Times New Roman" w:cs="Times New Roman"/>
+          <w:i/>
+          <w:sz w:val="22"/>
+          <w:szCs w:val="22"/>
+        </w:rPr>
+        <w:t>Las voces nuevas: Emerging scholarship on Latinas in leadership</w:t>
+      </w:r>
+      <w:r>
+        <w:rPr>
+          <w:rFonts w:ascii="Times New Roman" w:hAnsi="Times New Roman" w:cs="Times New Roman"/>
+          <w:sz w:val="22"/>
+          <w:szCs w:val="22"/>
+        </w:rPr>
+        <w:t xml:space="preserve">. </w:t>
+      </w:r>
+      <w:r>
+        <w:rPr>
+          <w:rFonts w:ascii="Times New Roman" w:hAnsi="Times New Roman" w:cs="Times New Roman"/>
+          <w:sz w:val="22"/>
+          <w:szCs w:val="22"/>
+        </w:rPr>
+        <w:t>Consortium for Educational Development, Evaluation and Research</w:t>
+      </w:r>
+      <w:r>
+        <w:rPr>
+          <w:rFonts w:ascii="Times New Roman" w:hAnsi="Times New Roman" w:cs="Times New Roman"/>
+          <w:sz w:val="22"/>
+          <w:szCs w:val="22"/>
+        </w:rPr>
+        <w:t>,</w:t>
       </w:r>
       <w:r>
         <w:rPr>
@@ -2630,126 +2965,58 @@
           <w:sz w:val="22"/>
           <w:szCs w:val="22"/>
         </w:rPr>
-        <w:t>(NIDWAN),</w:t>
-      </w:r>
-      <w:r>
-        <w:rPr>
-          <w:rFonts w:ascii="Times New Roman" w:hAnsi="Times New Roman" w:cs="Times New Roman"/>
-          <w:spacing w:val="-3"/>
-          <w:sz w:val="22"/>
-          <w:szCs w:val="22"/>
-        </w:rPr>
-        <w:t xml:space="preserve"> </w:t>
-      </w:r>
-      <w:r>
-        <w:rPr>
-          <w:rFonts w:ascii="Times New Roman" w:hAnsi="Times New Roman" w:cs="Times New Roman"/>
-          <w:sz w:val="22"/>
-          <w:szCs w:val="22"/>
-        </w:rPr>
-        <w:t>United</w:t>
-      </w:r>
-      <w:r>
-        <w:rPr>
-          <w:rFonts w:ascii="Times New Roman" w:hAnsi="Times New Roman" w:cs="Times New Roman"/>
-          <w:spacing w:val="-9"/>
-          <w:sz w:val="22"/>
-          <w:szCs w:val="22"/>
-        </w:rPr>
-        <w:t xml:space="preserve"> </w:t>
-      </w:r>
-      <w:r>
-        <w:rPr>
-          <w:rFonts w:ascii="Times New Roman" w:hAnsi="Times New Roman" w:cs="Times New Roman"/>
-          <w:sz w:val="22"/>
-          <w:szCs w:val="22"/>
-        </w:rPr>
-        <w:t>Nations</w:t>
-      </w:r>
-      <w:r>
-        <w:rPr>
-          <w:rFonts w:ascii="Times New Roman" w:hAnsi="Times New Roman" w:cs="Times New Roman"/>
-          <w:spacing w:val="-3"/>
-          <w:sz w:val="22"/>
-          <w:szCs w:val="22"/>
-        </w:rPr>
-        <w:t xml:space="preserve"> </w:t>
-      </w:r>
-      <w:r>
-        <w:rPr>
-          <w:rFonts w:ascii="Times New Roman" w:hAnsi="Times New Roman" w:cs="Times New Roman"/>
-          <w:sz w:val="22"/>
-          <w:szCs w:val="22"/>
-        </w:rPr>
-        <w:t>Partnership</w:t>
-      </w:r>
-      <w:r>
-        <w:rPr>
-          <w:rFonts w:ascii="Times New Roman" w:hAnsi="Times New Roman" w:cs="Times New Roman"/>
-          <w:spacing w:val="-3"/>
-          <w:sz w:val="22"/>
-          <w:szCs w:val="22"/>
-        </w:rPr>
-        <w:t xml:space="preserve"> </w:t>
-      </w:r>
-      <w:r>
-        <w:rPr>
-          <w:rFonts w:ascii="Times New Roman" w:hAnsi="Times New Roman" w:cs="Times New Roman"/>
-          <w:sz w:val="22"/>
-          <w:szCs w:val="22"/>
-        </w:rPr>
-        <w:t>on</w:t>
-      </w:r>
-      <w:r>
-        <w:rPr>
-          <w:rFonts w:ascii="Times New Roman" w:hAnsi="Times New Roman" w:cs="Times New Roman"/>
-          <w:spacing w:val="-3"/>
-          <w:sz w:val="22"/>
-          <w:szCs w:val="22"/>
-        </w:rPr>
-        <w:t xml:space="preserve"> </w:t>
-      </w:r>
-      <w:r>
-        <w:rPr>
-          <w:rFonts w:ascii="Times New Roman" w:hAnsi="Times New Roman" w:cs="Times New Roman"/>
-          <w:sz w:val="22"/>
-          <w:szCs w:val="22"/>
-        </w:rPr>
-        <w:t>the</w:t>
-      </w:r>
-      <w:r>
-        <w:rPr>
-          <w:rFonts w:ascii="Times New Roman" w:hAnsi="Times New Roman" w:cs="Times New Roman"/>
-          <w:spacing w:val="-1"/>
-          <w:sz w:val="22"/>
-          <w:szCs w:val="22"/>
-        </w:rPr>
-        <w:t xml:space="preserve"> </w:t>
-      </w:r>
-      <w:r>
-        <w:rPr>
-          <w:rFonts w:ascii="Times New Roman" w:hAnsi="Times New Roman" w:cs="Times New Roman"/>
-          <w:sz w:val="22"/>
-          <w:szCs w:val="22"/>
-        </w:rPr>
-        <w:t>Rights</w:t>
-      </w:r>
-      <w:r>
-        <w:rPr>
-          <w:rFonts w:ascii="Times New Roman" w:hAnsi="Times New Roman" w:cs="Times New Roman"/>
-          <w:spacing w:val="-3"/>
-          <w:sz w:val="22"/>
-          <w:szCs w:val="22"/>
-        </w:rPr>
-        <w:t xml:space="preserve"> </w:t>
-      </w:r>
-      <w:r>
-        <w:rPr>
-          <w:rFonts w:ascii="Times New Roman" w:hAnsi="Times New Roman" w:cs="Times New Roman"/>
-          <w:sz w:val="22"/>
-          <w:szCs w:val="22"/>
-        </w:rPr>
-        <w:t>of Persons with Disability (UNPRPD).</w:t>
+        <w:t>Texas</w:t>
+      </w:r>
+      <w:r>
+        <w:rPr>
+          <w:rFonts w:ascii="Times New Roman" w:hAnsi="Times New Roman" w:cs="Times New Roman"/>
+          <w:spacing w:val="-5"/>
+          <w:sz w:val="22"/>
+          <w:szCs w:val="22"/>
+        </w:rPr>
+        <w:t xml:space="preserve"> </w:t>
+      </w:r>
+      <w:r>
+        <w:rPr>
+          <w:rFonts w:ascii="Times New Roman" w:hAnsi="Times New Roman" w:cs="Times New Roman"/>
+          <w:sz w:val="22"/>
+          <w:szCs w:val="22"/>
+        </w:rPr>
+        <w:t>A&amp;M</w:t>
+      </w:r>
+      <w:r>
+        <w:rPr>
+          <w:rFonts w:ascii="Times New Roman" w:hAnsi="Times New Roman" w:cs="Times New Roman"/>
+          <w:spacing w:val="-6"/>
+          <w:sz w:val="22"/>
+          <w:szCs w:val="22"/>
+        </w:rPr>
+        <w:t xml:space="preserve"> </w:t>
+      </w:r>
+      <w:r>
+        <w:rPr>
+          <w:rFonts w:ascii="Times New Roman" w:hAnsi="Times New Roman" w:cs="Times New Roman"/>
+          <w:sz w:val="22"/>
+          <w:szCs w:val="22"/>
+        </w:rPr>
+        <w:t>University-Corpus</w:t>
+      </w:r>
+      <w:r>
+        <w:rPr>
+          <w:rFonts w:ascii="Times New Roman" w:hAnsi="Times New Roman" w:cs="Times New Roman"/>
+          <w:spacing w:val="-5"/>
+          <w:sz w:val="22"/>
+          <w:szCs w:val="22"/>
+        </w:rPr>
+        <w:t xml:space="preserve"> </w:t>
+      </w:r>
+      <w:r>
+        <w:rPr>
+          <w:rFonts w:ascii="Times New Roman" w:hAnsi="Times New Roman" w:cs="Times New Roman"/>
+          <w:sz w:val="22"/>
+          <w:szCs w:val="22"/>
+        </w:rPr>
+        <w:t>Christi</w:t>
       </w:r>
     </w:p>
     <w:p>
@@ -2772,6 +3039,271 @@
           <w:sz w:val="22"/>
           <w:szCs w:val="22"/>
         </w:rPr>
+        <w:t>Book</w:t>
+      </w:r>
+      <w:r>
+        <w:rPr>
+          <w:rFonts w:ascii="Times New Roman" w:hAnsi="Times New Roman" w:cs="Times New Roman"/>
+          <w:b/>
+          <w:bCs/>
+          <w:sz w:val="22"/>
+          <w:szCs w:val="22"/>
+        </w:rPr>
+        <w:t xml:space="preserve"> Author</w:t>
+      </w:r>
+    </w:p>
+    <w:p>
+      <w:pPr>
+        <w:spacing w:after="120" w:line="240" w:lineRule="auto"/>
+        <w:ind w:left="1440" w:hanging="720"/>
+        <w:rPr>
+          <w:rFonts w:ascii="Times New Roman" w:hAnsi="Times New Roman" w:cs="Times New Roman"/>
+          <w:sz w:val="22"/>
+          <w:szCs w:val="22"/>
+        </w:rPr>
+      </w:pPr>
+      <w:r>
+        <w:rPr>
+          <w:rFonts w:ascii="Times New Roman" w:hAnsi="Times New Roman" w:cs="Times New Roman"/>
+          <w:b/>
+          <w:sz w:val="22"/>
+          <w:szCs w:val="22"/>
+        </w:rPr>
+        <w:t>Luitel, B.</w:t>
+      </w:r>
+      <w:r>
+        <w:rPr>
+          <w:rFonts w:ascii="Times New Roman" w:hAnsi="Times New Roman" w:cs="Times New Roman"/>
+          <w:sz w:val="22"/>
+          <w:szCs w:val="22"/>
+        </w:rPr>
+        <w:t xml:space="preserve">, &amp; Gurung, P. (2021). </w:t>
+      </w:r>
+      <w:r>
+        <w:rPr>
+          <w:rFonts w:ascii="Times New Roman" w:hAnsi="Times New Roman" w:cs="Times New Roman"/>
+          <w:i/>
+          <w:sz w:val="22"/>
+          <w:szCs w:val="22"/>
+        </w:rPr>
+        <w:t xml:space="preserve">Interim impact assessment of COVID-19 to underrepresented (Indigenous, Dalit, and Madheshi) people with disabilities in Nepal. </w:t>
+      </w:r>
+      <w:r>
+        <w:rPr>
+          <w:rFonts w:ascii="Times New Roman" w:hAnsi="Times New Roman" w:cs="Times New Roman"/>
+          <w:sz w:val="22"/>
+          <w:szCs w:val="22"/>
+        </w:rPr>
+        <w:t>National Indigenous Disabled</w:t>
+      </w:r>
+      <w:r>
+        <w:rPr>
+          <w:rFonts w:ascii="Times New Roman" w:hAnsi="Times New Roman" w:cs="Times New Roman"/>
+          <w:spacing w:val="-3"/>
+          <w:sz w:val="22"/>
+          <w:szCs w:val="22"/>
+        </w:rPr>
+        <w:t xml:space="preserve"> </w:t>
+      </w:r>
+      <w:r>
+        <w:rPr>
+          <w:rFonts w:ascii="Times New Roman" w:hAnsi="Times New Roman" w:cs="Times New Roman"/>
+          <w:sz w:val="22"/>
+          <w:szCs w:val="22"/>
+        </w:rPr>
+        <w:t>Women</w:t>
+      </w:r>
+      <w:r>
+        <w:rPr>
+          <w:rFonts w:ascii="Times New Roman" w:hAnsi="Times New Roman" w:cs="Times New Roman"/>
+          <w:spacing w:val="-9"/>
+          <w:sz w:val="22"/>
+          <w:szCs w:val="22"/>
+        </w:rPr>
+        <w:t xml:space="preserve"> </w:t>
+      </w:r>
+      <w:r>
+        <w:rPr>
+          <w:rFonts w:ascii="Times New Roman" w:hAnsi="Times New Roman" w:cs="Times New Roman"/>
+          <w:sz w:val="22"/>
+          <w:szCs w:val="22"/>
+        </w:rPr>
+        <w:t>Association</w:t>
+      </w:r>
+      <w:r>
+        <w:rPr>
+          <w:rFonts w:ascii="Times New Roman" w:hAnsi="Times New Roman" w:cs="Times New Roman"/>
+          <w:spacing w:val="-3"/>
+          <w:sz w:val="22"/>
+          <w:szCs w:val="22"/>
+        </w:rPr>
+        <w:t xml:space="preserve"> </w:t>
+      </w:r>
+      <w:r>
+        <w:rPr>
+          <w:rFonts w:ascii="Times New Roman" w:hAnsi="Times New Roman" w:cs="Times New Roman"/>
+          <w:sz w:val="22"/>
+          <w:szCs w:val="22"/>
+        </w:rPr>
+        <w:t>Nepal</w:t>
+      </w:r>
+      <w:r>
+        <w:rPr>
+          <w:rFonts w:ascii="Times New Roman" w:hAnsi="Times New Roman" w:cs="Times New Roman"/>
+          <w:spacing w:val="-5"/>
+          <w:sz w:val="22"/>
+          <w:szCs w:val="22"/>
+        </w:rPr>
+        <w:t xml:space="preserve"> </w:t>
+      </w:r>
+      <w:r>
+        <w:rPr>
+          <w:rFonts w:ascii="Times New Roman" w:hAnsi="Times New Roman" w:cs="Times New Roman"/>
+          <w:sz w:val="22"/>
+          <w:szCs w:val="22"/>
+        </w:rPr>
+        <w:t>(NIDWAN),</w:t>
+      </w:r>
+      <w:r>
+        <w:rPr>
+          <w:rFonts w:ascii="Times New Roman" w:hAnsi="Times New Roman" w:cs="Times New Roman"/>
+          <w:spacing w:val="-3"/>
+          <w:sz w:val="22"/>
+          <w:szCs w:val="22"/>
+        </w:rPr>
+        <w:t xml:space="preserve"> </w:t>
+      </w:r>
+      <w:r>
+        <w:rPr>
+          <w:rFonts w:ascii="Times New Roman" w:hAnsi="Times New Roman" w:cs="Times New Roman"/>
+          <w:sz w:val="22"/>
+          <w:szCs w:val="22"/>
+        </w:rPr>
+        <w:t>United</w:t>
+      </w:r>
+      <w:r>
+        <w:rPr>
+          <w:rFonts w:ascii="Times New Roman" w:hAnsi="Times New Roman" w:cs="Times New Roman"/>
+          <w:spacing w:val="-9"/>
+          <w:sz w:val="22"/>
+          <w:szCs w:val="22"/>
+        </w:rPr>
+        <w:t xml:space="preserve"> </w:t>
+      </w:r>
+      <w:r>
+        <w:rPr>
+          <w:rFonts w:ascii="Times New Roman" w:hAnsi="Times New Roman" w:cs="Times New Roman"/>
+          <w:sz w:val="22"/>
+          <w:szCs w:val="22"/>
+        </w:rPr>
+        <w:t>Nations</w:t>
+      </w:r>
+      <w:r>
+        <w:rPr>
+          <w:rFonts w:ascii="Times New Roman" w:hAnsi="Times New Roman" w:cs="Times New Roman"/>
+          <w:spacing w:val="-3"/>
+          <w:sz w:val="22"/>
+          <w:szCs w:val="22"/>
+        </w:rPr>
+        <w:t xml:space="preserve"> </w:t>
+      </w:r>
+      <w:r>
+        <w:rPr>
+          <w:rFonts w:ascii="Times New Roman" w:hAnsi="Times New Roman" w:cs="Times New Roman"/>
+          <w:sz w:val="22"/>
+          <w:szCs w:val="22"/>
+        </w:rPr>
+        <w:t>Partnership</w:t>
+      </w:r>
+      <w:r>
+        <w:rPr>
+          <w:rFonts w:ascii="Times New Roman" w:hAnsi="Times New Roman" w:cs="Times New Roman"/>
+          <w:spacing w:val="-3"/>
+          <w:sz w:val="22"/>
+          <w:szCs w:val="22"/>
+        </w:rPr>
+        <w:t xml:space="preserve"> </w:t>
+      </w:r>
+      <w:r>
+        <w:rPr>
+          <w:rFonts w:ascii="Times New Roman" w:hAnsi="Times New Roman" w:cs="Times New Roman"/>
+          <w:sz w:val="22"/>
+          <w:szCs w:val="22"/>
+        </w:rPr>
+        <w:t>on</w:t>
+      </w:r>
+      <w:r>
+        <w:rPr>
+          <w:rFonts w:ascii="Times New Roman" w:hAnsi="Times New Roman" w:cs="Times New Roman"/>
+          <w:spacing w:val="-3"/>
+          <w:sz w:val="22"/>
+          <w:szCs w:val="22"/>
+        </w:rPr>
+        <w:t xml:space="preserve"> </w:t>
+      </w:r>
+      <w:r>
+        <w:rPr>
+          <w:rFonts w:ascii="Times New Roman" w:hAnsi="Times New Roman" w:cs="Times New Roman"/>
+          <w:sz w:val="22"/>
+          <w:szCs w:val="22"/>
+        </w:rPr>
+        <w:t>the</w:t>
+      </w:r>
+      <w:r>
+        <w:rPr>
+          <w:rFonts w:ascii="Times New Roman" w:hAnsi="Times New Roman" w:cs="Times New Roman"/>
+          <w:spacing w:val="-1"/>
+          <w:sz w:val="22"/>
+          <w:szCs w:val="22"/>
+        </w:rPr>
+        <w:t xml:space="preserve"> </w:t>
+      </w:r>
+      <w:r>
+        <w:rPr>
+          <w:rFonts w:ascii="Times New Roman" w:hAnsi="Times New Roman" w:cs="Times New Roman"/>
+          <w:sz w:val="22"/>
+          <w:szCs w:val="22"/>
+        </w:rPr>
+        <w:t>Rights</w:t>
+      </w:r>
+      <w:r>
+        <w:rPr>
+          <w:rFonts w:ascii="Times New Roman" w:hAnsi="Times New Roman" w:cs="Times New Roman"/>
+          <w:spacing w:val="-3"/>
+          <w:sz w:val="22"/>
+          <w:szCs w:val="22"/>
+        </w:rPr>
+        <w:t xml:space="preserve"> </w:t>
+      </w:r>
+      <w:r>
+        <w:rPr>
+          <w:rFonts w:ascii="Times New Roman" w:hAnsi="Times New Roman" w:cs="Times New Roman"/>
+          <w:sz w:val="22"/>
+          <w:szCs w:val="22"/>
+        </w:rPr>
+        <w:t>of Persons with Disability (UNPRPD).</w:t>
+      </w:r>
+    </w:p>
+    <w:p>
+      <w:pPr>
+        <w:spacing w:after="120" w:line="240" w:lineRule="auto"/>
+        <w:ind w:firstLine="360"/>
+        <w:rPr>
+          <w:rFonts w:ascii="Times New Roman" w:hAnsi="Times New Roman" w:cs="Times New Roman"/>
+          <w:b/>
+          <w:bCs/>
+          <w:sz w:val="22"/>
+          <w:szCs w:val="22"/>
+        </w:rPr>
+      </w:pPr>
+      <w:r>
+        <w:rPr>
+          <w:rFonts w:ascii="Times New Roman" w:hAnsi="Times New Roman" w:cs="Times New Roman"/>
+          <w:b/>
+          <w:bCs/>
+          <w:sz w:val="22"/>
+          <w:szCs w:val="22"/>
+        </w:rPr>
         <w:t>Research Report</w:t>
       </w:r>
       <w:r>
@@ -2783,6 +3315,16 @@
           <w:szCs w:val="22"/>
         </w:rPr>
         <w:t>/Article/Archival</w:t>
+      </w:r>
+      <w:r>
+        <w:rPr>
+          <w:rFonts w:ascii="Times New Roman" w:hAnsi="Times New Roman" w:cs="Times New Roman"/>
+          <w:b/>
+          <w:bCs/>
+          <w:sz w:val="22"/>
+          <w:szCs w:val="22"/>
+        </w:rPr>
+        <w:t xml:space="preserve"> (Non-peer-reviewed)</w:t>
       </w:r>
     </w:p>
     <w:p>
@@ -3241,7 +3783,8 @@
           <w:sz w:val="22"/>
           <w:szCs w:val="22"/>
         </w:rPr>
-        <w:t xml:space="preserve">Rink, D., Ojha, GP., </w:t>
+        <w:lastRenderedPageBreak/>
+        <w:t xml:space="preserve">Rink, D., </w:t>
       </w:r>
       <w:r>
         <w:rPr>
@@ -3258,21 +3801,60 @@
           <w:sz w:val="22"/>
           <w:szCs w:val="22"/>
         </w:rPr>
-        <w:t xml:space="preserve">., Khatiwada, R., Sinha, B., Amgai, T. (2022). </w:t>
-      </w:r>
-      <w:r>
-        <w:rPr>
-          <w:rFonts w:ascii="Times New Roman" w:hAnsi="Times New Roman" w:cs="Times New Roman"/>
-          <w:i/>
-          <w:sz w:val="22"/>
-          <w:szCs w:val="22"/>
-        </w:rPr>
-        <w:t>End-line Evaluation of Knowledge-based</w:t>
-      </w:r>
-      <w:r>
-        <w:rPr>
-          <w:rFonts w:ascii="Times New Roman" w:hAnsi="Times New Roman" w:cs="Times New Roman"/>
-          <w:i/>
+        <w:t>.,</w:t>
+      </w:r>
+      <w:r>
+        <w:rPr>
+          <w:rFonts w:ascii="Times New Roman" w:hAnsi="Times New Roman" w:cs="Times New Roman"/>
+          <w:sz w:val="22"/>
+          <w:szCs w:val="22"/>
+        </w:rPr>
+        <w:t xml:space="preserve"> </w:t>
+      </w:r>
+      <w:r>
+        <w:rPr>
+          <w:rFonts w:ascii="Times New Roman" w:hAnsi="Times New Roman" w:cs="Times New Roman"/>
+          <w:sz w:val="22"/>
+          <w:szCs w:val="22"/>
+        </w:rPr>
+        <w:t xml:space="preserve">Ojha, </w:t>
+      </w:r>
+      <w:r>
+        <w:rPr>
+          <w:rFonts w:ascii="Times New Roman" w:hAnsi="Times New Roman" w:cs="Times New Roman"/>
+          <w:sz w:val="22"/>
+          <w:szCs w:val="22"/>
+        </w:rPr>
+        <w:t>G. P.</w:t>
+      </w:r>
+      <w:r>
+        <w:rPr>
+          <w:rFonts w:ascii="Times New Roman" w:hAnsi="Times New Roman" w:cs="Times New Roman"/>
+          <w:sz w:val="22"/>
+          <w:szCs w:val="22"/>
+        </w:rPr>
+        <w:t xml:space="preserve"> (2022). </w:t>
+      </w:r>
+      <w:r>
+        <w:rPr>
+          <w:rFonts w:ascii="Times New Roman" w:hAnsi="Times New Roman" w:cs="Times New Roman"/>
+          <w:i/>
+          <w:sz w:val="22"/>
+          <w:szCs w:val="22"/>
+        </w:rPr>
+        <w:t>Market Systems Analyses of Cardamom, Ginger, and Lentils in Nepal</w:t>
+      </w:r>
+      <w:r>
+        <w:rPr>
+          <w:rFonts w:ascii="Times New Roman" w:hAnsi="Times New Roman" w:cs="Times New Roman"/>
+          <w:sz w:val="22"/>
+          <w:szCs w:val="22"/>
+        </w:rPr>
+        <w:t>.</w:t>
+      </w:r>
+      <w:r>
+        <w:rPr>
+          <w:rFonts w:ascii="Times New Roman" w:hAnsi="Times New Roman" w:cs="Times New Roman"/>
           <w:spacing w:val="-3"/>
           <w:sz w:val="22"/>
           <w:szCs w:val="22"/>
@@ -3282,165 +3864,18 @@
       <w:r>
         <w:rPr>
           <w:rFonts w:ascii="Times New Roman" w:hAnsi="Times New Roman" w:cs="Times New Roman"/>
-          <w:i/>
-          <w:sz w:val="22"/>
-          <w:szCs w:val="22"/>
-        </w:rPr>
-        <w:t>Integrated</w:t>
-      </w:r>
-      <w:r>
-        <w:rPr>
-          <w:rFonts w:ascii="Times New Roman" w:hAnsi="Times New Roman" w:cs="Times New Roman"/>
-          <w:i/>
-          <w:spacing w:val="-3"/>
-          <w:sz w:val="22"/>
-          <w:szCs w:val="22"/>
-        </w:rPr>
-        <w:t xml:space="preserve"> </w:t>
-      </w:r>
-      <w:r>
-        <w:rPr>
-          <w:rFonts w:ascii="Times New Roman" w:hAnsi="Times New Roman" w:cs="Times New Roman"/>
-          <w:i/>
-          <w:sz w:val="22"/>
-          <w:szCs w:val="22"/>
-        </w:rPr>
-        <w:t>Sustainable</w:t>
-      </w:r>
-      <w:r>
-        <w:rPr>
-          <w:rFonts w:ascii="Times New Roman" w:hAnsi="Times New Roman" w:cs="Times New Roman"/>
-          <w:i/>
-          <w:spacing w:val="-1"/>
-          <w:sz w:val="22"/>
-          <w:szCs w:val="22"/>
-        </w:rPr>
-        <w:t xml:space="preserve"> </w:t>
-      </w:r>
-      <w:r>
-        <w:rPr>
-          <w:rFonts w:ascii="Times New Roman" w:hAnsi="Times New Roman" w:cs="Times New Roman"/>
-          <w:i/>
-          <w:sz w:val="22"/>
-          <w:szCs w:val="22"/>
-        </w:rPr>
-        <w:t>Agriculture</w:t>
-      </w:r>
-      <w:r>
-        <w:rPr>
-          <w:rFonts w:ascii="Times New Roman" w:hAnsi="Times New Roman" w:cs="Times New Roman"/>
-          <w:i/>
-          <w:spacing w:val="-2"/>
-          <w:sz w:val="22"/>
-          <w:szCs w:val="22"/>
-        </w:rPr>
-        <w:t xml:space="preserve"> </w:t>
-      </w:r>
-      <w:r>
-        <w:rPr>
-          <w:rFonts w:ascii="Times New Roman" w:hAnsi="Times New Roman" w:cs="Times New Roman"/>
-          <w:i/>
-          <w:sz w:val="22"/>
-          <w:szCs w:val="22"/>
-        </w:rPr>
-        <w:t>in</w:t>
-      </w:r>
-      <w:r>
-        <w:rPr>
-          <w:rFonts w:ascii="Times New Roman" w:hAnsi="Times New Roman" w:cs="Times New Roman"/>
-          <w:i/>
-          <w:spacing w:val="-9"/>
-          <w:sz w:val="22"/>
-          <w:szCs w:val="22"/>
-        </w:rPr>
-        <w:t xml:space="preserve"> </w:t>
-      </w:r>
-      <w:r>
-        <w:rPr>
-          <w:rFonts w:ascii="Times New Roman" w:hAnsi="Times New Roman" w:cs="Times New Roman"/>
-          <w:i/>
-          <w:sz w:val="22"/>
-          <w:szCs w:val="22"/>
-        </w:rPr>
-        <w:t>Nepal</w:t>
-      </w:r>
-      <w:r>
-        <w:rPr>
-          <w:rFonts w:ascii="Times New Roman" w:hAnsi="Times New Roman" w:cs="Times New Roman"/>
-          <w:i/>
-          <w:spacing w:val="-5"/>
-          <w:sz w:val="22"/>
-          <w:szCs w:val="22"/>
-        </w:rPr>
-        <w:t xml:space="preserve"> </w:t>
-      </w:r>
-      <w:r>
-        <w:rPr>
-          <w:rFonts w:ascii="Times New Roman" w:hAnsi="Times New Roman" w:cs="Times New Roman"/>
-          <w:i/>
-          <w:sz w:val="22"/>
-          <w:szCs w:val="22"/>
-        </w:rPr>
-        <w:t>(KISAN)II</w:t>
-      </w:r>
-      <w:r>
-        <w:rPr>
-          <w:rFonts w:ascii="Times New Roman" w:hAnsi="Times New Roman" w:cs="Times New Roman"/>
-          <w:sz w:val="22"/>
-          <w:szCs w:val="22"/>
-        </w:rPr>
-        <w:t>.</w:t>
-      </w:r>
-      <w:r>
-        <w:rPr>
-          <w:rFonts w:ascii="Times New Roman" w:hAnsi="Times New Roman" w:cs="Times New Roman"/>
-          <w:spacing w:val="-3"/>
-          <w:sz w:val="22"/>
-          <w:szCs w:val="22"/>
-        </w:rPr>
-        <w:t xml:space="preserve"> </w:t>
-      </w:r>
-      <w:r>
-        <w:rPr>
-          <w:rFonts w:ascii="Times New Roman" w:hAnsi="Times New Roman" w:cs="Times New Roman"/>
-          <w:sz w:val="22"/>
-          <w:szCs w:val="22"/>
-        </w:rPr>
-        <w:t>Social</w:t>
-      </w:r>
-      <w:r>
-        <w:rPr>
-          <w:rFonts w:ascii="Times New Roman" w:hAnsi="Times New Roman" w:cs="Times New Roman"/>
-          <w:spacing w:val="-5"/>
-          <w:sz w:val="22"/>
-          <w:szCs w:val="22"/>
-        </w:rPr>
-        <w:t xml:space="preserve"> </w:t>
-      </w:r>
-      <w:r>
-        <w:rPr>
-          <w:rFonts w:ascii="Times New Roman" w:hAnsi="Times New Roman" w:cs="Times New Roman"/>
-          <w:sz w:val="22"/>
-          <w:szCs w:val="22"/>
-        </w:rPr>
-        <w:t>Impact</w:t>
-      </w:r>
-      <w:r>
-        <w:rPr>
-          <w:rFonts w:ascii="Times New Roman" w:hAnsi="Times New Roman" w:cs="Times New Roman"/>
-          <w:spacing w:val="-5"/>
-          <w:sz w:val="22"/>
-          <w:szCs w:val="22"/>
-        </w:rPr>
-        <w:t xml:space="preserve"> </w:t>
-      </w:r>
-      <w:r>
-        <w:rPr>
-          <w:rFonts w:ascii="Times New Roman" w:hAnsi="Times New Roman" w:cs="Times New Roman"/>
-          <w:sz w:val="22"/>
-          <w:szCs w:val="22"/>
-        </w:rPr>
-        <w:t xml:space="preserve">Inc., Research report for United States Agency for International Development (USAID). </w:t>
+          <w:sz w:val="22"/>
+          <w:szCs w:val="22"/>
+        </w:rPr>
+        <w:t>J.E. Austin Associates, Inc.</w:t>
+      </w:r>
+      <w:r>
+        <w:rPr>
+          <w:rFonts w:ascii="Times New Roman" w:hAnsi="Times New Roman" w:cs="Times New Roman"/>
+          <w:sz w:val="22"/>
+          <w:szCs w:val="22"/>
+        </w:rPr>
+        <w:t xml:space="preserve">, Research report for United States Agency for International Development (USAID). </w:t>
       </w:r>
     </w:p>
     <w:p>
@@ -3456,28 +3891,52 @@
       <w:r>
         <w:rPr>
           <w:rFonts w:ascii="Times New Roman" w:hAnsi="Times New Roman" w:cs="Times New Roman"/>
-          <w:b/>
-          <w:sz w:val="22"/>
-          <w:szCs w:val="22"/>
-        </w:rPr>
-        <w:t xml:space="preserve">Luitel, B., </w:t>
-      </w:r>
-      <w:r>
-        <w:rPr>
-          <w:rFonts w:ascii="Times New Roman" w:hAnsi="Times New Roman" w:cs="Times New Roman"/>
-          <w:sz w:val="22"/>
-          <w:szCs w:val="22"/>
-        </w:rPr>
-        <w:t xml:space="preserve">&amp; Gurung, P. (2021). </w:t>
-      </w:r>
-      <w:r>
-        <w:rPr>
-          <w:rFonts w:ascii="Times New Roman" w:hAnsi="Times New Roman" w:cs="Times New Roman"/>
-          <w:i/>
-          <w:sz w:val="22"/>
-          <w:szCs w:val="22"/>
-        </w:rPr>
-        <w:t>Intersectionality and Marginalization: A Study of Indigenous Women with</w:t>
+          <w:sz w:val="22"/>
+          <w:szCs w:val="22"/>
+        </w:rPr>
+        <w:t xml:space="preserve">Rink, D., Ojha, </w:t>
+      </w:r>
+      <w:r>
+        <w:rPr>
+          <w:rFonts w:ascii="Times New Roman" w:hAnsi="Times New Roman" w:cs="Times New Roman"/>
+          <w:sz w:val="22"/>
+          <w:szCs w:val="22"/>
+        </w:rPr>
+        <w:t>G.P.</w:t>
+      </w:r>
+      <w:r>
+        <w:rPr>
+          <w:rFonts w:ascii="Times New Roman" w:hAnsi="Times New Roman" w:cs="Times New Roman"/>
+          <w:sz w:val="22"/>
+          <w:szCs w:val="22"/>
+        </w:rPr>
+        <w:t xml:space="preserve">, </w:t>
+      </w:r>
+      <w:r>
+        <w:rPr>
+          <w:rFonts w:ascii="Times New Roman" w:hAnsi="Times New Roman" w:cs="Times New Roman"/>
+          <w:b/>
+          <w:sz w:val="22"/>
+          <w:szCs w:val="22"/>
+        </w:rPr>
+        <w:t>Luitel, B</w:t>
+      </w:r>
+      <w:r>
+        <w:rPr>
+          <w:rFonts w:ascii="Times New Roman" w:hAnsi="Times New Roman" w:cs="Times New Roman"/>
+          <w:sz w:val="22"/>
+          <w:szCs w:val="22"/>
+        </w:rPr>
+        <w:t xml:space="preserve">., Khatiwada, R., Sinha, B., Amgai, T. (2022). </w:t>
+      </w:r>
+      <w:r>
+        <w:rPr>
+          <w:rFonts w:ascii="Times New Roman" w:hAnsi="Times New Roman" w:cs="Times New Roman"/>
+          <w:i/>
+          <w:sz w:val="22"/>
+          <w:szCs w:val="22"/>
+        </w:rPr>
+        <w:t>End-line Evaluation of Knowledge-based</w:t>
       </w:r>
       <w:r>
         <w:rPr>
@@ -3496,7 +3955,26 @@
           <w:sz w:val="22"/>
           <w:szCs w:val="22"/>
         </w:rPr>
-        <w:t>Disability</w:t>
+        <w:t>Integrated</w:t>
+      </w:r>
+      <w:r>
+        <w:rPr>
+          <w:rFonts w:ascii="Times New Roman" w:hAnsi="Times New Roman" w:cs="Times New Roman"/>
+          <w:i/>
+          <w:spacing w:val="-3"/>
+          <w:sz w:val="22"/>
+          <w:szCs w:val="22"/>
+        </w:rPr>
+        <w:t xml:space="preserve"> </w:t>
+      </w:r>
+      <w:r>
+        <w:rPr>
+          <w:rFonts w:ascii="Times New Roman" w:hAnsi="Times New Roman" w:cs="Times New Roman"/>
+          <w:i/>
+          <w:sz w:val="22"/>
+          <w:szCs w:val="22"/>
+        </w:rPr>
+        <w:t>Sustainable</w:t>
       </w:r>
       <w:r>
         <w:rPr>
@@ -3515,12 +3993,76 @@
           <w:sz w:val="22"/>
           <w:szCs w:val="22"/>
         </w:rPr>
+        <w:t>Agriculture</w:t>
+      </w:r>
+      <w:r>
+        <w:rPr>
+          <w:rFonts w:ascii="Times New Roman" w:hAnsi="Times New Roman" w:cs="Times New Roman"/>
+          <w:i/>
+          <w:spacing w:val="-2"/>
+          <w:sz w:val="22"/>
+          <w:szCs w:val="22"/>
+        </w:rPr>
+        <w:t xml:space="preserve"> </w:t>
+      </w:r>
+      <w:r>
+        <w:rPr>
+          <w:rFonts w:ascii="Times New Roman" w:hAnsi="Times New Roman" w:cs="Times New Roman"/>
+          <w:i/>
+          <w:sz w:val="22"/>
+          <w:szCs w:val="22"/>
+        </w:rPr>
         <w:t>in</w:t>
       </w:r>
       <w:r>
         <w:rPr>
           <w:rFonts w:ascii="Times New Roman" w:hAnsi="Times New Roman" w:cs="Times New Roman"/>
           <w:i/>
+          <w:spacing w:val="-9"/>
+          <w:sz w:val="22"/>
+          <w:szCs w:val="22"/>
+        </w:rPr>
+        <w:t xml:space="preserve"> </w:t>
+      </w:r>
+      <w:r>
+        <w:rPr>
+          <w:rFonts w:ascii="Times New Roman" w:hAnsi="Times New Roman" w:cs="Times New Roman"/>
+          <w:i/>
+          <w:sz w:val="22"/>
+          <w:szCs w:val="22"/>
+        </w:rPr>
+        <w:t>Nepal</w:t>
+      </w:r>
+      <w:r>
+        <w:rPr>
+          <w:rFonts w:ascii="Times New Roman" w:hAnsi="Times New Roman" w:cs="Times New Roman"/>
+          <w:i/>
+          <w:spacing w:val="-5"/>
+          <w:sz w:val="22"/>
+          <w:szCs w:val="22"/>
+        </w:rPr>
+        <w:t xml:space="preserve"> </w:t>
+      </w:r>
+      <w:r>
+        <w:rPr>
+          <w:rFonts w:ascii="Times New Roman" w:hAnsi="Times New Roman" w:cs="Times New Roman"/>
+          <w:i/>
+          <w:sz w:val="22"/>
+          <w:szCs w:val="22"/>
+        </w:rPr>
+        <w:t>(KISAN)II</w:t>
+      </w:r>
+      <w:r>
+        <w:rPr>
+          <w:rFonts w:ascii="Times New Roman" w:hAnsi="Times New Roman" w:cs="Times New Roman"/>
+          <w:sz w:val="22"/>
+          <w:szCs w:val="22"/>
+        </w:rPr>
+        <w:t>.</w:t>
+      </w:r>
+      <w:r>
+        <w:rPr>
+          <w:rFonts w:ascii="Times New Roman" w:hAnsi="Times New Roman" w:cs="Times New Roman"/>
           <w:spacing w:val="-3"/>
           <w:sz w:val="22"/>
           <w:szCs w:val="22"/>
@@ -3530,36 +4072,10 @@
       <w:r>
         <w:rPr>
           <w:rFonts w:ascii="Times New Roman" w:hAnsi="Times New Roman" w:cs="Times New Roman"/>
-          <w:i/>
-          <w:sz w:val="22"/>
-          <w:szCs w:val="22"/>
-        </w:rPr>
-        <w:t>Nepal</w:t>
-      </w:r>
-      <w:r>
-        <w:rPr>
-          <w:rFonts w:ascii="Times New Roman" w:hAnsi="Times New Roman" w:cs="Times New Roman"/>
-          <w:sz w:val="22"/>
-          <w:szCs w:val="22"/>
-        </w:rPr>
-        <w:t>.</w:t>
-      </w:r>
-      <w:r>
-        <w:rPr>
-          <w:rFonts w:ascii="Times New Roman" w:hAnsi="Times New Roman" w:cs="Times New Roman"/>
-          <w:spacing w:val="-3"/>
-          <w:sz w:val="22"/>
-          <w:szCs w:val="22"/>
-        </w:rPr>
-        <w:t xml:space="preserve"> </w:t>
-      </w:r>
-      <w:r>
-        <w:rPr>
-          <w:rFonts w:ascii="Times New Roman" w:hAnsi="Times New Roman" w:cs="Times New Roman"/>
-          <w:sz w:val="22"/>
-          <w:szCs w:val="22"/>
-        </w:rPr>
-        <w:t>National</w:t>
+          <w:sz w:val="22"/>
+          <w:szCs w:val="22"/>
+        </w:rPr>
+        <w:t>Social</w:t>
       </w:r>
       <w:r>
         <w:rPr>
@@ -3576,75 +4092,7 @@
           <w:sz w:val="22"/>
           <w:szCs w:val="22"/>
         </w:rPr>
-        <w:t>Indigenous</w:t>
-      </w:r>
-      <w:r>
-        <w:rPr>
-          <w:rFonts w:ascii="Times New Roman" w:hAnsi="Times New Roman" w:cs="Times New Roman"/>
-          <w:spacing w:val="-3"/>
-          <w:sz w:val="22"/>
-          <w:szCs w:val="22"/>
-        </w:rPr>
-        <w:t xml:space="preserve"> </w:t>
-      </w:r>
-      <w:r>
-        <w:rPr>
-          <w:rFonts w:ascii="Times New Roman" w:hAnsi="Times New Roman" w:cs="Times New Roman"/>
-          <w:sz w:val="22"/>
-          <w:szCs w:val="22"/>
-        </w:rPr>
-        <w:t>Disabled</w:t>
-      </w:r>
-      <w:r>
-        <w:rPr>
-          <w:rFonts w:ascii="Times New Roman" w:hAnsi="Times New Roman" w:cs="Times New Roman"/>
-          <w:spacing w:val="-3"/>
-          <w:sz w:val="22"/>
-          <w:szCs w:val="22"/>
-        </w:rPr>
-        <w:t xml:space="preserve"> </w:t>
-      </w:r>
-      <w:r>
-        <w:rPr>
-          <w:rFonts w:ascii="Times New Roman" w:hAnsi="Times New Roman" w:cs="Times New Roman"/>
-          <w:sz w:val="22"/>
-          <w:szCs w:val="22"/>
-        </w:rPr>
-        <w:t>Women</w:t>
-      </w:r>
-      <w:r>
-        <w:rPr>
-          <w:rFonts w:ascii="Times New Roman" w:hAnsi="Times New Roman" w:cs="Times New Roman"/>
-          <w:spacing w:val="-3"/>
-          <w:sz w:val="22"/>
-          <w:szCs w:val="22"/>
-        </w:rPr>
-        <w:t xml:space="preserve"> </w:t>
-      </w:r>
-      <w:r>
-        <w:rPr>
-          <w:rFonts w:ascii="Times New Roman" w:hAnsi="Times New Roman" w:cs="Times New Roman"/>
-          <w:sz w:val="22"/>
-          <w:szCs w:val="22"/>
-        </w:rPr>
-        <w:t>Association</w:t>
-      </w:r>
-      <w:r>
-        <w:rPr>
-          <w:rFonts w:ascii="Times New Roman" w:hAnsi="Times New Roman" w:cs="Times New Roman"/>
-          <w:spacing w:val="-3"/>
-          <w:sz w:val="22"/>
-          <w:szCs w:val="22"/>
-        </w:rPr>
-        <w:t xml:space="preserve"> </w:t>
-      </w:r>
-      <w:r>
-        <w:rPr>
-          <w:rFonts w:ascii="Times New Roman" w:hAnsi="Times New Roman" w:cs="Times New Roman"/>
-          <w:sz w:val="22"/>
-          <w:szCs w:val="22"/>
-        </w:rPr>
-        <w:t>Nepal</w:t>
+        <w:t>Impact</w:t>
       </w:r>
       <w:r>
         <w:rPr>
@@ -3661,7 +4109,7 @@
           <w:sz w:val="22"/>
           <w:szCs w:val="22"/>
         </w:rPr>
-        <w:t>(NIDWAN), International Indigenous Women Forum (FIMI).</w:t>
+        <w:t xml:space="preserve">Inc., Research report for United States Agency for International Development (USAID). </w:t>
       </w:r>
     </w:p>
     <w:p>
@@ -3681,12 +4129,29 @@
           <w:sz w:val="22"/>
           <w:szCs w:val="22"/>
         </w:rPr>
-        <w:t>Luitel,</w:t>
-      </w:r>
-      <w:r>
-        <w:rPr>
-          <w:rFonts w:ascii="Times New Roman" w:hAnsi="Times New Roman" w:cs="Times New Roman"/>
-          <w:b/>
+        <w:t xml:space="preserve">Luitel, B., </w:t>
+      </w:r>
+      <w:r>
+        <w:rPr>
+          <w:rFonts w:ascii="Times New Roman" w:hAnsi="Times New Roman" w:cs="Times New Roman"/>
+          <w:sz w:val="22"/>
+          <w:szCs w:val="22"/>
+        </w:rPr>
+        <w:t xml:space="preserve">&amp; Gurung, P. (2021). </w:t>
+      </w:r>
+      <w:r>
+        <w:rPr>
+          <w:rFonts w:ascii="Times New Roman" w:hAnsi="Times New Roman" w:cs="Times New Roman"/>
+          <w:i/>
+          <w:sz w:val="22"/>
+          <w:szCs w:val="22"/>
+        </w:rPr>
+        <w:t>Intersectionality and Marginalization: A Study of Indigenous Women with</w:t>
+      </w:r>
+      <w:r>
+        <w:rPr>
+          <w:rFonts w:ascii="Times New Roman" w:hAnsi="Times New Roman" w:cs="Times New Roman"/>
+          <w:i/>
           <w:spacing w:val="-3"/>
           <w:sz w:val="22"/>
           <w:szCs w:val="22"/>
@@ -3696,16 +4161,16 @@
       <w:r>
         <w:rPr>
           <w:rFonts w:ascii="Times New Roman" w:hAnsi="Times New Roman" w:cs="Times New Roman"/>
-          <w:b/>
-          <w:sz w:val="22"/>
-          <w:szCs w:val="22"/>
-        </w:rPr>
-        <w:t>B.</w:t>
-      </w:r>
-      <w:r>
-        <w:rPr>
-          <w:rFonts w:ascii="Times New Roman" w:hAnsi="Times New Roman" w:cs="Times New Roman"/>
-          <w:b/>
+          <w:i/>
+          <w:sz w:val="22"/>
+          <w:szCs w:val="22"/>
+        </w:rPr>
+        <w:t>Disability</w:t>
+      </w:r>
+      <w:r>
+        <w:rPr>
+          <w:rFonts w:ascii="Times New Roman" w:hAnsi="Times New Roman" w:cs="Times New Roman"/>
+          <w:i/>
           <w:spacing w:val="-1"/>
           <w:sz w:val="22"/>
           <w:szCs w:val="22"/>
@@ -3715,42 +4180,6 @@
       <w:r>
         <w:rPr>
           <w:rFonts w:ascii="Times New Roman" w:hAnsi="Times New Roman" w:cs="Times New Roman"/>
-          <w:sz w:val="22"/>
-          <w:szCs w:val="22"/>
-        </w:rPr>
-        <w:t>(2019).</w:t>
-      </w:r>
-      <w:r>
-        <w:rPr>
-          <w:rFonts w:ascii="Times New Roman" w:hAnsi="Times New Roman" w:cs="Times New Roman"/>
-          <w:spacing w:val="-1"/>
-          <w:sz w:val="22"/>
-          <w:szCs w:val="22"/>
-        </w:rPr>
-        <w:t xml:space="preserve"> </w:t>
-      </w:r>
-      <w:r>
-        <w:rPr>
-          <w:rFonts w:ascii="Times New Roman" w:hAnsi="Times New Roman" w:cs="Times New Roman"/>
-          <w:i/>
-          <w:sz w:val="22"/>
-          <w:szCs w:val="22"/>
-        </w:rPr>
-        <w:t>Equity</w:t>
-      </w:r>
-      <w:r>
-        <w:rPr>
-          <w:rFonts w:ascii="Times New Roman" w:hAnsi="Times New Roman" w:cs="Times New Roman"/>
-          <w:i/>
-          <w:spacing w:val="-1"/>
-          <w:sz w:val="22"/>
-          <w:szCs w:val="22"/>
-        </w:rPr>
-        <w:t xml:space="preserve"> </w:t>
-      </w:r>
-      <w:r>
-        <w:rPr>
-          <w:rFonts w:ascii="Times New Roman" w:hAnsi="Times New Roman" w:cs="Times New Roman"/>
           <w:i/>
           <w:sz w:val="22"/>
           <w:szCs w:val="22"/>
@@ -3761,44 +4190,49 @@
         <w:rPr>
           <w:rFonts w:ascii="Times New Roman" w:hAnsi="Times New Roman" w:cs="Times New Roman"/>
           <w:i/>
-          <w:spacing w:val="-2"/>
-          <w:sz w:val="22"/>
-          <w:szCs w:val="22"/>
-        </w:rPr>
-        <w:t xml:space="preserve"> </w:t>
-      </w:r>
-      <w:r>
-        <w:rPr>
-          <w:rFonts w:ascii="Times New Roman" w:hAnsi="Times New Roman" w:cs="Times New Roman"/>
-          <w:i/>
-          <w:sz w:val="22"/>
-          <w:szCs w:val="22"/>
-        </w:rPr>
-        <w:t>Education:</w:t>
-      </w:r>
-      <w:r>
-        <w:rPr>
-          <w:rFonts w:ascii="Times New Roman" w:hAnsi="Times New Roman" w:cs="Times New Roman"/>
-          <w:i/>
-          <w:spacing w:val="-6"/>
-          <w:sz w:val="22"/>
-          <w:szCs w:val="22"/>
-        </w:rPr>
-        <w:t xml:space="preserve"> </w:t>
-      </w:r>
-      <w:r>
-        <w:rPr>
-          <w:rFonts w:ascii="Times New Roman" w:hAnsi="Times New Roman" w:cs="Times New Roman"/>
-          <w:i/>
-          <w:sz w:val="22"/>
-          <w:szCs w:val="22"/>
-        </w:rPr>
-        <w:t>Inclusive</w:t>
-      </w:r>
-      <w:r>
-        <w:rPr>
-          <w:rFonts w:ascii="Times New Roman" w:hAnsi="Times New Roman" w:cs="Times New Roman"/>
-          <w:i/>
+          <w:spacing w:val="-3"/>
+          <w:sz w:val="22"/>
+          <w:szCs w:val="22"/>
+        </w:rPr>
+        <w:t xml:space="preserve"> </w:t>
+      </w:r>
+      <w:r>
+        <w:rPr>
+          <w:rFonts w:ascii="Times New Roman" w:hAnsi="Times New Roman" w:cs="Times New Roman"/>
+          <w:i/>
+          <w:sz w:val="22"/>
+          <w:szCs w:val="22"/>
+        </w:rPr>
+        <w:t>Nepal</w:t>
+      </w:r>
+      <w:r>
+        <w:rPr>
+          <w:rFonts w:ascii="Times New Roman" w:hAnsi="Times New Roman" w:cs="Times New Roman"/>
+          <w:sz w:val="22"/>
+          <w:szCs w:val="22"/>
+        </w:rPr>
+        <w:t>.</w:t>
+      </w:r>
+      <w:r>
+        <w:rPr>
+          <w:rFonts w:ascii="Times New Roman" w:hAnsi="Times New Roman" w:cs="Times New Roman"/>
+          <w:spacing w:val="-3"/>
+          <w:sz w:val="22"/>
+          <w:szCs w:val="22"/>
+        </w:rPr>
+        <w:t xml:space="preserve"> </w:t>
+      </w:r>
+      <w:r>
+        <w:rPr>
+          <w:rFonts w:ascii="Times New Roman" w:hAnsi="Times New Roman" w:cs="Times New Roman"/>
+          <w:sz w:val="22"/>
+          <w:szCs w:val="22"/>
+        </w:rPr>
+        <w:t>National</w:t>
+      </w:r>
+      <w:r>
+        <w:rPr>
+          <w:rFonts w:ascii="Times New Roman" w:hAnsi="Times New Roman" w:cs="Times New Roman"/>
           <w:spacing w:val="-5"/>
           <w:sz w:val="22"/>
           <w:szCs w:val="22"/>
@@ -3808,35 +4242,14 @@
       <w:r>
         <w:rPr>
           <w:rFonts w:ascii="Times New Roman" w:hAnsi="Times New Roman" w:cs="Times New Roman"/>
-          <w:i/>
-          <w:sz w:val="22"/>
-          <w:szCs w:val="22"/>
-        </w:rPr>
-        <w:t>Education</w:t>
-      </w:r>
-      <w:r>
-        <w:rPr>
-          <w:rFonts w:ascii="Times New Roman" w:hAnsi="Times New Roman" w:cs="Times New Roman"/>
-          <w:i/>
-          <w:spacing w:val="-2"/>
-          <w:sz w:val="22"/>
-          <w:szCs w:val="22"/>
-        </w:rPr>
-        <w:t xml:space="preserve"> </w:t>
-      </w:r>
-      <w:r>
-        <w:rPr>
-          <w:rFonts w:ascii="Times New Roman" w:hAnsi="Times New Roman" w:cs="Times New Roman"/>
-          <w:i/>
-          <w:sz w:val="22"/>
-          <w:szCs w:val="22"/>
-        </w:rPr>
-        <w:t>for</w:t>
-      </w:r>
-      <w:r>
-        <w:rPr>
-          <w:rFonts w:ascii="Times New Roman" w:hAnsi="Times New Roman" w:cs="Times New Roman"/>
-          <w:i/>
+          <w:sz w:val="22"/>
+          <w:szCs w:val="22"/>
+        </w:rPr>
+        <w:t>Indigenous</w:t>
+      </w:r>
+      <w:r>
+        <w:rPr>
+          <w:rFonts w:ascii="Times New Roman" w:hAnsi="Times New Roman" w:cs="Times New Roman"/>
           <w:spacing w:val="-3"/>
           <w:sz w:val="22"/>
           <w:szCs w:val="22"/>
@@ -3846,85 +4259,10 @@
       <w:r>
         <w:rPr>
           <w:rFonts w:ascii="Times New Roman" w:hAnsi="Times New Roman" w:cs="Times New Roman"/>
-          <w:i/>
-          <w:sz w:val="22"/>
-          <w:szCs w:val="22"/>
-        </w:rPr>
-        <w:t>Marginalized</w:t>
-      </w:r>
-      <w:r>
-        <w:rPr>
-          <w:rFonts w:ascii="Times New Roman" w:hAnsi="Times New Roman" w:cs="Times New Roman"/>
-          <w:i/>
-          <w:spacing w:val="-2"/>
-          <w:sz w:val="22"/>
-          <w:szCs w:val="22"/>
-        </w:rPr>
-        <w:t xml:space="preserve"> </w:t>
-      </w:r>
-      <w:r>
-        <w:rPr>
-          <w:rFonts w:ascii="Times New Roman" w:hAnsi="Times New Roman" w:cs="Times New Roman"/>
-          <w:i/>
-          <w:sz w:val="22"/>
-          <w:szCs w:val="22"/>
-        </w:rPr>
-        <w:t>Children</w:t>
-      </w:r>
-      <w:r>
-        <w:rPr>
-          <w:rFonts w:ascii="Times New Roman" w:hAnsi="Times New Roman" w:cs="Times New Roman"/>
-          <w:i/>
-          <w:spacing w:val="-2"/>
-          <w:sz w:val="22"/>
-          <w:szCs w:val="22"/>
-        </w:rPr>
-        <w:t xml:space="preserve"> </w:t>
-      </w:r>
-      <w:r>
-        <w:rPr>
-          <w:rFonts w:ascii="Times New Roman" w:hAnsi="Times New Roman" w:cs="Times New Roman"/>
-          <w:i/>
-          <w:sz w:val="22"/>
-          <w:szCs w:val="22"/>
-        </w:rPr>
-        <w:t>in</w:t>
-      </w:r>
-      <w:r>
-        <w:rPr>
-          <w:rFonts w:ascii="Times New Roman" w:hAnsi="Times New Roman" w:cs="Times New Roman"/>
-          <w:i/>
-          <w:spacing w:val="-2"/>
-          <w:sz w:val="22"/>
-          <w:szCs w:val="22"/>
-        </w:rPr>
-        <w:t xml:space="preserve"> Nepal</w:t>
-      </w:r>
-      <w:r>
-        <w:rPr>
-          <w:rFonts w:ascii="Times New Roman" w:hAnsi="Times New Roman" w:cs="Times New Roman"/>
-          <w:spacing w:val="-2"/>
-          <w:sz w:val="22"/>
-          <w:szCs w:val="22"/>
-        </w:rPr>
-        <w:t>.</w:t>
-      </w:r>
-      <w:r>
-        <w:rPr>
-          <w:rFonts w:ascii="Times New Roman" w:hAnsi="Times New Roman" w:cs="Times New Roman"/>
-          <w:spacing w:val="-2"/>
-          <w:sz w:val="22"/>
-          <w:szCs w:val="22"/>
-        </w:rPr>
-        <w:t xml:space="preserve"> </w:t>
-      </w:r>
-      <w:r>
-        <w:rPr>
-          <w:rFonts w:ascii="Times New Roman" w:hAnsi="Times New Roman" w:cs="Times New Roman"/>
-          <w:sz w:val="22"/>
-          <w:szCs w:val="22"/>
-        </w:rPr>
-        <w:t>Kathmandu,</w:t>
+          <w:sz w:val="22"/>
+          <w:szCs w:val="22"/>
+        </w:rPr>
+        <w:t>Disabled</w:t>
       </w:r>
       <w:r>
         <w:rPr>
@@ -3941,118 +4279,41 @@
           <w:sz w:val="22"/>
           <w:szCs w:val="22"/>
         </w:rPr>
-        <w:t>Bal</w:t>
-      </w:r>
-      <w:r>
-        <w:rPr>
-          <w:rFonts w:ascii="Times New Roman" w:hAnsi="Times New Roman" w:cs="Times New Roman"/>
-          <w:spacing w:val="-4"/>
-          <w:sz w:val="22"/>
-          <w:szCs w:val="22"/>
-        </w:rPr>
-        <w:t xml:space="preserve"> </w:t>
-      </w:r>
-      <w:r>
-        <w:rPr>
-          <w:rFonts w:ascii="Times New Roman" w:hAnsi="Times New Roman" w:cs="Times New Roman"/>
-          <w:sz w:val="22"/>
-          <w:szCs w:val="22"/>
-        </w:rPr>
-        <w:t>Kshetra Nepal,</w:t>
-      </w:r>
-      <w:r>
-        <w:rPr>
-          <w:rFonts w:ascii="Times New Roman" w:hAnsi="Times New Roman" w:cs="Times New Roman"/>
-          <w:spacing w:val="-2"/>
-          <w:sz w:val="22"/>
-          <w:szCs w:val="22"/>
-        </w:rPr>
-        <w:t xml:space="preserve"> </w:t>
-      </w:r>
-      <w:r>
-        <w:rPr>
-          <w:rFonts w:ascii="Times New Roman" w:hAnsi="Times New Roman" w:cs="Times New Roman"/>
-          <w:sz w:val="22"/>
-          <w:szCs w:val="22"/>
-        </w:rPr>
-        <w:t>and</w:t>
-      </w:r>
-      <w:r>
-        <w:rPr>
-          <w:rFonts w:ascii="Times New Roman" w:hAnsi="Times New Roman" w:cs="Times New Roman"/>
-          <w:spacing w:val="-2"/>
-          <w:sz w:val="22"/>
-          <w:szCs w:val="22"/>
-        </w:rPr>
-        <w:t xml:space="preserve"> </w:t>
-      </w:r>
-      <w:r>
-        <w:rPr>
-          <w:rFonts w:ascii="Times New Roman" w:hAnsi="Times New Roman" w:cs="Times New Roman"/>
-          <w:sz w:val="22"/>
-          <w:szCs w:val="22"/>
-        </w:rPr>
-        <w:t>Bank</w:t>
-      </w:r>
-      <w:r>
-        <w:rPr>
-          <w:rFonts w:ascii="Times New Roman" w:hAnsi="Times New Roman" w:cs="Times New Roman"/>
-          <w:spacing w:val="-2"/>
-          <w:sz w:val="22"/>
-          <w:szCs w:val="22"/>
-        </w:rPr>
-        <w:t xml:space="preserve"> </w:t>
-      </w:r>
-      <w:r>
-        <w:rPr>
-          <w:rFonts w:ascii="Times New Roman" w:hAnsi="Times New Roman" w:cs="Times New Roman"/>
-          <w:sz w:val="22"/>
-          <w:szCs w:val="22"/>
-        </w:rPr>
-        <w:t>Information</w:t>
-      </w:r>
-      <w:r>
-        <w:rPr>
-          <w:rFonts w:ascii="Times New Roman" w:hAnsi="Times New Roman" w:cs="Times New Roman"/>
-          <w:spacing w:val="-2"/>
-          <w:sz w:val="22"/>
-          <w:szCs w:val="22"/>
-        </w:rPr>
-        <w:t xml:space="preserve"> </w:t>
-      </w:r>
-      <w:r>
-        <w:rPr>
-          <w:rFonts w:ascii="Times New Roman" w:hAnsi="Times New Roman" w:cs="Times New Roman"/>
-          <w:sz w:val="22"/>
-          <w:szCs w:val="22"/>
-        </w:rPr>
-        <w:t>Centre,</w:t>
-      </w:r>
-      <w:r>
-        <w:rPr>
-          <w:rFonts w:ascii="Times New Roman" w:hAnsi="Times New Roman" w:cs="Times New Roman"/>
-          <w:spacing w:val="-2"/>
-          <w:sz w:val="22"/>
-          <w:szCs w:val="22"/>
-        </w:rPr>
-        <w:t xml:space="preserve"> </w:t>
-      </w:r>
-      <w:r>
-        <w:rPr>
-          <w:rFonts w:ascii="Times New Roman" w:hAnsi="Times New Roman" w:cs="Times New Roman"/>
-          <w:sz w:val="22"/>
-          <w:szCs w:val="22"/>
-        </w:rPr>
-        <w:t>Washington</w:t>
-      </w:r>
-      <w:r>
-        <w:rPr>
-          <w:rFonts w:ascii="Times New Roman" w:hAnsi="Times New Roman" w:cs="Times New Roman"/>
-          <w:spacing w:val="-2"/>
-          <w:sz w:val="22"/>
-          <w:szCs w:val="22"/>
-        </w:rPr>
-        <w:t xml:space="preserve"> </w:t>
+        <w:t>Women</w:t>
+      </w:r>
+      <w:r>
+        <w:rPr>
+          <w:rFonts w:ascii="Times New Roman" w:hAnsi="Times New Roman" w:cs="Times New Roman"/>
+          <w:spacing w:val="-3"/>
+          <w:sz w:val="22"/>
+          <w:szCs w:val="22"/>
+        </w:rPr>
+        <w:t xml:space="preserve"> </w:t>
+      </w:r>
+      <w:r>
+        <w:rPr>
+          <w:rFonts w:ascii="Times New Roman" w:hAnsi="Times New Roman" w:cs="Times New Roman"/>
+          <w:sz w:val="22"/>
+          <w:szCs w:val="22"/>
+        </w:rPr>
+        <w:t>Association</w:t>
+      </w:r>
+      <w:r>
+        <w:rPr>
+          <w:rFonts w:ascii="Times New Roman" w:hAnsi="Times New Roman" w:cs="Times New Roman"/>
+          <w:spacing w:val="-3"/>
+          <w:sz w:val="22"/>
+          <w:szCs w:val="22"/>
+        </w:rPr>
+        <w:t xml:space="preserve"> </w:t>
+      </w:r>
+      <w:r>
+        <w:rPr>
+          <w:rFonts w:ascii="Times New Roman" w:hAnsi="Times New Roman" w:cs="Times New Roman"/>
+          <w:sz w:val="22"/>
+          <w:szCs w:val="22"/>
+        </w:rPr>
+        <w:t>Nepal</w:t>
       </w:r>
       <w:r>
         <w:rPr>
@@ -4061,7 +4322,15 @@
           <w:sz w:val="22"/>
           <w:szCs w:val="22"/>
         </w:rPr>
-        <w:t>DC.</w:t>
+        <w:t xml:space="preserve"> </w:t>
+      </w:r>
+      <w:r>
+        <w:rPr>
+          <w:rFonts w:ascii="Times New Roman" w:hAnsi="Times New Roman" w:cs="Times New Roman"/>
+          <w:sz w:val="22"/>
+          <w:szCs w:val="22"/>
+        </w:rPr>
+        <w:t>(NIDWAN), International Indigenous Women Forum (FIMI).</w:t>
       </w:r>
     </w:p>
     <w:p>
@@ -4106,6 +4375,61 @@
         <w:rPr>
           <w:rFonts w:ascii="Times New Roman" w:hAnsi="Times New Roman" w:cs="Times New Roman"/>
           <w:b/>
+          <w:spacing w:val="-1"/>
+          <w:sz w:val="22"/>
+          <w:szCs w:val="22"/>
+        </w:rPr>
+        <w:t xml:space="preserve"> </w:t>
+      </w:r>
+      <w:r>
+        <w:rPr>
+          <w:rFonts w:ascii="Times New Roman" w:hAnsi="Times New Roman" w:cs="Times New Roman"/>
+          <w:sz w:val="22"/>
+          <w:szCs w:val="22"/>
+        </w:rPr>
+        <w:t>(2019).</w:t>
+      </w:r>
+      <w:r>
+        <w:rPr>
+          <w:rFonts w:ascii="Times New Roman" w:hAnsi="Times New Roman" w:cs="Times New Roman"/>
+          <w:spacing w:val="-1"/>
+          <w:sz w:val="22"/>
+          <w:szCs w:val="22"/>
+        </w:rPr>
+        <w:t xml:space="preserve"> </w:t>
+      </w:r>
+      <w:r>
+        <w:rPr>
+          <w:rFonts w:ascii="Times New Roman" w:hAnsi="Times New Roman" w:cs="Times New Roman"/>
+          <w:i/>
+          <w:sz w:val="22"/>
+          <w:szCs w:val="22"/>
+        </w:rPr>
+        <w:t>Equity</w:t>
+      </w:r>
+      <w:r>
+        <w:rPr>
+          <w:rFonts w:ascii="Times New Roman" w:hAnsi="Times New Roman" w:cs="Times New Roman"/>
+          <w:i/>
+          <w:spacing w:val="-1"/>
+          <w:sz w:val="22"/>
+          <w:szCs w:val="22"/>
+        </w:rPr>
+        <w:t xml:space="preserve"> </w:t>
+      </w:r>
+      <w:r>
+        <w:rPr>
+          <w:rFonts w:ascii="Times New Roman" w:hAnsi="Times New Roman" w:cs="Times New Roman"/>
+          <w:i/>
+          <w:sz w:val="22"/>
+          <w:szCs w:val="22"/>
+        </w:rPr>
+        <w:t>in</w:t>
+      </w:r>
+      <w:r>
+        <w:rPr>
+          <w:rFonts w:ascii="Times New Roman" w:hAnsi="Times New Roman" w:cs="Times New Roman"/>
+          <w:i/>
           <w:spacing w:val="-2"/>
           <w:sz w:val="22"/>
           <w:szCs w:val="22"/>
@@ -4115,14 +4439,54 @@
       <w:r>
         <w:rPr>
           <w:rFonts w:ascii="Times New Roman" w:hAnsi="Times New Roman" w:cs="Times New Roman"/>
-          <w:sz w:val="22"/>
-          <w:szCs w:val="22"/>
-        </w:rPr>
-        <w:t>(2019).</w:t>
-      </w:r>
-      <w:r>
-        <w:rPr>
-          <w:rFonts w:ascii="Times New Roman" w:hAnsi="Times New Roman" w:cs="Times New Roman"/>
+          <w:i/>
+          <w:sz w:val="22"/>
+          <w:szCs w:val="22"/>
+        </w:rPr>
+        <w:t>Education:</w:t>
+      </w:r>
+      <w:r>
+        <w:rPr>
+          <w:rFonts w:ascii="Times New Roman" w:hAnsi="Times New Roman" w:cs="Times New Roman"/>
+          <w:i/>
+          <w:spacing w:val="-6"/>
+          <w:sz w:val="22"/>
+          <w:szCs w:val="22"/>
+        </w:rPr>
+        <w:t xml:space="preserve"> </w:t>
+      </w:r>
+      <w:r>
+        <w:rPr>
+          <w:rFonts w:ascii="Times New Roman" w:hAnsi="Times New Roman" w:cs="Times New Roman"/>
+          <w:i/>
+          <w:sz w:val="22"/>
+          <w:szCs w:val="22"/>
+        </w:rPr>
+        <w:t>Inclusive</w:t>
+      </w:r>
+      <w:r>
+        <w:rPr>
+          <w:rFonts w:ascii="Times New Roman" w:hAnsi="Times New Roman" w:cs="Times New Roman"/>
+          <w:i/>
+          <w:spacing w:val="-5"/>
+          <w:sz w:val="22"/>
+          <w:szCs w:val="22"/>
+        </w:rPr>
+        <w:t xml:space="preserve"> </w:t>
+      </w:r>
+      <w:r>
+        <w:rPr>
+          <w:rFonts w:ascii="Times New Roman" w:hAnsi="Times New Roman" w:cs="Times New Roman"/>
+          <w:i/>
+          <w:sz w:val="22"/>
+          <w:szCs w:val="22"/>
+        </w:rPr>
+        <w:t>Education</w:t>
+      </w:r>
+      <w:r>
+        <w:rPr>
+          <w:rFonts w:ascii="Times New Roman" w:hAnsi="Times New Roman" w:cs="Times New Roman"/>
+          <w:i/>
           <w:spacing w:val="-2"/>
           <w:sz w:val="22"/>
           <w:szCs w:val="22"/>
@@ -4136,7 +4500,7 @@
           <w:sz w:val="22"/>
           <w:szCs w:val="22"/>
         </w:rPr>
-        <w:t>Child</w:t>
+        <w:t>for</w:t>
       </w:r>
       <w:r>
         <w:rPr>
@@ -4155,12 +4519,85 @@
           <w:sz w:val="22"/>
           <w:szCs w:val="22"/>
         </w:rPr>
-        <w:t>Rights:</w:t>
-      </w:r>
-      <w:r>
-        <w:rPr>
-          <w:rFonts w:ascii="Times New Roman" w:hAnsi="Times New Roman" w:cs="Times New Roman"/>
-          <w:i/>
+        <w:t>Marginalized</w:t>
+      </w:r>
+      <w:r>
+        <w:rPr>
+          <w:rFonts w:ascii="Times New Roman" w:hAnsi="Times New Roman" w:cs="Times New Roman"/>
+          <w:i/>
+          <w:spacing w:val="-2"/>
+          <w:sz w:val="22"/>
+          <w:szCs w:val="22"/>
+        </w:rPr>
+        <w:t xml:space="preserve"> </w:t>
+      </w:r>
+      <w:r>
+        <w:rPr>
+          <w:rFonts w:ascii="Times New Roman" w:hAnsi="Times New Roman" w:cs="Times New Roman"/>
+          <w:i/>
+          <w:sz w:val="22"/>
+          <w:szCs w:val="22"/>
+        </w:rPr>
+        <w:t>Children</w:t>
+      </w:r>
+      <w:r>
+        <w:rPr>
+          <w:rFonts w:ascii="Times New Roman" w:hAnsi="Times New Roman" w:cs="Times New Roman"/>
+          <w:i/>
+          <w:spacing w:val="-2"/>
+          <w:sz w:val="22"/>
+          <w:szCs w:val="22"/>
+        </w:rPr>
+        <w:t xml:space="preserve"> </w:t>
+      </w:r>
+      <w:r>
+        <w:rPr>
+          <w:rFonts w:ascii="Times New Roman" w:hAnsi="Times New Roman" w:cs="Times New Roman"/>
+          <w:i/>
+          <w:sz w:val="22"/>
+          <w:szCs w:val="22"/>
+        </w:rPr>
+        <w:t>in</w:t>
+      </w:r>
+      <w:r>
+        <w:rPr>
+          <w:rFonts w:ascii="Times New Roman" w:hAnsi="Times New Roman" w:cs="Times New Roman"/>
+          <w:i/>
+          <w:spacing w:val="-2"/>
+          <w:sz w:val="22"/>
+          <w:szCs w:val="22"/>
+        </w:rPr>
+        <w:t xml:space="preserve"> Nepal</w:t>
+      </w:r>
+      <w:r>
+        <w:rPr>
+          <w:rFonts w:ascii="Times New Roman" w:hAnsi="Times New Roman" w:cs="Times New Roman"/>
+          <w:spacing w:val="-2"/>
+          <w:sz w:val="22"/>
+          <w:szCs w:val="22"/>
+        </w:rPr>
+        <w:t>.</w:t>
+      </w:r>
+      <w:r>
+        <w:rPr>
+          <w:rFonts w:ascii="Times New Roman" w:hAnsi="Times New Roman" w:cs="Times New Roman"/>
+          <w:spacing w:val="-2"/>
+          <w:sz w:val="22"/>
+          <w:szCs w:val="22"/>
+        </w:rPr>
+        <w:t xml:space="preserve"> </w:t>
+      </w:r>
+      <w:r>
+        <w:rPr>
+          <w:rFonts w:ascii="Times New Roman" w:hAnsi="Times New Roman" w:cs="Times New Roman"/>
+          <w:sz w:val="22"/>
+          <w:szCs w:val="22"/>
+        </w:rPr>
+        <w:t>Kathmandu,</w:t>
+      </w:r>
+      <w:r>
+        <w:rPr>
+          <w:rFonts w:ascii="Times New Roman" w:hAnsi="Times New Roman" w:cs="Times New Roman"/>
           <w:spacing w:val="-3"/>
           <w:sz w:val="22"/>
           <w:szCs w:val="22"/>
@@ -4170,154 +4607,130 @@
       <w:r>
         <w:rPr>
           <w:rFonts w:ascii="Times New Roman" w:hAnsi="Times New Roman" w:cs="Times New Roman"/>
-          <w:i/>
-          <w:sz w:val="22"/>
-          <w:szCs w:val="22"/>
-        </w:rPr>
-        <w:t>An</w:t>
-      </w:r>
-      <w:r>
-        <w:rPr>
-          <w:rFonts w:ascii="Times New Roman" w:hAnsi="Times New Roman" w:cs="Times New Roman"/>
-          <w:i/>
-          <w:spacing w:val="-3"/>
-          <w:sz w:val="22"/>
-          <w:szCs w:val="22"/>
-        </w:rPr>
-        <w:t xml:space="preserve"> </w:t>
-      </w:r>
-      <w:r>
-        <w:rPr>
-          <w:rFonts w:ascii="Times New Roman" w:hAnsi="Times New Roman" w:cs="Times New Roman"/>
-          <w:i/>
-          <w:sz w:val="22"/>
-          <w:szCs w:val="22"/>
-        </w:rPr>
-        <w:t>Assessment</w:t>
-      </w:r>
-      <w:r>
-        <w:rPr>
-          <w:rFonts w:ascii="Times New Roman" w:hAnsi="Times New Roman" w:cs="Times New Roman"/>
-          <w:i/>
+          <w:sz w:val="22"/>
+          <w:szCs w:val="22"/>
+        </w:rPr>
+        <w:t>Bal</w:t>
+      </w:r>
+      <w:r>
+        <w:rPr>
+          <w:rFonts w:ascii="Times New Roman" w:hAnsi="Times New Roman" w:cs="Times New Roman"/>
+          <w:spacing w:val="-4"/>
+          <w:sz w:val="22"/>
+          <w:szCs w:val="22"/>
+        </w:rPr>
+        <w:t xml:space="preserve"> </w:t>
+      </w:r>
+      <w:r>
+        <w:rPr>
+          <w:rFonts w:ascii="Times New Roman" w:hAnsi="Times New Roman" w:cs="Times New Roman"/>
+          <w:sz w:val="22"/>
+          <w:szCs w:val="22"/>
+        </w:rPr>
+        <w:t>Kshetra Nepal,</w:t>
+      </w:r>
+      <w:r>
+        <w:rPr>
+          <w:rFonts w:ascii="Times New Roman" w:hAnsi="Times New Roman" w:cs="Times New Roman"/>
+          <w:spacing w:val="-2"/>
+          <w:sz w:val="22"/>
+          <w:szCs w:val="22"/>
+        </w:rPr>
+        <w:t xml:space="preserve"> </w:t>
+      </w:r>
+      <w:r>
+        <w:rPr>
+          <w:rFonts w:ascii="Times New Roman" w:hAnsi="Times New Roman" w:cs="Times New Roman"/>
+          <w:sz w:val="22"/>
+          <w:szCs w:val="22"/>
+        </w:rPr>
+        <w:t>and</w:t>
+      </w:r>
+      <w:r>
+        <w:rPr>
+          <w:rFonts w:ascii="Times New Roman" w:hAnsi="Times New Roman" w:cs="Times New Roman"/>
+          <w:spacing w:val="-2"/>
+          <w:sz w:val="22"/>
+          <w:szCs w:val="22"/>
+        </w:rPr>
+        <w:t xml:space="preserve"> </w:t>
+      </w:r>
+      <w:r>
+        <w:rPr>
+          <w:rFonts w:ascii="Times New Roman" w:hAnsi="Times New Roman" w:cs="Times New Roman"/>
+          <w:sz w:val="22"/>
+          <w:szCs w:val="22"/>
+        </w:rPr>
+        <w:t>Bank</w:t>
+      </w:r>
+      <w:r>
+        <w:rPr>
+          <w:rFonts w:ascii="Times New Roman" w:hAnsi="Times New Roman" w:cs="Times New Roman"/>
+          <w:spacing w:val="-2"/>
+          <w:sz w:val="22"/>
+          <w:szCs w:val="22"/>
+        </w:rPr>
+        <w:t xml:space="preserve"> </w:t>
+      </w:r>
+      <w:r>
+        <w:rPr>
+          <w:rFonts w:ascii="Times New Roman" w:hAnsi="Times New Roman" w:cs="Times New Roman"/>
+          <w:sz w:val="22"/>
+          <w:szCs w:val="22"/>
+        </w:rPr>
+        <w:t>Information</w:t>
+      </w:r>
+      <w:r>
+        <w:rPr>
+          <w:rFonts w:ascii="Times New Roman" w:hAnsi="Times New Roman" w:cs="Times New Roman"/>
+          <w:spacing w:val="-2"/>
+          <w:sz w:val="22"/>
+          <w:szCs w:val="22"/>
+        </w:rPr>
+        <w:t xml:space="preserve"> </w:t>
+      </w:r>
+      <w:r>
+        <w:rPr>
+          <w:rFonts w:ascii="Times New Roman" w:hAnsi="Times New Roman" w:cs="Times New Roman"/>
+          <w:sz w:val="22"/>
+          <w:szCs w:val="22"/>
+        </w:rPr>
+        <w:t>Centre,</w:t>
+      </w:r>
+      <w:r>
+        <w:rPr>
+          <w:rFonts w:ascii="Times New Roman" w:hAnsi="Times New Roman" w:cs="Times New Roman"/>
+          <w:spacing w:val="-2"/>
+          <w:sz w:val="22"/>
+          <w:szCs w:val="22"/>
+        </w:rPr>
+        <w:t xml:space="preserve"> </w:t>
+      </w:r>
+      <w:r>
+        <w:rPr>
+          <w:rFonts w:ascii="Times New Roman" w:hAnsi="Times New Roman" w:cs="Times New Roman"/>
+          <w:sz w:val="22"/>
+          <w:szCs w:val="22"/>
+        </w:rPr>
+        <w:t>Washington</w:t>
+      </w:r>
+      <w:r>
+        <w:rPr>
+          <w:rFonts w:ascii="Times New Roman" w:hAnsi="Times New Roman" w:cs="Times New Roman"/>
+          <w:spacing w:val="-2"/>
+          <w:sz w:val="22"/>
+          <w:szCs w:val="22"/>
+        </w:rPr>
+        <w:t xml:space="preserve"> </w:t>
+      </w:r>
+      <w:r>
+        <w:rPr>
+          <w:rFonts w:ascii="Times New Roman" w:hAnsi="Times New Roman" w:cs="Times New Roman"/>
           <w:spacing w:val="-5"/>
           <w:sz w:val="22"/>
           <w:szCs w:val="22"/>
         </w:rPr>
-        <w:t xml:space="preserve"> </w:t>
-      </w:r>
-      <w:r>
-        <w:rPr>
-          <w:rFonts w:ascii="Times New Roman" w:hAnsi="Times New Roman" w:cs="Times New Roman"/>
-          <w:i/>
-          <w:sz w:val="22"/>
-          <w:szCs w:val="22"/>
-        </w:rPr>
-        <w:t>in</w:t>
-      </w:r>
-      <w:r>
-        <w:rPr>
-          <w:rFonts w:ascii="Times New Roman" w:hAnsi="Times New Roman" w:cs="Times New Roman"/>
-          <w:i/>
-          <w:spacing w:val="-3"/>
-          <w:sz w:val="22"/>
-          <w:szCs w:val="22"/>
-        </w:rPr>
-        <w:t xml:space="preserve"> </w:t>
-      </w:r>
-      <w:r>
-        <w:rPr>
-          <w:rFonts w:ascii="Times New Roman" w:hAnsi="Times New Roman" w:cs="Times New Roman"/>
-          <w:i/>
-          <w:sz w:val="22"/>
-          <w:szCs w:val="22"/>
-        </w:rPr>
-        <w:t>Kailali, Nepal.</w:t>
-      </w:r>
-      <w:r>
-        <w:rPr>
-          <w:rFonts w:ascii="Times New Roman" w:hAnsi="Times New Roman" w:cs="Times New Roman"/>
-          <w:i/>
-          <w:spacing w:val="-1"/>
-          <w:sz w:val="22"/>
-          <w:szCs w:val="22"/>
-        </w:rPr>
-        <w:t xml:space="preserve"> </w:t>
-      </w:r>
-      <w:r>
-        <w:rPr>
-          <w:rFonts w:ascii="Times New Roman" w:hAnsi="Times New Roman" w:cs="Times New Roman"/>
-          <w:sz w:val="22"/>
-          <w:szCs w:val="22"/>
-        </w:rPr>
-        <w:t>Bal</w:t>
-      </w:r>
-      <w:r>
-        <w:rPr>
-          <w:rFonts w:ascii="Times New Roman" w:hAnsi="Times New Roman" w:cs="Times New Roman"/>
-          <w:spacing w:val="-5"/>
-          <w:sz w:val="22"/>
-          <w:szCs w:val="22"/>
-        </w:rPr>
-        <w:t xml:space="preserve"> </w:t>
-      </w:r>
-      <w:r>
-        <w:rPr>
-          <w:rFonts w:ascii="Times New Roman" w:hAnsi="Times New Roman" w:cs="Times New Roman"/>
-          <w:sz w:val="22"/>
-          <w:szCs w:val="22"/>
-        </w:rPr>
-        <w:t>Kshetra</w:t>
-      </w:r>
-      <w:r>
-        <w:rPr>
-          <w:rFonts w:ascii="Times New Roman" w:hAnsi="Times New Roman" w:cs="Times New Roman"/>
-          <w:spacing w:val="-1"/>
-          <w:sz w:val="22"/>
-          <w:szCs w:val="22"/>
-        </w:rPr>
-        <w:t xml:space="preserve"> </w:t>
-      </w:r>
-      <w:r>
-        <w:rPr>
-          <w:rFonts w:ascii="Times New Roman" w:hAnsi="Times New Roman" w:cs="Times New Roman"/>
-          <w:sz w:val="22"/>
-          <w:szCs w:val="22"/>
-        </w:rPr>
-        <w:t>Nepal</w:t>
-      </w:r>
-      <w:r>
-        <w:rPr>
-          <w:rFonts w:ascii="Times New Roman" w:hAnsi="Times New Roman" w:cs="Times New Roman"/>
-          <w:spacing w:val="-5"/>
-          <w:sz w:val="22"/>
-          <w:szCs w:val="22"/>
-        </w:rPr>
-        <w:t xml:space="preserve"> </w:t>
-      </w:r>
-      <w:r>
-        <w:rPr>
-          <w:rFonts w:ascii="Times New Roman" w:hAnsi="Times New Roman" w:cs="Times New Roman"/>
-          <w:sz w:val="22"/>
-          <w:szCs w:val="22"/>
-        </w:rPr>
-        <w:t>and</w:t>
-      </w:r>
-      <w:r>
-        <w:rPr>
-          <w:rFonts w:ascii="Times New Roman" w:hAnsi="Times New Roman" w:cs="Times New Roman"/>
-          <w:spacing w:val="-3"/>
-          <w:sz w:val="22"/>
-          <w:szCs w:val="22"/>
-        </w:rPr>
-        <w:t xml:space="preserve"> </w:t>
-      </w:r>
-      <w:r>
-        <w:rPr>
-          <w:rFonts w:ascii="Times New Roman" w:hAnsi="Times New Roman" w:cs="Times New Roman"/>
-          <w:sz w:val="22"/>
-          <w:szCs w:val="22"/>
-        </w:rPr>
-        <w:t>Bank Information Centre, Washington DC.</w:t>
+        <w:t>DC.</w:t>
       </w:r>
     </w:p>
     <w:p>
@@ -4333,6 +4746,262 @@
       <w:r>
         <w:rPr>
           <w:rFonts w:ascii="Times New Roman" w:hAnsi="Times New Roman" w:cs="Times New Roman"/>
+          <w:b/>
+          <w:sz w:val="22"/>
+          <w:szCs w:val="22"/>
+        </w:rPr>
+        <w:t>Luitel,</w:t>
+      </w:r>
+      <w:r>
+        <w:rPr>
+          <w:rFonts w:ascii="Times New Roman" w:hAnsi="Times New Roman" w:cs="Times New Roman"/>
+          <w:b/>
+          <w:spacing w:val="-3"/>
+          <w:sz w:val="22"/>
+          <w:szCs w:val="22"/>
+        </w:rPr>
+        <w:t xml:space="preserve"> </w:t>
+      </w:r>
+      <w:r>
+        <w:rPr>
+          <w:rFonts w:ascii="Times New Roman" w:hAnsi="Times New Roman" w:cs="Times New Roman"/>
+          <w:b/>
+          <w:sz w:val="22"/>
+          <w:szCs w:val="22"/>
+        </w:rPr>
+        <w:t>B.</w:t>
+      </w:r>
+      <w:r>
+        <w:rPr>
+          <w:rFonts w:ascii="Times New Roman" w:hAnsi="Times New Roman" w:cs="Times New Roman"/>
+          <w:b/>
+          <w:spacing w:val="-2"/>
+          <w:sz w:val="22"/>
+          <w:szCs w:val="22"/>
+        </w:rPr>
+        <w:t xml:space="preserve"> </w:t>
+      </w:r>
+      <w:r>
+        <w:rPr>
+          <w:rFonts w:ascii="Times New Roman" w:hAnsi="Times New Roman" w:cs="Times New Roman"/>
+          <w:sz w:val="22"/>
+          <w:szCs w:val="22"/>
+        </w:rPr>
+        <w:t>(2019).</w:t>
+      </w:r>
+      <w:r>
+        <w:rPr>
+          <w:rFonts w:ascii="Times New Roman" w:hAnsi="Times New Roman" w:cs="Times New Roman"/>
+          <w:spacing w:val="-2"/>
+          <w:sz w:val="22"/>
+          <w:szCs w:val="22"/>
+        </w:rPr>
+        <w:t xml:space="preserve"> </w:t>
+      </w:r>
+      <w:r>
+        <w:rPr>
+          <w:rFonts w:ascii="Times New Roman" w:hAnsi="Times New Roman" w:cs="Times New Roman"/>
+          <w:i/>
+          <w:sz w:val="22"/>
+          <w:szCs w:val="22"/>
+        </w:rPr>
+        <w:t>Child</w:t>
+      </w:r>
+      <w:r>
+        <w:rPr>
+          <w:rFonts w:ascii="Times New Roman" w:hAnsi="Times New Roman" w:cs="Times New Roman"/>
+          <w:i/>
+          <w:spacing w:val="-3"/>
+          <w:sz w:val="22"/>
+          <w:szCs w:val="22"/>
+        </w:rPr>
+        <w:t xml:space="preserve"> </w:t>
+      </w:r>
+      <w:r>
+        <w:rPr>
+          <w:rFonts w:ascii="Times New Roman" w:hAnsi="Times New Roman" w:cs="Times New Roman"/>
+          <w:i/>
+          <w:sz w:val="22"/>
+          <w:szCs w:val="22"/>
+        </w:rPr>
+        <w:t>Rights:</w:t>
+      </w:r>
+      <w:r>
+        <w:rPr>
+          <w:rFonts w:ascii="Times New Roman" w:hAnsi="Times New Roman" w:cs="Times New Roman"/>
+          <w:i/>
+          <w:spacing w:val="-3"/>
+          <w:sz w:val="22"/>
+          <w:szCs w:val="22"/>
+        </w:rPr>
+        <w:t xml:space="preserve"> </w:t>
+      </w:r>
+      <w:r>
+        <w:rPr>
+          <w:rFonts w:ascii="Times New Roman" w:hAnsi="Times New Roman" w:cs="Times New Roman"/>
+          <w:i/>
+          <w:sz w:val="22"/>
+          <w:szCs w:val="22"/>
+        </w:rPr>
+        <w:t>An</w:t>
+      </w:r>
+      <w:r>
+        <w:rPr>
+          <w:rFonts w:ascii="Times New Roman" w:hAnsi="Times New Roman" w:cs="Times New Roman"/>
+          <w:i/>
+          <w:spacing w:val="-3"/>
+          <w:sz w:val="22"/>
+          <w:szCs w:val="22"/>
+        </w:rPr>
+        <w:t xml:space="preserve"> </w:t>
+      </w:r>
+      <w:r>
+        <w:rPr>
+          <w:rFonts w:ascii="Times New Roman" w:hAnsi="Times New Roman" w:cs="Times New Roman"/>
+          <w:i/>
+          <w:sz w:val="22"/>
+          <w:szCs w:val="22"/>
+        </w:rPr>
+        <w:t>Assessment</w:t>
+      </w:r>
+      <w:r>
+        <w:rPr>
+          <w:rFonts w:ascii="Times New Roman" w:hAnsi="Times New Roman" w:cs="Times New Roman"/>
+          <w:i/>
+          <w:spacing w:val="-5"/>
+          <w:sz w:val="22"/>
+          <w:szCs w:val="22"/>
+        </w:rPr>
+        <w:t xml:space="preserve"> </w:t>
+      </w:r>
+      <w:r>
+        <w:rPr>
+          <w:rFonts w:ascii="Times New Roman" w:hAnsi="Times New Roman" w:cs="Times New Roman"/>
+          <w:i/>
+          <w:sz w:val="22"/>
+          <w:szCs w:val="22"/>
+        </w:rPr>
+        <w:t>in</w:t>
+      </w:r>
+      <w:r>
+        <w:rPr>
+          <w:rFonts w:ascii="Times New Roman" w:hAnsi="Times New Roman" w:cs="Times New Roman"/>
+          <w:i/>
+          <w:spacing w:val="-3"/>
+          <w:sz w:val="22"/>
+          <w:szCs w:val="22"/>
+        </w:rPr>
+        <w:t xml:space="preserve"> </w:t>
+      </w:r>
+      <w:r>
+        <w:rPr>
+          <w:rFonts w:ascii="Times New Roman" w:hAnsi="Times New Roman" w:cs="Times New Roman"/>
+          <w:i/>
+          <w:sz w:val="22"/>
+          <w:szCs w:val="22"/>
+        </w:rPr>
+        <w:t>Kailali, Nepal.</w:t>
+      </w:r>
+      <w:r>
+        <w:rPr>
+          <w:rFonts w:ascii="Times New Roman" w:hAnsi="Times New Roman" w:cs="Times New Roman"/>
+          <w:i/>
+          <w:spacing w:val="-1"/>
+          <w:sz w:val="22"/>
+          <w:szCs w:val="22"/>
+        </w:rPr>
+        <w:t xml:space="preserve"> </w:t>
+      </w:r>
+      <w:r>
+        <w:rPr>
+          <w:rFonts w:ascii="Times New Roman" w:hAnsi="Times New Roman" w:cs="Times New Roman"/>
+          <w:sz w:val="22"/>
+          <w:szCs w:val="22"/>
+        </w:rPr>
+        <w:t>Bal</w:t>
+      </w:r>
+      <w:r>
+        <w:rPr>
+          <w:rFonts w:ascii="Times New Roman" w:hAnsi="Times New Roman" w:cs="Times New Roman"/>
+          <w:spacing w:val="-5"/>
+          <w:sz w:val="22"/>
+          <w:szCs w:val="22"/>
+        </w:rPr>
+        <w:t xml:space="preserve"> </w:t>
+      </w:r>
+      <w:r>
+        <w:rPr>
+          <w:rFonts w:ascii="Times New Roman" w:hAnsi="Times New Roman" w:cs="Times New Roman"/>
+          <w:sz w:val="22"/>
+          <w:szCs w:val="22"/>
+        </w:rPr>
+        <w:t>Kshetra</w:t>
+      </w:r>
+      <w:r>
+        <w:rPr>
+          <w:rFonts w:ascii="Times New Roman" w:hAnsi="Times New Roman" w:cs="Times New Roman"/>
+          <w:spacing w:val="-1"/>
+          <w:sz w:val="22"/>
+          <w:szCs w:val="22"/>
+        </w:rPr>
+        <w:t xml:space="preserve"> </w:t>
+      </w:r>
+      <w:r>
+        <w:rPr>
+          <w:rFonts w:ascii="Times New Roman" w:hAnsi="Times New Roman" w:cs="Times New Roman"/>
+          <w:sz w:val="22"/>
+          <w:szCs w:val="22"/>
+        </w:rPr>
+        <w:t>Nepal</w:t>
+      </w:r>
+      <w:r>
+        <w:rPr>
+          <w:rFonts w:ascii="Times New Roman" w:hAnsi="Times New Roman" w:cs="Times New Roman"/>
+          <w:spacing w:val="-5"/>
+          <w:sz w:val="22"/>
+          <w:szCs w:val="22"/>
+        </w:rPr>
+        <w:t xml:space="preserve"> </w:t>
+      </w:r>
+      <w:r>
+        <w:rPr>
+          <w:rFonts w:ascii="Times New Roman" w:hAnsi="Times New Roman" w:cs="Times New Roman"/>
+          <w:sz w:val="22"/>
+          <w:szCs w:val="22"/>
+        </w:rPr>
+        <w:t>and</w:t>
+      </w:r>
+      <w:r>
+        <w:rPr>
+          <w:rFonts w:ascii="Times New Roman" w:hAnsi="Times New Roman" w:cs="Times New Roman"/>
+          <w:spacing w:val="-3"/>
+          <w:sz w:val="22"/>
+          <w:szCs w:val="22"/>
+        </w:rPr>
+        <w:t xml:space="preserve"> </w:t>
+      </w:r>
+      <w:r>
+        <w:rPr>
+          <w:rFonts w:ascii="Times New Roman" w:hAnsi="Times New Roman" w:cs="Times New Roman"/>
+          <w:sz w:val="22"/>
+          <w:szCs w:val="22"/>
+        </w:rPr>
+        <w:t>Bank Information Centre, Washington DC.</w:t>
+      </w:r>
+    </w:p>
+    <w:p>
+      <w:pPr>
+        <w:spacing w:after="120" w:line="240" w:lineRule="auto"/>
+        <w:ind w:left="1440" w:hanging="720"/>
+        <w:rPr>
+          <w:rFonts w:ascii="Times New Roman" w:hAnsi="Times New Roman" w:cs="Times New Roman"/>
+          <w:sz w:val="22"/>
+          <w:szCs w:val="22"/>
+        </w:rPr>
+      </w:pPr>
+      <w:r>
+        <w:rPr>
+          <w:rFonts w:ascii="Times New Roman" w:hAnsi="Times New Roman" w:cs="Times New Roman"/>
           <w:sz w:val="22"/>
           <w:szCs w:val="22"/>
         </w:rPr>
@@ -4561,7 +5230,7 @@
     </w:p>
     <w:p>
       <w:pPr>
-        <w:spacing w:after="120" w:line="240" w:lineRule="auto"/>
+        <w:spacing w:after="0" w:line="240" w:lineRule="auto"/>
         <w:ind w:left="1440" w:hanging="720"/>
         <w:rPr>
           <w:rFonts w:ascii="Times New Roman" w:hAnsi="Times New Roman" w:cs="Times New Roman"/>
@@ -6045,7 +6714,42 @@
           <w:sz w:val="22"/>
           <w:szCs w:val="22"/>
         </w:rPr>
+        <w:lastRenderedPageBreak/>
         <w:t>Advising students, guiding academic and professional development, and fostering a supportive and stimulating learning environment.</w:t>
+      </w:r>
+    </w:p>
+    <w:p>
+      <w:pPr>
+        <w:pStyle w:val="ListParagraph"/>
+        <w:numPr>
+          <w:ilvl w:val="0"/>
+          <w:numId w:val="15"/>
+        </w:numPr>
+        <w:spacing w:after="120" w:line="240" w:lineRule="auto"/>
+        <w:contextualSpacing w:val="0"/>
+        <w:rPr>
+          <w:rFonts w:ascii="Times New Roman" w:hAnsi="Times New Roman" w:cs="Times New Roman"/>
+          <w:sz w:val="22"/>
+          <w:szCs w:val="22"/>
+        </w:rPr>
+      </w:pPr>
+      <w:proofErr w:type="gramStart"/>
+      <w:r>
+        <w:rPr>
+          <w:rFonts w:ascii="Times New Roman" w:hAnsi="Times New Roman" w:cs="Times New Roman"/>
+          <w:sz w:val="22"/>
+          <w:szCs w:val="22"/>
+        </w:rPr>
+        <w:t>Taught</w:t>
+      </w:r>
+      <w:proofErr w:type="gramEnd"/>
+      <w:r>
+        <w:rPr>
+          <w:rFonts w:ascii="Times New Roman" w:hAnsi="Times New Roman" w:cs="Times New Roman"/>
+          <w:sz w:val="22"/>
+          <w:szCs w:val="22"/>
+        </w:rPr>
+        <w:t xml:space="preserve"> approximately 450 undergraduate and graduate students across 10 courses and an average 90% graduate rate and 95% student satisfaction score.</w:t>
       </w:r>
     </w:p>
     <w:p>
@@ -6888,7 +7592,6 @@
           <w:sz w:val="22"/>
           <w:szCs w:val="22"/>
         </w:rPr>
-        <w:lastRenderedPageBreak/>
         <w:t xml:space="preserve">IMM 205: </w:t>
       </w:r>
       <w:r>
@@ -7051,7 +7754,19 @@
           <w:spacing w:val="-4"/>
         </w:rPr>
         <w:tab/>
-        <w:t>Educational Achievement Scholarship. College of Education and Humen Development.</w:t>
+        <w:t xml:space="preserve">Educational Achievement Scholarship. College of Education and </w:t>
+      </w:r>
+      <w:r>
+        <w:rPr>
+          <w:spacing w:val="-4"/>
+        </w:rPr>
+        <w:t>Human</w:t>
+      </w:r>
+      <w:r>
+        <w:rPr>
+          <w:spacing w:val="-4"/>
+        </w:rPr>
+        <w:t xml:space="preserve"> Development.</w:t>
       </w:r>
     </w:p>
     <w:p>
@@ -7250,7 +7965,16 @@
         <w:tab/>
       </w:r>
       <w:r>
-        <w:t>Merit</w:t>
+        <w:t>Merit-based,</w:t>
+      </w:r>
+      <w:r>
+        <w:t xml:space="preserve"> </w:t>
+      </w:r>
+      <w:r>
+        <w:t>fully</w:t>
+      </w:r>
+      <w:r>
+        <w:t xml:space="preserve"> funded doctoral study</w:t>
       </w:r>
       <w:r>
         <w:rPr>
@@ -7259,7 +7983,10 @@
         <w:t xml:space="preserve"> </w:t>
       </w:r>
       <w:r>
-        <w:t>Fellowship,</w:t>
+        <w:t>f</w:t>
+      </w:r>
+      <w:r>
+        <w:t>ellowship,</w:t>
       </w:r>
       <w:r>
         <w:rPr>
@@ -7661,7 +8388,11 @@
         <w:t xml:space="preserve"> </w:t>
       </w:r>
       <w:r>
-        <w:t xml:space="preserve">Leadership Department Travel Grant to present at STAR Global Conference, Nepal, </w:t>
+        <w:t xml:space="preserve">Leadership </w:t>
+      </w:r>
+      <w:r>
+        <w:lastRenderedPageBreak/>
+        <w:t xml:space="preserve">Department Travel Grant to present at STAR Global Conference, Nepal, </w:t>
       </w:r>
       <w:r>
         <w:rPr>
@@ -8891,7 +9622,6 @@
           <w:sz w:val="22"/>
           <w:szCs w:val="22"/>
         </w:rPr>
-        <w:lastRenderedPageBreak/>
         <w:t>Editorial</w:t>
       </w:r>
     </w:p>
@@ -9435,6 +10165,28 @@
     </w:p>
     <w:p>
       <w:pPr>
+        <w:spacing w:after="0" w:line="240" w:lineRule="auto"/>
+        <w:ind w:left="720"/>
+        <w:rPr>
+          <w:rFonts w:ascii="Times New Roman" w:hAnsi="Times New Roman" w:cs="Times New Roman"/>
+          <w:sz w:val="22"/>
+          <w:szCs w:val="22"/>
+        </w:rPr>
+      </w:pPr>
+    </w:p>
+    <w:p>
+      <w:pPr>
+        <w:spacing w:after="0" w:line="240" w:lineRule="auto"/>
+        <w:ind w:left="720"/>
+        <w:rPr>
+          <w:rFonts w:ascii="Times New Roman" w:hAnsi="Times New Roman" w:cs="Times New Roman"/>
+          <w:sz w:val="22"/>
+          <w:szCs w:val="22"/>
+        </w:rPr>
+      </w:pPr>
+    </w:p>
+    <w:p>
+      <w:pPr>
         <w:pBdr>
           <w:bottom w:val="single" w:sz="6" w:space="1" w:color="auto"/>
         </w:pBdr>
@@ -9448,436 +10200,6 @@
     </w:p>
     <w:p>
       <w:pPr>
-        <w:pStyle w:val="Heading1"/>
-      </w:pPr>
-      <w:r>
-        <w:t>TECHNICAL SKILLS</w:t>
-      </w:r>
-    </w:p>
-    <w:p>
-      <w:pPr>
-        <w:pStyle w:val="ListParagraph"/>
-        <w:numPr>
-          <w:ilvl w:val="0"/>
-          <w:numId w:val="16"/>
-        </w:numPr>
-        <w:spacing w:after="80" w:line="240" w:lineRule="auto"/>
-        <w:contextualSpacing w:val="0"/>
-        <w:rPr>
-          <w:rFonts w:ascii="Times New Roman" w:hAnsi="Times New Roman"/>
-          <w:sz w:val="22"/>
-          <w:szCs w:val="22"/>
-        </w:rPr>
-      </w:pPr>
-      <w:r>
-        <w:rPr>
-          <w:rFonts w:ascii="Times New Roman" w:hAnsi="Times New Roman"/>
-          <w:b/>
-          <w:bCs/>
-          <w:sz w:val="22"/>
-          <w:szCs w:val="22"/>
-        </w:rPr>
-        <w:t>Program Strategy &amp; Collaboration</w:t>
-      </w:r>
-      <w:r>
-        <w:rPr>
-          <w:rFonts w:ascii="Times New Roman" w:hAnsi="Times New Roman"/>
-          <w:sz w:val="22"/>
-          <w:szCs w:val="22"/>
-        </w:rPr>
-        <w:t>: Design, evaluation, grant writing, project management</w:t>
-      </w:r>
-      <w:r>
-        <w:rPr>
-          <w:rFonts w:ascii="Times New Roman" w:hAnsi="Times New Roman"/>
-          <w:sz w:val="22"/>
-          <w:szCs w:val="22"/>
-        </w:rPr>
-        <w:t>, cross-functional teamwork, stakeholder communication.</w:t>
-      </w:r>
-    </w:p>
-    <w:p>
-      <w:pPr>
-        <w:pStyle w:val="ListParagraph"/>
-        <w:numPr>
-          <w:ilvl w:val="0"/>
-          <w:numId w:val="16"/>
-        </w:numPr>
-        <w:spacing w:after="80" w:line="240" w:lineRule="auto"/>
-        <w:contextualSpacing w:val="0"/>
-        <w:rPr>
-          <w:rFonts w:ascii="Times New Roman" w:hAnsi="Times New Roman"/>
-          <w:sz w:val="22"/>
-          <w:szCs w:val="22"/>
-        </w:rPr>
-      </w:pPr>
-      <w:r>
-        <w:rPr>
-          <w:rFonts w:ascii="Times New Roman" w:hAnsi="Times New Roman"/>
-          <w:b/>
-          <w:bCs/>
-          <w:sz w:val="22"/>
-          <w:szCs w:val="22"/>
-        </w:rPr>
-        <w:t>Methods &amp; Evaluation</w:t>
-      </w:r>
-      <w:r>
-        <w:rPr>
-          <w:rFonts w:ascii="Times New Roman" w:hAnsi="Times New Roman"/>
-          <w:sz w:val="22"/>
-          <w:szCs w:val="22"/>
-        </w:rPr>
-        <w:t>: Quantitative, Qualitative, Mixed methods, Monitoring &amp; Evaluation, and impact assessment.</w:t>
-      </w:r>
-    </w:p>
-    <w:p>
-      <w:pPr>
-        <w:pStyle w:val="ListParagraph"/>
-        <w:numPr>
-          <w:ilvl w:val="0"/>
-          <w:numId w:val="16"/>
-        </w:numPr>
-        <w:spacing w:after="80" w:line="240" w:lineRule="auto"/>
-        <w:contextualSpacing w:val="0"/>
-        <w:rPr>
-          <w:rFonts w:ascii="Times New Roman" w:hAnsi="Times New Roman"/>
-          <w:sz w:val="22"/>
-          <w:szCs w:val="22"/>
-        </w:rPr>
-      </w:pPr>
-      <w:r>
-        <w:rPr>
-          <w:rFonts w:ascii="Times New Roman" w:hAnsi="Times New Roman"/>
-          <w:b/>
-          <w:bCs/>
-          <w:sz w:val="22"/>
-          <w:szCs w:val="22"/>
-        </w:rPr>
-        <w:t>Research</w:t>
-      </w:r>
-      <w:r>
-        <w:rPr>
-          <w:rFonts w:ascii="Times New Roman" w:hAnsi="Times New Roman"/>
-          <w:sz w:val="22"/>
-          <w:szCs w:val="22"/>
-        </w:rPr>
-        <w:t>:</w:t>
-      </w:r>
-      <w:r>
-        <w:rPr>
-          <w:rFonts w:ascii="Times New Roman" w:hAnsi="Times New Roman"/>
-          <w:sz w:val="22"/>
-          <w:szCs w:val="22"/>
-        </w:rPr>
-        <w:t xml:space="preserve"> Literature review, Research Design, Data Collection, Data Analysis</w:t>
-      </w:r>
-    </w:p>
-    <w:p>
-      <w:pPr>
-        <w:pStyle w:val="ListParagraph"/>
-        <w:numPr>
-          <w:ilvl w:val="0"/>
-          <w:numId w:val="16"/>
-        </w:numPr>
-        <w:spacing w:after="80" w:line="240" w:lineRule="auto"/>
-        <w:contextualSpacing w:val="0"/>
-        <w:rPr>
-          <w:rFonts w:ascii="Times New Roman" w:hAnsi="Times New Roman"/>
-          <w:sz w:val="22"/>
-          <w:szCs w:val="22"/>
-        </w:rPr>
-      </w:pPr>
-      <w:r>
-        <w:rPr>
-          <w:rFonts w:ascii="Times New Roman" w:hAnsi="Times New Roman"/>
-          <w:b/>
-          <w:bCs/>
-          <w:sz w:val="22"/>
-          <w:szCs w:val="22"/>
-        </w:rPr>
-        <w:t>Qualitative data</w:t>
-      </w:r>
-      <w:r>
-        <w:rPr>
-          <w:rFonts w:ascii="Times New Roman" w:hAnsi="Times New Roman"/>
-          <w:sz w:val="22"/>
-          <w:szCs w:val="22"/>
-        </w:rPr>
-        <w:t>:</w:t>
-      </w:r>
-      <w:r>
-        <w:rPr>
-          <w:rFonts w:ascii="Times New Roman" w:hAnsi="Times New Roman"/>
-          <w:sz w:val="22"/>
-          <w:szCs w:val="22"/>
-        </w:rPr>
-        <w:t xml:space="preserve"> Interviewing, Focus Group Facilitation, Observation, Field notes taking, Coding, Thematic analysis</w:t>
-      </w:r>
-    </w:p>
-    <w:p>
-      <w:pPr>
-        <w:pStyle w:val="ListParagraph"/>
-        <w:numPr>
-          <w:ilvl w:val="0"/>
-          <w:numId w:val="16"/>
-        </w:numPr>
-        <w:spacing w:after="80" w:line="240" w:lineRule="auto"/>
-        <w:contextualSpacing w:val="0"/>
-        <w:rPr>
-          <w:rFonts w:ascii="Times New Roman" w:hAnsi="Times New Roman"/>
-          <w:sz w:val="22"/>
-          <w:szCs w:val="22"/>
-        </w:rPr>
-      </w:pPr>
-      <w:r>
-        <w:rPr>
-          <w:rFonts w:ascii="Times New Roman" w:hAnsi="Times New Roman"/>
-          <w:b/>
-          <w:bCs/>
-          <w:sz w:val="22"/>
-          <w:szCs w:val="22"/>
-        </w:rPr>
-        <w:t>Data Analysis</w:t>
-      </w:r>
-      <w:r>
-        <w:rPr>
-          <w:rFonts w:ascii="Times New Roman" w:hAnsi="Times New Roman"/>
-          <w:sz w:val="22"/>
-          <w:szCs w:val="22"/>
-        </w:rPr>
-        <w:t>: Descriptive Analysis, Inferential Analysis, Hierarchical Linear Modeling, Multivariate Analysis, Machine Learning, Neural Network</w:t>
-      </w:r>
-      <w:r>
-        <w:rPr>
-          <w:rFonts w:ascii="Times New Roman" w:hAnsi="Times New Roman"/>
-          <w:sz w:val="22"/>
-          <w:szCs w:val="22"/>
-        </w:rPr>
-        <w:t>, Deep Learning</w:t>
-      </w:r>
-    </w:p>
-    <w:p>
-      <w:pPr>
-        <w:pStyle w:val="ListParagraph"/>
-        <w:numPr>
-          <w:ilvl w:val="0"/>
-          <w:numId w:val="16"/>
-        </w:numPr>
-        <w:spacing w:after="80" w:line="240" w:lineRule="auto"/>
-        <w:contextualSpacing w:val="0"/>
-        <w:rPr>
-          <w:rFonts w:ascii="Times New Roman" w:hAnsi="Times New Roman"/>
-          <w:sz w:val="22"/>
-          <w:szCs w:val="22"/>
-        </w:rPr>
-      </w:pPr>
-      <w:r>
-        <w:rPr>
-          <w:rFonts w:ascii="Times New Roman" w:hAnsi="Times New Roman"/>
-          <w:b/>
-          <w:bCs/>
-          <w:sz w:val="22"/>
-          <w:szCs w:val="22"/>
-        </w:rPr>
-        <w:t>Analytical Tools</w:t>
-      </w:r>
-      <w:r>
-        <w:rPr>
-          <w:rFonts w:ascii="Times New Roman" w:hAnsi="Times New Roman"/>
-          <w:sz w:val="22"/>
-          <w:szCs w:val="22"/>
-        </w:rPr>
-        <w:t>: Skilled in R, Python, SQL, Tableau, Power BI, SPSS, JAMOVI</w:t>
-      </w:r>
-    </w:p>
-    <w:p>
-      <w:pPr>
-        <w:pStyle w:val="ListParagraph"/>
-        <w:numPr>
-          <w:ilvl w:val="0"/>
-          <w:numId w:val="16"/>
-        </w:numPr>
-        <w:spacing w:after="80" w:line="240" w:lineRule="auto"/>
-        <w:contextualSpacing w:val="0"/>
-        <w:rPr>
-          <w:rFonts w:ascii="Times New Roman" w:hAnsi="Times New Roman"/>
-          <w:sz w:val="22"/>
-          <w:szCs w:val="22"/>
-        </w:rPr>
-      </w:pPr>
-      <w:r>
-        <w:rPr>
-          <w:rFonts w:ascii="Times New Roman" w:hAnsi="Times New Roman"/>
-          <w:b/>
-          <w:bCs/>
-          <w:sz w:val="22"/>
-          <w:szCs w:val="22"/>
-        </w:rPr>
-        <w:t>Survey</w:t>
-      </w:r>
-      <w:r>
-        <w:rPr>
-          <w:rFonts w:ascii="Times New Roman" w:hAnsi="Times New Roman"/>
-          <w:b/>
-          <w:bCs/>
-          <w:sz w:val="22"/>
-          <w:szCs w:val="22"/>
-        </w:rPr>
-        <w:t xml:space="preserve"> Tools</w:t>
-      </w:r>
-      <w:r>
-        <w:rPr>
-          <w:rFonts w:ascii="Times New Roman" w:hAnsi="Times New Roman"/>
-          <w:sz w:val="22"/>
-          <w:szCs w:val="22"/>
-        </w:rPr>
-        <w:t>: Qualtrics, KoBo Toolbox, CSPro.</w:t>
-      </w:r>
-    </w:p>
-    <w:p>
-      <w:pPr>
-        <w:pStyle w:val="ListParagraph"/>
-        <w:numPr>
-          <w:ilvl w:val="0"/>
-          <w:numId w:val="16"/>
-        </w:numPr>
-        <w:spacing w:after="80" w:line="240" w:lineRule="auto"/>
-        <w:contextualSpacing w:val="0"/>
-        <w:rPr>
-          <w:rFonts w:ascii="Times New Roman" w:hAnsi="Times New Roman"/>
-          <w:sz w:val="22"/>
-          <w:szCs w:val="22"/>
-        </w:rPr>
-      </w:pPr>
-      <w:r>
-        <w:rPr>
-          <w:rFonts w:ascii="Times New Roman" w:hAnsi="Times New Roman"/>
-          <w:b/>
-          <w:bCs/>
-          <w:sz w:val="22"/>
-          <w:szCs w:val="22"/>
-        </w:rPr>
-        <w:t xml:space="preserve">Educational Datasets: </w:t>
-      </w:r>
-      <w:r>
-        <w:rPr>
-          <w:rFonts w:ascii="Times New Roman" w:hAnsi="Times New Roman"/>
-          <w:sz w:val="22"/>
-          <w:szCs w:val="22"/>
-        </w:rPr>
-        <w:t>Skilled in using large-scale federal datasets</w:t>
-      </w:r>
-      <w:r>
-        <w:rPr>
-          <w:rFonts w:ascii="Times New Roman" w:hAnsi="Times New Roman"/>
-          <w:sz w:val="22"/>
-          <w:szCs w:val="22"/>
-        </w:rPr>
-        <w:t>,</w:t>
-      </w:r>
-      <w:r>
-        <w:rPr>
-          <w:rFonts w:ascii="Times New Roman" w:hAnsi="Times New Roman"/>
-          <w:sz w:val="22"/>
-          <w:szCs w:val="22"/>
-        </w:rPr>
-        <w:t xml:space="preserve"> NPSAS</w:t>
-      </w:r>
-      <w:r>
-        <w:rPr>
-          <w:rFonts w:ascii="Times New Roman" w:hAnsi="Times New Roman"/>
-          <w:sz w:val="22"/>
-          <w:szCs w:val="22"/>
-        </w:rPr>
-        <w:t xml:space="preserve"> &amp;</w:t>
-      </w:r>
-      <w:r>
-        <w:rPr>
-          <w:rFonts w:ascii="Times New Roman" w:hAnsi="Times New Roman"/>
-          <w:sz w:val="22"/>
-          <w:szCs w:val="22"/>
-        </w:rPr>
-        <w:t xml:space="preserve"> IPEDS</w:t>
-      </w:r>
-    </w:p>
-    <w:p>
-      <w:pPr>
-        <w:pStyle w:val="ListParagraph"/>
-        <w:numPr>
-          <w:ilvl w:val="0"/>
-          <w:numId w:val="16"/>
-        </w:numPr>
-        <w:spacing w:after="80" w:line="240" w:lineRule="auto"/>
-        <w:contextualSpacing w:val="0"/>
-        <w:rPr>
-          <w:rFonts w:ascii="Times New Roman" w:hAnsi="Times New Roman"/>
-          <w:sz w:val="22"/>
-          <w:szCs w:val="22"/>
-        </w:rPr>
-      </w:pPr>
-      <w:r>
-        <w:rPr>
-          <w:rFonts w:ascii="Times New Roman" w:hAnsi="Times New Roman"/>
-          <w:b/>
-          <w:bCs/>
-          <w:sz w:val="22"/>
-          <w:szCs w:val="22"/>
-        </w:rPr>
-        <w:t>Productivity Tools</w:t>
-      </w:r>
-      <w:r>
-        <w:rPr>
-          <w:rFonts w:ascii="Times New Roman" w:hAnsi="Times New Roman"/>
-          <w:sz w:val="22"/>
-          <w:szCs w:val="22"/>
-        </w:rPr>
-        <w:t>: Proficient in reporting, MS Office 365 Suite, and Google Workspace.</w:t>
-      </w:r>
-    </w:p>
-    <w:p>
-      <w:pPr>
-        <w:pStyle w:val="ListParagraph"/>
-        <w:numPr>
-          <w:ilvl w:val="0"/>
-          <w:numId w:val="16"/>
-        </w:numPr>
-        <w:spacing w:after="80" w:line="240" w:lineRule="auto"/>
-        <w:contextualSpacing w:val="0"/>
-        <w:rPr>
-          <w:rFonts w:ascii="Times New Roman" w:hAnsi="Times New Roman"/>
-          <w:sz w:val="22"/>
-          <w:szCs w:val="22"/>
-        </w:rPr>
-      </w:pPr>
-      <w:r>
-        <w:rPr>
-          <w:rFonts w:ascii="Times New Roman" w:hAnsi="Times New Roman"/>
-          <w:b/>
-          <w:bCs/>
-          <w:sz w:val="22"/>
-          <w:szCs w:val="22"/>
-        </w:rPr>
-        <w:t>Learning Management System (LMS)</w:t>
-      </w:r>
-      <w:r>
-        <w:rPr>
-          <w:rFonts w:ascii="Times New Roman" w:hAnsi="Times New Roman"/>
-          <w:sz w:val="22"/>
-          <w:szCs w:val="22"/>
-        </w:rPr>
-        <w:t>:</w:t>
-      </w:r>
-      <w:r>
-        <w:rPr>
-          <w:rFonts w:ascii="Times New Roman" w:hAnsi="Times New Roman"/>
-          <w:sz w:val="22"/>
-          <w:szCs w:val="22"/>
-        </w:rPr>
-        <w:t xml:space="preserve"> Canvas and Blackboard</w:t>
-      </w:r>
-    </w:p>
-    <w:p>
-      <w:pPr>
         <w:pBdr>
           <w:bottom w:val="single" w:sz="6" w:space="1" w:color="auto"/>
         </w:pBdr>
@@ -9985,7 +10307,6 @@
           <w:sz w:val="22"/>
           <w:szCs w:val="22"/>
         </w:rPr>
-        <w:lastRenderedPageBreak/>
         <w:t>2018 June</w:t>
       </w:r>
       <w:r>
@@ -10787,6 +11108,16 @@
         </w:rPr>
         <w:t>Southwest Educational Research Association (SERA)</w:t>
       </w:r>
+    </w:p>
+    <w:p>
+      <w:pPr>
+        <w:spacing w:after="120" w:line="240" w:lineRule="auto"/>
+        <w:rPr>
+          <w:rFonts w:ascii="Times New Roman" w:hAnsi="Times New Roman" w:cs="Times New Roman"/>
+          <w:sz w:val="22"/>
+          <w:szCs w:val="22"/>
+        </w:rPr>
+      </w:pPr>
     </w:p>
     <w:p>
       <w:pPr>
@@ -11723,6 +12054,119 @@
     </w:lvl>
   </w:abstractNum>
   <w:abstractNum w:abstractNumId="6" w15:restartNumberingAfterBreak="0">
+    <w:nsid w:val="2A373F16"/>
+    <w:multiLevelType w:val="hybridMultilevel"/>
+    <w:tmpl w:val="BCF6A318"/>
+    <w:lvl w:ilvl="0" w:tplc="04090001">
+      <w:start w:val="1"/>
+      <w:numFmt w:val="bullet"/>
+      <w:lvlText w:val=""/>
+      <w:lvlJc w:val="left"/>
+      <w:pPr>
+        <w:ind w:left="720" w:hanging="360"/>
+      </w:pPr>
+      <w:rPr>
+        <w:rFonts w:ascii="Symbol" w:hAnsi="Symbol" w:hint="default"/>
+      </w:rPr>
+    </w:lvl>
+    <w:lvl w:ilvl="1" w:tplc="04090003" w:tentative="1">
+      <w:start w:val="1"/>
+      <w:numFmt w:val="bullet"/>
+      <w:lvlText w:val="o"/>
+      <w:lvlJc w:val="left"/>
+      <w:pPr>
+        <w:ind w:left="1440" w:hanging="360"/>
+      </w:pPr>
+      <w:rPr>
+        <w:rFonts w:ascii="Courier New" w:hAnsi="Courier New" w:cs="Courier New" w:hint="default"/>
+      </w:rPr>
+    </w:lvl>
+    <w:lvl w:ilvl="2" w:tplc="04090005" w:tentative="1">
+      <w:start w:val="1"/>
+      <w:numFmt w:val="bullet"/>
+      <w:lvlText w:val=""/>
+      <w:lvlJc w:val="left"/>
+      <w:pPr>
+        <w:ind w:left="2160" w:hanging="360"/>
+      </w:pPr>
+      <w:rPr>
+        <w:rFonts w:ascii="Wingdings" w:hAnsi="Wingdings" w:hint="default"/>
+      </w:rPr>
+    </w:lvl>
+    <w:lvl w:ilvl="3" w:tplc="04090001" w:tentative="1">
+      <w:start w:val="1"/>
+      <w:numFmt w:val="bullet"/>
+      <w:lvlText w:val=""/>
+      <w:lvlJc w:val="left"/>
+      <w:pPr>
+        <w:ind w:left="2880" w:hanging="360"/>
+      </w:pPr>
+      <w:rPr>
+        <w:rFonts w:ascii="Symbol" w:hAnsi="Symbol" w:hint="default"/>
+      </w:rPr>
+    </w:lvl>
+    <w:lvl w:ilvl="4" w:tplc="04090003" w:tentative="1">
+      <w:start w:val="1"/>
+      <w:numFmt w:val="bullet"/>
+      <w:lvlText w:val="o"/>
+      <w:lvlJc w:val="left"/>
+      <w:pPr>
+        <w:ind w:left="3600" w:hanging="360"/>
+      </w:pPr>
+      <w:rPr>
+        <w:rFonts w:ascii="Courier New" w:hAnsi="Courier New" w:cs="Courier New" w:hint="default"/>
+      </w:rPr>
+    </w:lvl>
+    <w:lvl w:ilvl="5" w:tplc="04090005" w:tentative="1">
+      <w:start w:val="1"/>
+      <w:numFmt w:val="bullet"/>
+      <w:lvlText w:val=""/>
+      <w:lvlJc w:val="left"/>
+      <w:pPr>
+        <w:ind w:left="4320" w:hanging="360"/>
+      </w:pPr>
+      <w:rPr>
+        <w:rFonts w:ascii="Wingdings" w:hAnsi="Wingdings" w:hint="default"/>
+      </w:rPr>
+    </w:lvl>
+    <w:lvl w:ilvl="6" w:tplc="04090001" w:tentative="1">
+      <w:start w:val="1"/>
+      <w:numFmt w:val="bullet"/>
+      <w:lvlText w:val=""/>
+      <w:lvlJc w:val="left"/>
+      <w:pPr>
+        <w:ind w:left="5040" w:hanging="360"/>
+      </w:pPr>
+      <w:rPr>
+        <w:rFonts w:ascii="Symbol" w:hAnsi="Symbol" w:hint="default"/>
+      </w:rPr>
+    </w:lvl>
+    <w:lvl w:ilvl="7" w:tplc="04090003" w:tentative="1">
+      <w:start w:val="1"/>
+      <w:numFmt w:val="bullet"/>
+      <w:lvlText w:val="o"/>
+      <w:lvlJc w:val="left"/>
+      <w:pPr>
+        <w:ind w:left="5760" w:hanging="360"/>
+      </w:pPr>
+      <w:rPr>
+        <w:rFonts w:ascii="Courier New" w:hAnsi="Courier New" w:cs="Courier New" w:hint="default"/>
+      </w:rPr>
+    </w:lvl>
+    <w:lvl w:ilvl="8" w:tplc="04090005" w:tentative="1">
+      <w:start w:val="1"/>
+      <w:numFmt w:val="bullet"/>
+      <w:lvlText w:val=""/>
+      <w:lvlJc w:val="left"/>
+      <w:pPr>
+        <w:ind w:left="6480" w:hanging="360"/>
+      </w:pPr>
+      <w:rPr>
+        <w:rFonts w:ascii="Wingdings" w:hAnsi="Wingdings" w:hint="default"/>
+      </w:rPr>
+    </w:lvl>
+  </w:abstractNum>
+  <w:abstractNum w:abstractNumId="7" w15:restartNumberingAfterBreak="0">
     <w:nsid w:val="31763F57"/>
     <w:multiLevelType w:val="hybridMultilevel"/>
     <w:tmpl w:val="51BE43EE"/>
@@ -11835,7 +12279,7 @@
       </w:rPr>
     </w:lvl>
   </w:abstractNum>
-  <w:abstractNum w:abstractNumId="7" w15:restartNumberingAfterBreak="0">
+  <w:abstractNum w:abstractNumId="8" w15:restartNumberingAfterBreak="0">
     <w:nsid w:val="347F1E24"/>
     <w:multiLevelType w:val="hybridMultilevel"/>
     <w:tmpl w:val="E7CE5014"/>
@@ -11948,7 +12392,7 @@
       </w:rPr>
     </w:lvl>
   </w:abstractNum>
-  <w:abstractNum w:abstractNumId="8" w15:restartNumberingAfterBreak="0">
+  <w:abstractNum w:abstractNumId="9" w15:restartNumberingAfterBreak="0">
     <w:nsid w:val="38607ABE"/>
     <w:multiLevelType w:val="hybridMultilevel"/>
     <w:tmpl w:val="227A0B70"/>
@@ -12061,7 +12505,7 @@
       </w:rPr>
     </w:lvl>
   </w:abstractNum>
-  <w:abstractNum w:abstractNumId="9" w15:restartNumberingAfterBreak="0">
+  <w:abstractNum w:abstractNumId="10" w15:restartNumberingAfterBreak="0">
     <w:nsid w:val="41C7434B"/>
     <w:multiLevelType w:val="multilevel"/>
     <w:tmpl w:val="D29AF170"/>
@@ -12210,7 +12654,7 @@
       </w:rPr>
     </w:lvl>
   </w:abstractNum>
-  <w:abstractNum w:abstractNumId="10" w15:restartNumberingAfterBreak="0">
+  <w:abstractNum w:abstractNumId="11" w15:restartNumberingAfterBreak="0">
     <w:nsid w:val="4DBA1898"/>
     <w:multiLevelType w:val="hybridMultilevel"/>
     <w:tmpl w:val="6FEAF894"/>
@@ -12323,7 +12767,7 @@
       </w:rPr>
     </w:lvl>
   </w:abstractNum>
-  <w:abstractNum w:abstractNumId="11" w15:restartNumberingAfterBreak="0">
+  <w:abstractNum w:abstractNumId="12" w15:restartNumberingAfterBreak="0">
     <w:nsid w:val="4E4B4CDC"/>
     <w:multiLevelType w:val="hybridMultilevel"/>
     <w:tmpl w:val="CD72313C"/>
@@ -12436,7 +12880,120 @@
       </w:rPr>
     </w:lvl>
   </w:abstractNum>
-  <w:abstractNum w:abstractNumId="12" w15:restartNumberingAfterBreak="0">
+  <w:abstractNum w:abstractNumId="13" w15:restartNumberingAfterBreak="0">
+    <w:nsid w:val="5C796051"/>
+    <w:multiLevelType w:val="hybridMultilevel"/>
+    <w:tmpl w:val="7F123298"/>
+    <w:lvl w:ilvl="0" w:tplc="04090001">
+      <w:start w:val="1"/>
+      <w:numFmt w:val="bullet"/>
+      <w:lvlText w:val=""/>
+      <w:lvlJc w:val="left"/>
+      <w:pPr>
+        <w:ind w:left="1080" w:hanging="360"/>
+      </w:pPr>
+      <w:rPr>
+        <w:rFonts w:ascii="Symbol" w:hAnsi="Symbol" w:hint="default"/>
+      </w:rPr>
+    </w:lvl>
+    <w:lvl w:ilvl="1" w:tplc="04090003" w:tentative="1">
+      <w:start w:val="1"/>
+      <w:numFmt w:val="bullet"/>
+      <w:lvlText w:val="o"/>
+      <w:lvlJc w:val="left"/>
+      <w:pPr>
+        <w:ind w:left="1800" w:hanging="360"/>
+      </w:pPr>
+      <w:rPr>
+        <w:rFonts w:ascii="Courier New" w:hAnsi="Courier New" w:cs="Courier New" w:hint="default"/>
+      </w:rPr>
+    </w:lvl>
+    <w:lvl w:ilvl="2" w:tplc="04090005" w:tentative="1">
+      <w:start w:val="1"/>
+      <w:numFmt w:val="bullet"/>
+      <w:lvlText w:val=""/>
+      <w:lvlJc w:val="left"/>
+      <w:pPr>
+        <w:ind w:left="2520" w:hanging="360"/>
+      </w:pPr>
+      <w:rPr>
+        <w:rFonts w:ascii="Wingdings" w:hAnsi="Wingdings" w:hint="default"/>
+      </w:rPr>
+    </w:lvl>
+    <w:lvl w:ilvl="3" w:tplc="04090001" w:tentative="1">
+      <w:start w:val="1"/>
+      <w:numFmt w:val="bullet"/>
+      <w:lvlText w:val=""/>
+      <w:lvlJc w:val="left"/>
+      <w:pPr>
+        <w:ind w:left="3240" w:hanging="360"/>
+      </w:pPr>
+      <w:rPr>
+        <w:rFonts w:ascii="Symbol" w:hAnsi="Symbol" w:hint="default"/>
+      </w:rPr>
+    </w:lvl>
+    <w:lvl w:ilvl="4" w:tplc="04090003" w:tentative="1">
+      <w:start w:val="1"/>
+      <w:numFmt w:val="bullet"/>
+      <w:lvlText w:val="o"/>
+      <w:lvlJc w:val="left"/>
+      <w:pPr>
+        <w:ind w:left="3960" w:hanging="360"/>
+      </w:pPr>
+      <w:rPr>
+        <w:rFonts w:ascii="Courier New" w:hAnsi="Courier New" w:cs="Courier New" w:hint="default"/>
+      </w:rPr>
+    </w:lvl>
+    <w:lvl w:ilvl="5" w:tplc="04090005" w:tentative="1">
+      <w:start w:val="1"/>
+      <w:numFmt w:val="bullet"/>
+      <w:lvlText w:val=""/>
+      <w:lvlJc w:val="left"/>
+      <w:pPr>
+        <w:ind w:left="4680" w:hanging="360"/>
+      </w:pPr>
+      <w:rPr>
+        <w:rFonts w:ascii="Wingdings" w:hAnsi="Wingdings" w:hint="default"/>
+      </w:rPr>
+    </w:lvl>
+    <w:lvl w:ilvl="6" w:tplc="04090001" w:tentative="1">
+      <w:start w:val="1"/>
+      <w:numFmt w:val="bullet"/>
+      <w:lvlText w:val=""/>
+      <w:lvlJc w:val="left"/>
+      <w:pPr>
+        <w:ind w:left="5400" w:hanging="360"/>
+      </w:pPr>
+      <w:rPr>
+        <w:rFonts w:ascii="Symbol" w:hAnsi="Symbol" w:hint="default"/>
+      </w:rPr>
+    </w:lvl>
+    <w:lvl w:ilvl="7" w:tplc="04090003" w:tentative="1">
+      <w:start w:val="1"/>
+      <w:numFmt w:val="bullet"/>
+      <w:lvlText w:val="o"/>
+      <w:lvlJc w:val="left"/>
+      <w:pPr>
+        <w:ind w:left="6120" w:hanging="360"/>
+      </w:pPr>
+      <w:rPr>
+        <w:rFonts w:ascii="Courier New" w:hAnsi="Courier New" w:cs="Courier New" w:hint="default"/>
+      </w:rPr>
+    </w:lvl>
+    <w:lvl w:ilvl="8" w:tplc="04090005" w:tentative="1">
+      <w:start w:val="1"/>
+      <w:numFmt w:val="bullet"/>
+      <w:lvlText w:val=""/>
+      <w:lvlJc w:val="left"/>
+      <w:pPr>
+        <w:ind w:left="6840" w:hanging="360"/>
+      </w:pPr>
+      <w:rPr>
+        <w:rFonts w:ascii="Wingdings" w:hAnsi="Wingdings" w:hint="default"/>
+      </w:rPr>
+    </w:lvl>
+  </w:abstractNum>
+  <w:abstractNum w:abstractNumId="14" w15:restartNumberingAfterBreak="0">
     <w:nsid w:val="61C6467C"/>
     <w:multiLevelType w:val="hybridMultilevel"/>
     <w:tmpl w:val="B2EE06F6"/>
@@ -12549,7 +13106,7 @@
       </w:rPr>
     </w:lvl>
   </w:abstractNum>
-  <w:abstractNum w:abstractNumId="13" w15:restartNumberingAfterBreak="0">
+  <w:abstractNum w:abstractNumId="15" w15:restartNumberingAfterBreak="0">
     <w:nsid w:val="62C7348D"/>
     <w:multiLevelType w:val="hybridMultilevel"/>
     <w:tmpl w:val="869465C4"/>
@@ -12662,10 +13219,10 @@
       </w:rPr>
     </w:lvl>
   </w:abstractNum>
-  <w:abstractNum w:abstractNumId="14" w15:restartNumberingAfterBreak="0">
+  <w:abstractNum w:abstractNumId="16" w15:restartNumberingAfterBreak="0">
     <w:nsid w:val="67935119"/>
     <w:multiLevelType w:val="hybridMultilevel"/>
-    <w:tmpl w:val="8A8CA90C"/>
+    <w:tmpl w:val="C3D2CDD6"/>
     <w:lvl w:ilvl="0" w:tplc="04090001">
       <w:start w:val="1"/>
       <w:numFmt w:val="bullet"/>
@@ -12775,7 +13332,7 @@
       </w:rPr>
     </w:lvl>
   </w:abstractNum>
-  <w:abstractNum w:abstractNumId="15" w15:restartNumberingAfterBreak="0">
+  <w:abstractNum w:abstractNumId="17" w15:restartNumberingAfterBreak="0">
     <w:nsid w:val="6C0E166A"/>
     <w:multiLevelType w:val="hybridMultilevel"/>
     <w:tmpl w:val="187A899E"/>
@@ -12888,7 +13445,7 @@
       </w:rPr>
     </w:lvl>
   </w:abstractNum>
-  <w:abstractNum w:abstractNumId="16" w15:restartNumberingAfterBreak="0">
+  <w:abstractNum w:abstractNumId="18" w15:restartNumberingAfterBreak="0">
     <w:nsid w:val="71257A51"/>
     <w:multiLevelType w:val="hybridMultilevel"/>
     <w:tmpl w:val="AD400156"/>
@@ -13001,7 +13558,7 @@
       </w:rPr>
     </w:lvl>
   </w:abstractNum>
-  <w:abstractNum w:abstractNumId="17" w15:restartNumberingAfterBreak="0">
+  <w:abstractNum w:abstractNumId="19" w15:restartNumberingAfterBreak="0">
     <w:nsid w:val="736B2FA7"/>
     <w:multiLevelType w:val="hybridMultilevel"/>
     <w:tmpl w:val="B15E1490"/>
@@ -13114,7 +13671,7 @@
       </w:rPr>
     </w:lvl>
   </w:abstractNum>
-  <w:abstractNum w:abstractNumId="18" w15:restartNumberingAfterBreak="0">
+  <w:abstractNum w:abstractNumId="20" w15:restartNumberingAfterBreak="0">
     <w:nsid w:val="779F4EAB"/>
     <w:multiLevelType w:val="hybridMultilevel"/>
     <w:tmpl w:val="82207A7A"/>
@@ -13228,10 +13785,10 @@
     </w:lvl>
   </w:abstractNum>
   <w:num w:numId="1" w16cid:durableId="1092970415">
-    <w:abstractNumId w:val="14"/>
+    <w:abstractNumId w:val="16"/>
   </w:num>
   <w:num w:numId="2" w16cid:durableId="551770584">
-    <w:abstractNumId w:val="16"/>
+    <w:abstractNumId w:val="18"/>
   </w:num>
   <w:num w:numId="3" w16cid:durableId="585723708">
     <w:abstractNumId w:val="5"/>
@@ -13240,49 +13797,55 @@
     <w:abstractNumId w:val="4"/>
   </w:num>
   <w:num w:numId="5" w16cid:durableId="2134209492">
-    <w:abstractNumId w:val="10"/>
+    <w:abstractNumId w:val="11"/>
   </w:num>
   <w:num w:numId="6" w16cid:durableId="497382053">
-    <w:abstractNumId w:val="17"/>
+    <w:abstractNumId w:val="19"/>
   </w:num>
   <w:num w:numId="7" w16cid:durableId="461533883">
-    <w:abstractNumId w:val="6"/>
+    <w:abstractNumId w:val="7"/>
   </w:num>
   <w:num w:numId="8" w16cid:durableId="743799996">
     <w:abstractNumId w:val="1"/>
   </w:num>
   <w:num w:numId="9" w16cid:durableId="792332854">
-    <w:abstractNumId w:val="18"/>
+    <w:abstractNumId w:val="20"/>
   </w:num>
   <w:num w:numId="10" w16cid:durableId="76832236">
     <w:abstractNumId w:val="0"/>
   </w:num>
   <w:num w:numId="11" w16cid:durableId="2030132572">
+    <w:abstractNumId w:val="10"/>
+  </w:num>
+  <w:num w:numId="12" w16cid:durableId="1787499629">
+    <w:abstractNumId w:val="12"/>
+  </w:num>
+  <w:num w:numId="13" w16cid:durableId="609897584">
     <w:abstractNumId w:val="9"/>
   </w:num>
-  <w:num w:numId="12" w16cid:durableId="1787499629">
-    <w:abstractNumId w:val="11"/>
-  </w:num>
-  <w:num w:numId="13" w16cid:durableId="609897584">
-    <w:abstractNumId w:val="8"/>
-  </w:num>
   <w:num w:numId="14" w16cid:durableId="1394504437">
-    <w:abstractNumId w:val="13"/>
+    <w:abstractNumId w:val="15"/>
   </w:num>
   <w:num w:numId="15" w16cid:durableId="1498840164">
-    <w:abstractNumId w:val="12"/>
+    <w:abstractNumId w:val="14"/>
   </w:num>
   <w:num w:numId="16" w16cid:durableId="1790584938">
     <w:abstractNumId w:val="3"/>
   </w:num>
   <w:num w:numId="17" w16cid:durableId="1663116866">
-    <w:abstractNumId w:val="15"/>
+    <w:abstractNumId w:val="17"/>
   </w:num>
   <w:num w:numId="18" w16cid:durableId="1072702890">
-    <w:abstractNumId w:val="7"/>
+    <w:abstractNumId w:val="8"/>
   </w:num>
   <w:num w:numId="19" w16cid:durableId="2029024260">
     <w:abstractNumId w:val="2"/>
+  </w:num>
+  <w:num w:numId="20" w16cid:durableId="1606307563">
+    <w:abstractNumId w:val="13"/>
+  </w:num>
+  <w:num w:numId="21" w16cid:durableId="1816682563">
+    <w:abstractNumId w:val="6"/>
   </w:num>
 </w:numbering>
 </file>

</xml_diff>

<commit_message>
Deploying to gh-pages from @ Bibek-Luitel/bibek-luitel.github.io@49a95d181ce7aac38ca1a0b9b57a60194bd4f362 🚀
</commit_message>
<xml_diff>
--- a/assets/pdf/cv_full_bibekluitel.docx
+++ b/assets/pdf/cv_full_bibekluitel.docx
@@ -119,7 +119,7 @@
     <w:p>
       <w:pPr>
         <w:pStyle w:val="Heading1"/>
-        <w:spacing w:after="0"/>
+        <w:spacing w:after="80"/>
       </w:pPr>
       <w:r>
         <w:t>EDUCATION</w:t>
@@ -147,23 +147,43 @@
           <w:sz w:val="22"/>
           <w:szCs w:val="22"/>
         </w:rPr>
-        <w:t>Doctor of Education in Educational Leadership (EdD)</w:t>
-      </w:r>
-      <w:r>
-        <w:rPr>
-          <w:rFonts w:ascii="Times New Roman" w:hAnsi="Times New Roman" w:cs="Times New Roman"/>
-          <w:sz w:val="22"/>
-          <w:szCs w:val="22"/>
-        </w:rPr>
-        <w:t xml:space="preserve">, </w:t>
-      </w:r>
-      <w:r>
-        <w:rPr>
-          <w:rFonts w:ascii="Times New Roman" w:hAnsi="Times New Roman" w:cs="Times New Roman"/>
-          <w:sz w:val="22"/>
-          <w:szCs w:val="22"/>
-        </w:rPr>
-        <w:t xml:space="preserve">(Expected) </w:t>
+        <w:t xml:space="preserve">Doctor of Education in Educational Leadership </w:t>
+      </w:r>
+      <w:r>
+        <w:rPr>
+          <w:rFonts w:ascii="Times New Roman" w:hAnsi="Times New Roman" w:cs="Times New Roman"/>
+          <w:b/>
+          <w:bCs/>
+          <w:sz w:val="22"/>
+          <w:szCs w:val="22"/>
+        </w:rPr>
+        <w:t xml:space="preserve">&amp; Administration </w:t>
+      </w:r>
+      <w:r>
+        <w:rPr>
+          <w:rFonts w:ascii="Times New Roman" w:hAnsi="Times New Roman" w:cs="Times New Roman"/>
+          <w:b/>
+          <w:bCs/>
+          <w:sz w:val="22"/>
+          <w:szCs w:val="22"/>
+        </w:rPr>
+        <w:t>(EdD)</w:t>
+      </w:r>
+      <w:r>
+        <w:rPr>
+          <w:rFonts w:ascii="Times New Roman" w:hAnsi="Times New Roman" w:cs="Times New Roman"/>
+          <w:sz w:val="22"/>
+          <w:szCs w:val="22"/>
+        </w:rPr>
+        <w:t>,</w:t>
+      </w:r>
+      <w:r>
+        <w:rPr>
+          <w:rFonts w:ascii="Times New Roman" w:hAnsi="Times New Roman" w:cs="Times New Roman"/>
+          <w:sz w:val="22"/>
+          <w:szCs w:val="22"/>
+        </w:rPr>
+        <w:t xml:space="preserve"> </w:t>
       </w:r>
       <w:r>
         <w:rPr>
@@ -180,57 +200,6 @@
           <w:szCs w:val="22"/>
         </w:rPr>
         <w:t xml:space="preserve"> </w:t>
-      </w:r>
-    </w:p>
-    <w:p>
-      <w:pPr>
-        <w:pStyle w:val="ListParagraph"/>
-        <w:spacing w:after="120" w:line="240" w:lineRule="auto"/>
-        <w:rPr>
-          <w:rFonts w:ascii="Times New Roman" w:hAnsi="Times New Roman" w:cs="Times New Roman"/>
-          <w:sz w:val="22"/>
-          <w:szCs w:val="22"/>
-        </w:rPr>
-      </w:pPr>
-      <w:r>
-        <w:rPr>
-          <w:rFonts w:ascii="Times New Roman" w:hAnsi="Times New Roman" w:cs="Times New Roman"/>
-          <w:sz w:val="22"/>
-          <w:szCs w:val="22"/>
-        </w:rPr>
-        <w:t xml:space="preserve">(Dissertation Defended </w:t>
-      </w:r>
-      <w:r>
-        <w:rPr>
-          <w:rFonts w:ascii="Times New Roman" w:hAnsi="Times New Roman" w:cs="Times New Roman"/>
-          <w:sz w:val="22"/>
-          <w:szCs w:val="22"/>
-        </w:rPr>
-        <w:t>on</w:t>
-      </w:r>
-      <w:r>
-        <w:rPr>
-          <w:rFonts w:ascii="Times New Roman" w:hAnsi="Times New Roman" w:cs="Times New Roman"/>
-          <w:sz w:val="22"/>
-          <w:szCs w:val="22"/>
-        </w:rPr>
-        <w:t xml:space="preserve"> </w:t>
-      </w:r>
-      <w:r>
-        <w:rPr>
-          <w:rFonts w:ascii="Times New Roman" w:hAnsi="Times New Roman" w:cs="Times New Roman"/>
-          <w:sz w:val="22"/>
-          <w:szCs w:val="22"/>
-        </w:rPr>
-        <w:t xml:space="preserve">16 </w:t>
-      </w:r>
-      <w:r>
-        <w:rPr>
-          <w:rFonts w:ascii="Times New Roman" w:hAnsi="Times New Roman" w:cs="Times New Roman"/>
-          <w:sz w:val="22"/>
-          <w:szCs w:val="22"/>
-        </w:rPr>
-        <w:t>September 2025)</w:t>
       </w:r>
     </w:p>
     <w:p>
@@ -445,7 +414,7 @@
     <w:p>
       <w:pPr>
         <w:pStyle w:val="ListParagraph"/>
-        <w:spacing w:after="120" w:line="240" w:lineRule="auto"/>
+        <w:spacing w:after="0" w:line="240" w:lineRule="auto"/>
         <w:contextualSpacing w:val="0"/>
         <w:rPr>
           <w:rFonts w:ascii="Times New Roman" w:hAnsi="Times New Roman" w:cs="Times New Roman"/>
@@ -6733,23 +6702,13 @@
           <w:szCs w:val="22"/>
         </w:rPr>
       </w:pPr>
-      <w:proofErr w:type="gramStart"/>
-      <w:r>
-        <w:rPr>
-          <w:rFonts w:ascii="Times New Roman" w:hAnsi="Times New Roman" w:cs="Times New Roman"/>
-          <w:sz w:val="22"/>
-          <w:szCs w:val="22"/>
-        </w:rPr>
-        <w:t>Taught</w:t>
-      </w:r>
-      <w:proofErr w:type="gramEnd"/>
-      <w:r>
-        <w:rPr>
-          <w:rFonts w:ascii="Times New Roman" w:hAnsi="Times New Roman" w:cs="Times New Roman"/>
-          <w:sz w:val="22"/>
-          <w:szCs w:val="22"/>
-        </w:rPr>
-        <w:t xml:space="preserve"> approximately 450 undergraduate and graduate students across 10 courses and an average 90% graduate rate and 95% student satisfaction score.</w:t>
+      <w:r>
+        <w:rPr>
+          <w:rFonts w:ascii="Times New Roman" w:hAnsi="Times New Roman" w:cs="Times New Roman"/>
+          <w:sz w:val="22"/>
+          <w:szCs w:val="22"/>
+        </w:rPr>
+        <w:t>Taught approximately 450 undergraduate and graduate students across 10 courses and an average 90% graduate rate and 95% student satisfaction score.</w:t>
       </w:r>
     </w:p>
     <w:p>

</xml_diff>

<commit_message>
Deploying to gh-pages from @ Bibek-Luitel/bibek-luitel.github.io@475fed400b74d79c5bcf2a186516141188ff851a 🚀
</commit_message>
<xml_diff>
--- a/assets/pdf/cv_full_bibekluitel.docx
+++ b/assets/pdf/cv_full_bibekluitel.docx
@@ -53,6 +53,28 @@
           <w:szCs w:val="32"/>
         </w:rPr>
         <w:t>UITEL</w:t>
+      </w:r>
+      <w:r>
+        <w:rPr>
+          <w:rFonts w:ascii="Times New Roman" w:hAnsi="Times New Roman" w:cs="Times New Roman"/>
+          <w:b/>
+          <w:bCs/>
+          <w:sz w:val="32"/>
+          <w:szCs w:val="32"/>
+        </w:rPr>
+        <w:t xml:space="preserve">, Ed.D. </w:t>
+      </w:r>
+      <w:r>
+        <w:rPr>
+          <w:rFonts w:ascii="Times New Roman" w:hAnsi="Times New Roman" w:cs="Times New Roman"/>
+          <w:b/>
+          <w:bCs/>
+          <w:i/>
+          <w:iCs/>
+          <w:sz w:val="20"/>
+          <w:szCs w:val="20"/>
+        </w:rPr>
+        <w:t>(HE/HIM)</w:t>
       </w:r>
     </w:p>
     <w:p>
@@ -11089,8 +11111,12 @@
       </w:pPr>
     </w:p>
     <w:sectPr>
-      <w:footerReference w:type="default" r:id="rId9"/>
-      <w:footerReference w:type="first" r:id="rId10"/>
+      <w:headerReference w:type="even" r:id="rId9"/>
+      <w:headerReference w:type="default" r:id="rId10"/>
+      <w:footerReference w:type="even" r:id="rId11"/>
+      <w:footerReference w:type="default" r:id="rId12"/>
+      <w:headerReference w:type="first" r:id="rId13"/>
+      <w:footerReference w:type="first" r:id="rId14"/>
       <w:pgSz w:w="12240" w:h="15840"/>
       <w:pgMar w:top="1440" w:right="1440" w:bottom="1440" w:left="1440" w:header="720" w:footer="720" w:gutter="0"/>
       <w:cols w:space="720"/>
@@ -11127,6 +11153,16 @@
 </file>
 
 <file path=word/footer1.xml><?xml version="1.0" encoding="utf-8"?>
+<w:ftr xmlns:wpc="http://schemas.microsoft.com/office/word/2010/wordprocessingCanvas" xmlns:cx="http://schemas.microsoft.com/office/drawing/2014/chartex" xmlns:cx1="http://schemas.microsoft.com/office/drawing/2015/9/8/chartex" xmlns:cx2="http://schemas.microsoft.com/office/drawing/2015/10/21/chartex" xmlns:cx3="http://schemas.microsoft.com/office/drawing/2016/5/9/chartex" xmlns:cx4="http://schemas.microsoft.com/office/drawing/2016/5/10/chartex" xmlns:cx5="http://schemas.microsoft.com/office/drawing/2016/5/11/chartex" xmlns:cx6="http://schemas.microsoft.com/office/drawing/2016/5/12/chartex" xmlns:cx7="http://schemas.microsoft.com/office/drawing/2016/5/13/chartex" xmlns:cx8="http://schemas.microsoft.com/office/drawing/2016/5/14/chartex" xmlns:mc="http://schemas.openxmlformats.org/markup-compatibility/2006" xmlns:aink="http://schemas.microsoft.com/office/drawing/2016/ink" xmlns:am3d="http://schemas.microsoft.com/office/drawing/2017/model3d" xmlns:o="urn:schemas-microsoft-com:office:office" xmlns:oel="http://schemas.microsoft.com/office/2019/extlst" xmlns:r="http://schemas.openxmlformats.org/officeDocument/2006/relationships" xmlns:m="http://schemas.openxmlformats.org/officeDocument/2006/math" xmlns:v="urn:schemas-microsoft-com:vml" xmlns:wp14="http://schemas.microsoft.com/office/word/2010/wordprocessingDrawing" xmlns:wp="http://schemas.openxmlformats.org/drawingml/2006/wordprocessingDrawing" xmlns:w10="urn:schemas-microsoft-com:office:word" xmlns:w="http://schemas.openxmlformats.org/wordprocessingml/2006/main" xmlns:w14="http://schemas.microsoft.com/office/word/2010/wordml" xmlns:w15="http://schemas.microsoft.com/office/word/2012/wordml" xmlns:w16cex="http://schemas.microsoft.com/office/word/2018/wordml/cex" xmlns:w16cid="http://schemas.microsoft.com/office/word/2016/wordml/cid" xmlns:w16="http://schemas.microsoft.com/office/word/2018/wordml" xmlns:w16du="http://schemas.microsoft.com/office/word/2023/wordml/word16du" xmlns:w16sdtdh="http://schemas.microsoft.com/office/word/2020/wordml/sdtdatahash" xmlns:w16sdtfl="http://schemas.microsoft.com/office/word/2024/wordml/sdtformatlock" xmlns:w16se="http://schemas.microsoft.com/office/word/2015/wordml/symex" xmlns:wpg="http://schemas.microsoft.com/office/word/2010/wordprocessingGroup" xmlns:wpi="http://schemas.microsoft.com/office/word/2010/wordprocessingInk" xmlns:wne="http://schemas.microsoft.com/office/word/2006/wordml" xmlns:wps="http://schemas.microsoft.com/office/word/2010/wordprocessingShape" mc:Ignorable="w14 w15 w16se w16cid w16 w16cex w16sdtdh w16sdtfl w16du wp14">
+  <w:p>
+    <w:pPr>
+      <w:pStyle w:val="Footer"/>
+    </w:pPr>
+  </w:p>
+</w:ftr>
+</file>
+
+<file path=word/footer2.xml><?xml version="1.0" encoding="utf-8"?>
 <w:ftr xmlns:wpc="http://schemas.microsoft.com/office/word/2010/wordprocessingCanvas" xmlns:cx="http://schemas.microsoft.com/office/drawing/2014/chartex" xmlns:cx1="http://schemas.microsoft.com/office/drawing/2015/9/8/chartex" xmlns:cx2="http://schemas.microsoft.com/office/drawing/2015/10/21/chartex" xmlns:cx3="http://schemas.microsoft.com/office/drawing/2016/5/9/chartex" xmlns:cx4="http://schemas.microsoft.com/office/drawing/2016/5/10/chartex" xmlns:cx5="http://schemas.microsoft.com/office/drawing/2016/5/11/chartex" xmlns:cx6="http://schemas.microsoft.com/office/drawing/2016/5/12/chartex" xmlns:cx7="http://schemas.microsoft.com/office/drawing/2016/5/13/chartex" xmlns:cx8="http://schemas.microsoft.com/office/drawing/2016/5/14/chartex" xmlns:mc="http://schemas.openxmlformats.org/markup-compatibility/2006" xmlns:aink="http://schemas.microsoft.com/office/drawing/2016/ink" xmlns:am3d="http://schemas.microsoft.com/office/drawing/2017/model3d" xmlns:o="urn:schemas-microsoft-com:office:office" xmlns:oel="http://schemas.microsoft.com/office/2019/extlst" xmlns:r="http://schemas.openxmlformats.org/officeDocument/2006/relationships" xmlns:m="http://schemas.openxmlformats.org/officeDocument/2006/math" xmlns:v="urn:schemas-microsoft-com:vml" xmlns:wp14="http://schemas.microsoft.com/office/word/2010/wordprocessingDrawing" xmlns:wp="http://schemas.openxmlformats.org/drawingml/2006/wordprocessingDrawing" xmlns:w10="urn:schemas-microsoft-com:office:word" xmlns:w="http://schemas.openxmlformats.org/wordprocessingml/2006/main" xmlns:w14="http://schemas.microsoft.com/office/word/2010/wordml" xmlns:w15="http://schemas.microsoft.com/office/word/2012/wordml" xmlns:w16cex="http://schemas.microsoft.com/office/word/2018/wordml/cex" xmlns:w16cid="http://schemas.microsoft.com/office/word/2016/wordml/cid" xmlns:w16="http://schemas.microsoft.com/office/word/2018/wordml" xmlns:w16du="http://schemas.microsoft.com/office/word/2023/wordml/word16du" xmlns:w16sdtdh="http://schemas.microsoft.com/office/word/2020/wordml/sdtdatahash" xmlns:w16sdtfl="http://schemas.microsoft.com/office/word/2024/wordml/sdtformatlock" xmlns:w16se="http://schemas.microsoft.com/office/word/2015/wordml/symex" xmlns:wpg="http://schemas.microsoft.com/office/word/2010/wordprocessingGroup" xmlns:wpi="http://schemas.microsoft.com/office/word/2010/wordprocessingInk" xmlns:wne="http://schemas.microsoft.com/office/word/2006/wordml" xmlns:wps="http://schemas.microsoft.com/office/word/2010/wordprocessingShape" mc:Ignorable="w14 w15 w16se w16cid w16 w16cex w16sdtdh w16sdtfl w16du wp14">
   <w:sdt>
     <w:sdtPr>
@@ -11219,7 +11255,7 @@
 </w:ftr>
 </file>
 
-<file path=word/footer2.xml><?xml version="1.0" encoding="utf-8"?>
+<file path=word/footer3.xml><?xml version="1.0" encoding="utf-8"?>
 <w:ftr xmlns:wpc="http://schemas.microsoft.com/office/word/2010/wordprocessingCanvas" xmlns:cx="http://schemas.microsoft.com/office/drawing/2014/chartex" xmlns:cx1="http://schemas.microsoft.com/office/drawing/2015/9/8/chartex" xmlns:cx2="http://schemas.microsoft.com/office/drawing/2015/10/21/chartex" xmlns:cx3="http://schemas.microsoft.com/office/drawing/2016/5/9/chartex" xmlns:cx4="http://schemas.microsoft.com/office/drawing/2016/5/10/chartex" xmlns:cx5="http://schemas.microsoft.com/office/drawing/2016/5/11/chartex" xmlns:cx6="http://schemas.microsoft.com/office/drawing/2016/5/12/chartex" xmlns:cx7="http://schemas.microsoft.com/office/drawing/2016/5/13/chartex" xmlns:cx8="http://schemas.microsoft.com/office/drawing/2016/5/14/chartex" xmlns:mc="http://schemas.openxmlformats.org/markup-compatibility/2006" xmlns:aink="http://schemas.microsoft.com/office/drawing/2016/ink" xmlns:am3d="http://schemas.microsoft.com/office/drawing/2017/model3d" xmlns:o="urn:schemas-microsoft-com:office:office" xmlns:oel="http://schemas.microsoft.com/office/2019/extlst" xmlns:r="http://schemas.openxmlformats.org/officeDocument/2006/relationships" xmlns:m="http://schemas.openxmlformats.org/officeDocument/2006/math" xmlns:v="urn:schemas-microsoft-com:vml" xmlns:wp14="http://schemas.microsoft.com/office/word/2010/wordprocessingDrawing" xmlns:wp="http://schemas.openxmlformats.org/drawingml/2006/wordprocessingDrawing" xmlns:w10="urn:schemas-microsoft-com:office:word" xmlns:w="http://schemas.openxmlformats.org/wordprocessingml/2006/main" xmlns:w14="http://schemas.microsoft.com/office/word/2010/wordml" xmlns:w15="http://schemas.microsoft.com/office/word/2012/wordml" xmlns:w16cex="http://schemas.microsoft.com/office/word/2018/wordml/cex" xmlns:w16cid="http://schemas.microsoft.com/office/word/2016/wordml/cid" xmlns:w16="http://schemas.microsoft.com/office/word/2018/wordml" xmlns:w16du="http://schemas.microsoft.com/office/word/2023/wordml/word16du" xmlns:w16sdtdh="http://schemas.microsoft.com/office/word/2020/wordml/sdtdatahash" xmlns:w16sdtfl="http://schemas.microsoft.com/office/word/2024/wordml/sdtformatlock" xmlns:w16se="http://schemas.microsoft.com/office/word/2015/wordml/symex" xmlns:wpg="http://schemas.microsoft.com/office/word/2010/wordprocessingGroup" xmlns:wpi="http://schemas.microsoft.com/office/word/2010/wordprocessingInk" xmlns:wne="http://schemas.microsoft.com/office/word/2006/wordml" xmlns:wps="http://schemas.microsoft.com/office/word/2010/wordprocessingShape" mc:Ignorable="w14 w15 w16se w16cid w16 w16cex w16sdtdh w16sdtfl w16du wp14">
   <w:p>
     <w:pPr>
@@ -11257,7 +11293,7 @@
         <w:sz w:val="20"/>
         <w:szCs w:val="20"/>
       </w:rPr>
-      <w:t>Oct</w:t>
+      <w:t>Dec</w:t>
     </w:r>
     <w:r>
       <w:rPr>
@@ -11294,6 +11330,36 @@
     </w:p>
   </w:footnote>
 </w:footnotes>
+</file>
+
+<file path=word/header1.xml><?xml version="1.0" encoding="utf-8"?>
+<w:hdr xmlns:wpc="http://schemas.microsoft.com/office/word/2010/wordprocessingCanvas" xmlns:cx="http://schemas.microsoft.com/office/drawing/2014/chartex" xmlns:cx1="http://schemas.microsoft.com/office/drawing/2015/9/8/chartex" xmlns:cx2="http://schemas.microsoft.com/office/drawing/2015/10/21/chartex" xmlns:cx3="http://schemas.microsoft.com/office/drawing/2016/5/9/chartex" xmlns:cx4="http://schemas.microsoft.com/office/drawing/2016/5/10/chartex" xmlns:cx5="http://schemas.microsoft.com/office/drawing/2016/5/11/chartex" xmlns:cx6="http://schemas.microsoft.com/office/drawing/2016/5/12/chartex" xmlns:cx7="http://schemas.microsoft.com/office/drawing/2016/5/13/chartex" xmlns:cx8="http://schemas.microsoft.com/office/drawing/2016/5/14/chartex" xmlns:mc="http://schemas.openxmlformats.org/markup-compatibility/2006" xmlns:aink="http://schemas.microsoft.com/office/drawing/2016/ink" xmlns:am3d="http://schemas.microsoft.com/office/drawing/2017/model3d" xmlns:o="urn:schemas-microsoft-com:office:office" xmlns:oel="http://schemas.microsoft.com/office/2019/extlst" xmlns:r="http://schemas.openxmlformats.org/officeDocument/2006/relationships" xmlns:m="http://schemas.openxmlformats.org/officeDocument/2006/math" xmlns:v="urn:schemas-microsoft-com:vml" xmlns:wp14="http://schemas.microsoft.com/office/word/2010/wordprocessingDrawing" xmlns:wp="http://schemas.openxmlformats.org/drawingml/2006/wordprocessingDrawing" xmlns:w10="urn:schemas-microsoft-com:office:word" xmlns:w="http://schemas.openxmlformats.org/wordprocessingml/2006/main" xmlns:w14="http://schemas.microsoft.com/office/word/2010/wordml" xmlns:w15="http://schemas.microsoft.com/office/word/2012/wordml" xmlns:w16cex="http://schemas.microsoft.com/office/word/2018/wordml/cex" xmlns:w16cid="http://schemas.microsoft.com/office/word/2016/wordml/cid" xmlns:w16="http://schemas.microsoft.com/office/word/2018/wordml" xmlns:w16du="http://schemas.microsoft.com/office/word/2023/wordml/word16du" xmlns:w16sdtdh="http://schemas.microsoft.com/office/word/2020/wordml/sdtdatahash" xmlns:w16sdtfl="http://schemas.microsoft.com/office/word/2024/wordml/sdtformatlock" xmlns:w16se="http://schemas.microsoft.com/office/word/2015/wordml/symex" xmlns:wpg="http://schemas.microsoft.com/office/word/2010/wordprocessingGroup" xmlns:wpi="http://schemas.microsoft.com/office/word/2010/wordprocessingInk" xmlns:wne="http://schemas.microsoft.com/office/word/2006/wordml" xmlns:wps="http://schemas.microsoft.com/office/word/2010/wordprocessingShape" mc:Ignorable="w14 w15 w16se w16cid w16 w16cex w16sdtdh w16sdtfl w16du wp14">
+  <w:p>
+    <w:pPr>
+      <w:pStyle w:val="Header"/>
+    </w:pPr>
+  </w:p>
+</w:hdr>
+</file>
+
+<file path=word/header2.xml><?xml version="1.0" encoding="utf-8"?>
+<w:hdr xmlns:wpc="http://schemas.microsoft.com/office/word/2010/wordprocessingCanvas" xmlns:cx="http://schemas.microsoft.com/office/drawing/2014/chartex" xmlns:cx1="http://schemas.microsoft.com/office/drawing/2015/9/8/chartex" xmlns:cx2="http://schemas.microsoft.com/office/drawing/2015/10/21/chartex" xmlns:cx3="http://schemas.microsoft.com/office/drawing/2016/5/9/chartex" xmlns:cx4="http://schemas.microsoft.com/office/drawing/2016/5/10/chartex" xmlns:cx5="http://schemas.microsoft.com/office/drawing/2016/5/11/chartex" xmlns:cx6="http://schemas.microsoft.com/office/drawing/2016/5/12/chartex" xmlns:cx7="http://schemas.microsoft.com/office/drawing/2016/5/13/chartex" xmlns:cx8="http://schemas.microsoft.com/office/drawing/2016/5/14/chartex" xmlns:mc="http://schemas.openxmlformats.org/markup-compatibility/2006" xmlns:aink="http://schemas.microsoft.com/office/drawing/2016/ink" xmlns:am3d="http://schemas.microsoft.com/office/drawing/2017/model3d" xmlns:o="urn:schemas-microsoft-com:office:office" xmlns:oel="http://schemas.microsoft.com/office/2019/extlst" xmlns:r="http://schemas.openxmlformats.org/officeDocument/2006/relationships" xmlns:m="http://schemas.openxmlformats.org/officeDocument/2006/math" xmlns:v="urn:schemas-microsoft-com:vml" xmlns:wp14="http://schemas.microsoft.com/office/word/2010/wordprocessingDrawing" xmlns:wp="http://schemas.openxmlformats.org/drawingml/2006/wordprocessingDrawing" xmlns:w10="urn:schemas-microsoft-com:office:word" xmlns:w="http://schemas.openxmlformats.org/wordprocessingml/2006/main" xmlns:w14="http://schemas.microsoft.com/office/word/2010/wordml" xmlns:w15="http://schemas.microsoft.com/office/word/2012/wordml" xmlns:w16cex="http://schemas.microsoft.com/office/word/2018/wordml/cex" xmlns:w16cid="http://schemas.microsoft.com/office/word/2016/wordml/cid" xmlns:w16="http://schemas.microsoft.com/office/word/2018/wordml" xmlns:w16du="http://schemas.microsoft.com/office/word/2023/wordml/word16du" xmlns:w16sdtdh="http://schemas.microsoft.com/office/word/2020/wordml/sdtdatahash" xmlns:w16sdtfl="http://schemas.microsoft.com/office/word/2024/wordml/sdtformatlock" xmlns:w16se="http://schemas.microsoft.com/office/word/2015/wordml/symex" xmlns:wpg="http://schemas.microsoft.com/office/word/2010/wordprocessingGroup" xmlns:wpi="http://schemas.microsoft.com/office/word/2010/wordprocessingInk" xmlns:wne="http://schemas.microsoft.com/office/word/2006/wordml" xmlns:wps="http://schemas.microsoft.com/office/word/2010/wordprocessingShape" mc:Ignorable="w14 w15 w16se w16cid w16 w16cex w16sdtdh w16sdtfl w16du wp14">
+  <w:p>
+    <w:pPr>
+      <w:pStyle w:val="Header"/>
+    </w:pPr>
+  </w:p>
+</w:hdr>
+</file>
+
+<file path=word/header3.xml><?xml version="1.0" encoding="utf-8"?>
+<w:hdr xmlns:wpc="http://schemas.microsoft.com/office/word/2010/wordprocessingCanvas" xmlns:cx="http://schemas.microsoft.com/office/drawing/2014/chartex" xmlns:cx1="http://schemas.microsoft.com/office/drawing/2015/9/8/chartex" xmlns:cx2="http://schemas.microsoft.com/office/drawing/2015/10/21/chartex" xmlns:cx3="http://schemas.microsoft.com/office/drawing/2016/5/9/chartex" xmlns:cx4="http://schemas.microsoft.com/office/drawing/2016/5/10/chartex" xmlns:cx5="http://schemas.microsoft.com/office/drawing/2016/5/11/chartex" xmlns:cx6="http://schemas.microsoft.com/office/drawing/2016/5/12/chartex" xmlns:cx7="http://schemas.microsoft.com/office/drawing/2016/5/13/chartex" xmlns:cx8="http://schemas.microsoft.com/office/drawing/2016/5/14/chartex" xmlns:mc="http://schemas.openxmlformats.org/markup-compatibility/2006" xmlns:aink="http://schemas.microsoft.com/office/drawing/2016/ink" xmlns:am3d="http://schemas.microsoft.com/office/drawing/2017/model3d" xmlns:o="urn:schemas-microsoft-com:office:office" xmlns:oel="http://schemas.microsoft.com/office/2019/extlst" xmlns:r="http://schemas.openxmlformats.org/officeDocument/2006/relationships" xmlns:m="http://schemas.openxmlformats.org/officeDocument/2006/math" xmlns:v="urn:schemas-microsoft-com:vml" xmlns:wp14="http://schemas.microsoft.com/office/word/2010/wordprocessingDrawing" xmlns:wp="http://schemas.openxmlformats.org/drawingml/2006/wordprocessingDrawing" xmlns:w10="urn:schemas-microsoft-com:office:word" xmlns:w="http://schemas.openxmlformats.org/wordprocessingml/2006/main" xmlns:w14="http://schemas.microsoft.com/office/word/2010/wordml" xmlns:w15="http://schemas.microsoft.com/office/word/2012/wordml" xmlns:w16cex="http://schemas.microsoft.com/office/word/2018/wordml/cex" xmlns:w16cid="http://schemas.microsoft.com/office/word/2016/wordml/cid" xmlns:w16="http://schemas.microsoft.com/office/word/2018/wordml" xmlns:w16du="http://schemas.microsoft.com/office/word/2023/wordml/word16du" xmlns:w16sdtdh="http://schemas.microsoft.com/office/word/2020/wordml/sdtdatahash" xmlns:w16sdtfl="http://schemas.microsoft.com/office/word/2024/wordml/sdtformatlock" xmlns:w16se="http://schemas.microsoft.com/office/word/2015/wordml/symex" xmlns:wpg="http://schemas.microsoft.com/office/word/2010/wordprocessingGroup" xmlns:wpi="http://schemas.microsoft.com/office/word/2010/wordprocessingInk" xmlns:wne="http://schemas.microsoft.com/office/word/2006/wordml" xmlns:wps="http://schemas.microsoft.com/office/word/2010/wordprocessingShape" mc:Ignorable="w14 w15 w16se w16cid w16 w16cex w16sdtdh w16sdtfl w16du wp14">
+  <w:p>
+    <w:pPr>
+      <w:pStyle w:val="Header"/>
+    </w:pPr>
+  </w:p>
+</w:hdr>
 </file>
 
 <file path=word/numbering.xml><?xml version="1.0" encoding="utf-8"?>

</xml_diff>

<commit_message>
Deploying to gh-pages from @ Bibek-Luitel/bibek-luitel.github.io@fdfb2b9e8d830d6b01f643ce18fdce1185498427 🚀
</commit_message>
<xml_diff>
--- a/assets/pdf/cv_full_bibekluitel.docx
+++ b/assets/pdf/cv_full_bibekluitel.docx
@@ -7,7 +7,7 @@
         <w:spacing w:after="120" w:line="240" w:lineRule="auto"/>
         <w:jc w:val="center"/>
         <w:rPr>
-          <w:rFonts w:ascii="Times New Roman" w:hAnsi="Times New Roman" w:cs="Times New Roman"/>
+          <w:rFonts w:ascii="Times New Roman Bold" w:hAnsi="Times New Roman Bold" w:cs="Times New Roman"/>
           <w:b/>
           <w:bCs/>
           <w:sz w:val="32"/>
@@ -16,7 +16,7 @@
       </w:pPr>
       <w:r>
         <w:rPr>
-          <w:rFonts w:ascii="Times New Roman" w:hAnsi="Times New Roman" w:cs="Times New Roman"/>
+          <w:rFonts w:ascii="Times New Roman Bold" w:hAnsi="Times New Roman Bold" w:cs="Times New Roman"/>
           <w:b/>
           <w:bCs/>
           <w:sz w:val="40"/>
@@ -26,17 +26,27 @@
       </w:r>
       <w:r>
         <w:rPr>
-          <w:rFonts w:ascii="Times New Roman" w:hAnsi="Times New Roman" w:cs="Times New Roman"/>
+          <w:rFonts w:ascii="Times New Roman Bold" w:hAnsi="Times New Roman Bold" w:cs="Times New Roman"/>
           <w:b/>
           <w:bCs/>
           <w:sz w:val="32"/>
           <w:szCs w:val="32"/>
         </w:rPr>
-        <w:t xml:space="preserve">IBEK </w:t>
-      </w:r>
-      <w:r>
-        <w:rPr>
-          <w:rFonts w:ascii="Times New Roman" w:hAnsi="Times New Roman" w:cs="Times New Roman"/>
+        <w:t>IBEK</w:t>
+      </w:r>
+      <w:r>
+        <w:rPr>
+          <w:rFonts w:ascii="Times New Roman Bold" w:hAnsi="Times New Roman Bold" w:cs="Times New Roman"/>
+          <w:b/>
+          <w:bCs/>
+          <w:sz w:val="32"/>
+          <w:szCs w:val="32"/>
+        </w:rPr>
+        <w:t xml:space="preserve"> </w:t>
+      </w:r>
+      <w:r>
+        <w:rPr>
+          <w:rFonts w:ascii="Times New Roman Bold" w:hAnsi="Times New Roman Bold" w:cs="Times New Roman"/>
           <w:b/>
           <w:bCs/>
           <w:sz w:val="40"/>
@@ -46,7 +56,7 @@
       </w:r>
       <w:r>
         <w:rPr>
-          <w:rFonts w:ascii="Times New Roman" w:hAnsi="Times New Roman" w:cs="Times New Roman"/>
+          <w:rFonts w:ascii="Times New Roman Bold" w:hAnsi="Times New Roman Bold" w:cs="Times New Roman"/>
           <w:b/>
           <w:bCs/>
           <w:sz w:val="32"/>
@@ -56,25 +66,13 @@
       </w:r>
       <w:r>
         <w:rPr>
-          <w:rFonts w:ascii="Times New Roman" w:hAnsi="Times New Roman" w:cs="Times New Roman"/>
+          <w:rFonts w:ascii="Times New Roman Bold" w:hAnsi="Times New Roman Bold" w:cs="Times New Roman"/>
           <w:b/>
           <w:bCs/>
           <w:sz w:val="32"/>
           <w:szCs w:val="32"/>
         </w:rPr>
-        <w:t xml:space="preserve">, Ed.D. </w:t>
-      </w:r>
-      <w:r>
-        <w:rPr>
-          <w:rFonts w:ascii="Times New Roman" w:hAnsi="Times New Roman" w:cs="Times New Roman"/>
-          <w:b/>
-          <w:bCs/>
-          <w:i/>
-          <w:iCs/>
-          <w:sz w:val="20"/>
-          <w:szCs w:val="20"/>
-        </w:rPr>
-        <w:t>(HE/HIM)</w:t>
+        <w:t>, EdD</w:t>
       </w:r>
     </w:p>
     <w:p>
@@ -84,15 +82,29 @@
         </w:pBdr>
         <w:spacing w:after="0" w:line="240" w:lineRule="auto"/>
         <w:jc w:val="center"/>
-      </w:pPr>
-      <w:r>
-        <w:rPr>
-          <w:rFonts w:ascii="Times New Roman" w:hAnsi="Times New Roman" w:cs="Times New Roman"/>
-          <w:sz w:val="22"/>
-          <w:szCs w:val="22"/>
-        </w:rPr>
-        <w:t xml:space="preserve">Texas A&amp;M University-Corpus Christi | </w:t>
-      </w:r>
+        <w:rPr>
+          <w:rFonts w:ascii="Times New Roman" w:hAnsi="Times New Roman" w:cs="Times New Roman"/>
+          <w:sz w:val="22"/>
+          <w:szCs w:val="22"/>
+        </w:rPr>
+      </w:pPr>
+      <w:r>
+        <w:rPr>
+          <w:rFonts w:ascii="Times New Roman" w:hAnsi="Times New Roman" w:cs="Times New Roman"/>
+          <w:sz w:val="22"/>
+          <w:szCs w:val="22"/>
+        </w:rPr>
+        <w:t xml:space="preserve">Educational Research &amp; Evaluation | Education Policy </w:t>
+      </w:r>
+    </w:p>
+    <w:p>
+      <w:pPr>
+        <w:pBdr>
+          <w:bottom w:val="single" w:sz="6" w:space="1" w:color="auto"/>
+        </w:pBdr>
+        <w:spacing w:after="0" w:line="240" w:lineRule="auto"/>
+        <w:jc w:val="center"/>
+      </w:pPr>
       <w:hyperlink r:id="rId7" w:history="1">
         <w:r>
           <w:rPr>
@@ -101,7 +113,7 @@
             <w:sz w:val="22"/>
             <w:szCs w:val="22"/>
           </w:rPr>
-          <w:t>bluitel@islander.tamucc.edu</w:t>
+          <w:t>bibek.luitel@outlook.com</w:t>
         </w:r>
       </w:hyperlink>
       <w:r>
@@ -110,19 +122,37 @@
           <w:sz w:val="22"/>
           <w:szCs w:val="22"/>
         </w:rPr>
-        <w:t xml:space="preserve"> | </w:t>
-      </w:r>
-      <w:hyperlink r:id="rId8" w:history="1">
-        <w:r>
-          <w:rPr>
-            <w:rStyle w:val="Hyperlink"/>
-            <w:rFonts w:ascii="Times New Roman" w:hAnsi="Times New Roman" w:cs="Times New Roman"/>
-            <w:sz w:val="22"/>
-            <w:szCs w:val="22"/>
-          </w:rPr>
-          <w:t>https://bibekluitel.com</w:t>
-        </w:r>
-      </w:hyperlink>
+        <w:t xml:space="preserve"> </w:t>
+      </w:r>
+      <w:r>
+        <w:rPr>
+          <w:rFonts w:ascii="Times New Roman" w:hAnsi="Times New Roman" w:cs="Times New Roman"/>
+          <w:sz w:val="22"/>
+          <w:szCs w:val="22"/>
+        </w:rPr>
+        <w:t xml:space="preserve">| </w:t>
+      </w:r>
+      <w:r>
+        <w:fldChar w:fldCharType="begin"/>
+      </w:r>
+      <w:r>
+        <w:instrText>HYPERLINK "https://bibekluitel.com"</w:instrText>
+      </w:r>
+      <w:r>
+        <w:fldChar w:fldCharType="separate"/>
+      </w:r>
+      <w:r>
+        <w:rPr>
+          <w:rStyle w:val="Hyperlink"/>
+          <w:rFonts w:ascii="Times New Roman" w:hAnsi="Times New Roman" w:cs="Times New Roman"/>
+          <w:sz w:val="22"/>
+          <w:szCs w:val="22"/>
+        </w:rPr>
+        <w:t>https://bibekluitel.com</w:t>
+      </w:r>
+      <w:r>
+        <w:fldChar w:fldCharType="end"/>
+      </w:r>
     </w:p>
     <w:p>
       <w:pPr>
@@ -169,7 +199,7 @@
           <w:sz w:val="22"/>
           <w:szCs w:val="22"/>
         </w:rPr>
-        <w:t xml:space="preserve">Doctor of Education in Educational Leadership </w:t>
+        <w:t>Doctor of Education</w:t>
       </w:r>
       <w:r>
         <w:rPr>
@@ -179,7 +209,7 @@
           <w:sz w:val="22"/>
           <w:szCs w:val="22"/>
         </w:rPr>
-        <w:t xml:space="preserve">&amp; Administration </w:t>
+        <w:t xml:space="preserve"> (EdD)</w:t>
       </w:r>
       <w:r>
         <w:rPr>
@@ -189,7 +219,17 @@
           <w:sz w:val="22"/>
           <w:szCs w:val="22"/>
         </w:rPr>
-        <w:t>(EdD)</w:t>
+        <w:t xml:space="preserve"> in Educational Leadership </w:t>
+      </w:r>
+      <w:r>
+        <w:rPr>
+          <w:rFonts w:ascii="Times New Roman" w:hAnsi="Times New Roman" w:cs="Times New Roman"/>
+          <w:b/>
+          <w:bCs/>
+          <w:sz w:val="22"/>
+          <w:szCs w:val="22"/>
+        </w:rPr>
+        <w:t>&amp; Administration</w:t>
       </w:r>
       <w:r>
         <w:rPr>
@@ -275,6 +315,16 @@
           <w:szCs w:val="22"/>
         </w:rPr>
         <w:t>X</w:t>
+      </w:r>
+      <w:r>
+        <w:rPr>
+          <w:rFonts w:ascii="Times New Roman" w:hAnsi="Times New Roman" w:cs="Times New Roman"/>
+          <w:i/>
+          <w:iCs/>
+          <w:sz w:val="22"/>
+          <w:szCs w:val="22"/>
+        </w:rPr>
+        <w:t>, USA</w:t>
       </w:r>
     </w:p>
     <w:p>
@@ -414,23 +464,86 @@
           <w:sz w:val="22"/>
           <w:szCs w:val="22"/>
         </w:rPr>
-        <w:t>Master of Business Studies (M.B.S)</w:t>
-      </w:r>
-      <w:r>
-        <w:rPr>
-          <w:rFonts w:ascii="Times New Roman" w:hAnsi="Times New Roman" w:cs="Times New Roman"/>
-          <w:sz w:val="22"/>
-          <w:szCs w:val="22"/>
-        </w:rPr>
-        <w:t xml:space="preserve">, </w:t>
-      </w:r>
-      <w:r>
-        <w:rPr>
-          <w:rFonts w:ascii="Times New Roman" w:hAnsi="Times New Roman" w:cs="Times New Roman"/>
-          <w:sz w:val="22"/>
-          <w:szCs w:val="22"/>
-        </w:rPr>
-        <w:t>2007</w:t>
+        <w:t>Master of Business Studies (M</w:t>
+      </w:r>
+      <w:r>
+        <w:rPr>
+          <w:rFonts w:ascii="Times New Roman" w:hAnsi="Times New Roman" w:cs="Times New Roman"/>
+          <w:b/>
+          <w:bCs/>
+          <w:sz w:val="22"/>
+          <w:szCs w:val="22"/>
+        </w:rPr>
+        <w:t>BS</w:t>
+      </w:r>
+      <w:r>
+        <w:rPr>
+          <w:rFonts w:ascii="Times New Roman" w:hAnsi="Times New Roman" w:cs="Times New Roman"/>
+          <w:b/>
+          <w:bCs/>
+          <w:sz w:val="22"/>
+          <w:szCs w:val="22"/>
+        </w:rPr>
+        <w:t>)</w:t>
+      </w:r>
+    </w:p>
+    <w:p>
+      <w:pPr>
+        <w:pStyle w:val="ListParagraph"/>
+        <w:spacing w:after="120" w:line="240" w:lineRule="auto"/>
+        <w:contextualSpacing w:val="0"/>
+        <w:rPr>
+          <w:rFonts w:ascii="Times New Roman" w:hAnsi="Times New Roman" w:cs="Times New Roman"/>
+          <w:i/>
+          <w:iCs/>
+          <w:sz w:val="22"/>
+          <w:szCs w:val="22"/>
+        </w:rPr>
+      </w:pPr>
+      <w:r>
+        <w:rPr>
+          <w:rFonts w:ascii="Times New Roman" w:hAnsi="Times New Roman" w:cs="Times New Roman"/>
+          <w:i/>
+          <w:iCs/>
+          <w:sz w:val="22"/>
+          <w:szCs w:val="22"/>
+        </w:rPr>
+        <w:t>Tribhuvan University, Kathmandu, Nepal</w:t>
+      </w:r>
+    </w:p>
+    <w:p>
+      <w:pPr>
+        <w:pStyle w:val="ListParagraph"/>
+        <w:numPr>
+          <w:ilvl w:val="0"/>
+          <w:numId w:val="1"/>
+        </w:numPr>
+        <w:spacing w:after="120" w:line="240" w:lineRule="auto"/>
+        <w:rPr>
+          <w:rFonts w:ascii="Times New Roman" w:hAnsi="Times New Roman" w:cs="Times New Roman"/>
+          <w:sz w:val="22"/>
+          <w:szCs w:val="22"/>
+        </w:rPr>
+      </w:pPr>
+      <w:r>
+        <w:rPr>
+          <w:rFonts w:ascii="Times New Roman" w:hAnsi="Times New Roman" w:cs="Times New Roman"/>
+          <w:b/>
+          <w:bCs/>
+          <w:sz w:val="22"/>
+          <w:szCs w:val="22"/>
+        </w:rPr>
+        <w:t>Bachelor</w:t>
+      </w:r>
+      <w:r>
+        <w:rPr>
+          <w:rFonts w:ascii="Times New Roman" w:hAnsi="Times New Roman" w:cs="Times New Roman"/>
+          <w:b/>
+          <w:bCs/>
+          <w:sz w:val="22"/>
+          <w:szCs w:val="22"/>
+        </w:rPr>
+        <w:t xml:space="preserve"> of Business Studies (MBS)</w:t>
       </w:r>
     </w:p>
     <w:p>
@@ -1247,6 +1360,7 @@
           <w:sz w:val="22"/>
           <w:szCs w:val="22"/>
         </w:rPr>
+        <w:lastRenderedPageBreak/>
         <w:t xml:space="preserve">Oversaw </w:t>
       </w:r>
       <w:r>
@@ -1304,7 +1418,6 @@
           <w:sz w:val="22"/>
           <w:szCs w:val="22"/>
         </w:rPr>
-        <w:lastRenderedPageBreak/>
         <w:t>Assisted faculty with research on teaching and learning, including literature review, data analysis, and manuscript preparation.</w:t>
       </w:r>
     </w:p>
@@ -2217,6 +2330,7 @@
           <w:sz w:val="22"/>
           <w:szCs w:val="22"/>
         </w:rPr>
+        <w:lastRenderedPageBreak/>
         <w:t>Trained enumerators and led data collection, interviews, and focus groups; analyzed data for the advocacy for inclusive education on the World Bank-funded education project.</w:t>
       </w:r>
     </w:p>
@@ -2242,7 +2356,6 @@
           <w:sz w:val="22"/>
           <w:szCs w:val="22"/>
         </w:rPr>
-        <w:lastRenderedPageBreak/>
         <w:t>Drafted, edited research reports, facilitated team coordination, and managed stakeholder communications throughout the project cycle.</w:t>
       </w:r>
     </w:p>
@@ -3531,6 +3644,7 @@
           <w:sz w:val="22"/>
           <w:szCs w:val="22"/>
         </w:rPr>
+        <w:lastRenderedPageBreak/>
         <w:t>Luitel,</w:t>
       </w:r>
       <w:r>
@@ -3774,7 +3888,6 @@
           <w:sz w:val="22"/>
           <w:szCs w:val="22"/>
         </w:rPr>
-        <w:lastRenderedPageBreak/>
         <w:t xml:space="preserve">Rink, D., </w:t>
       </w:r>
       <w:r>
@@ -6625,6 +6738,7 @@
         <w:pStyle w:val="Heading1"/>
       </w:pPr>
       <w:r>
+        <w:lastRenderedPageBreak/>
         <w:t>TEACHING EXPERIENCE</w:t>
       </w:r>
     </w:p>
@@ -6705,7 +6819,6 @@
           <w:sz w:val="22"/>
           <w:szCs w:val="22"/>
         </w:rPr>
-        <w:lastRenderedPageBreak/>
         <w:t>Advising students, guiding academic and professional development, and fostering a supportive and stimulating learning environment.</w:t>
       </w:r>
     </w:p>
@@ -8091,6 +8204,7 @@
         <w:rPr>
           <w:spacing w:val="-4"/>
         </w:rPr>
+        <w:lastRenderedPageBreak/>
         <w:t>2025</w:t>
       </w:r>
       <w:r>
@@ -8369,11 +8483,7 @@
         <w:t xml:space="preserve"> </w:t>
       </w:r>
       <w:r>
-        <w:t xml:space="preserve">Leadership </w:t>
-      </w:r>
-      <w:r>
-        <w:lastRenderedPageBreak/>
-        <w:t xml:space="preserve">Department Travel Grant to present at STAR Global Conference, Nepal, </w:t>
+        <w:t xml:space="preserve">Leadership Department Travel Grant to present at STAR Global Conference, Nepal, </w:t>
       </w:r>
       <w:r>
         <w:rPr>
@@ -10035,6 +10145,7 @@
         <w:pStyle w:val="Heading1"/>
       </w:pPr>
       <w:r>
+        <w:lastRenderedPageBreak/>
         <w:t>HONORS AND RECOGNITION</w:t>
       </w:r>
     </w:p>
@@ -10897,6 +11008,7 @@
         <w:rPr>
           <w:bCs/>
         </w:rPr>
+        <w:lastRenderedPageBreak/>
         <w:t>2015</w:t>
       </w:r>
       <w:r>
@@ -11111,12 +11223,12 @@
       </w:pPr>
     </w:p>
     <w:sectPr>
-      <w:headerReference w:type="even" r:id="rId9"/>
-      <w:headerReference w:type="default" r:id="rId10"/>
-      <w:footerReference w:type="even" r:id="rId11"/>
-      <w:footerReference w:type="default" r:id="rId12"/>
-      <w:headerReference w:type="first" r:id="rId13"/>
-      <w:footerReference w:type="first" r:id="rId14"/>
+      <w:headerReference w:type="even" r:id="rId8"/>
+      <w:headerReference w:type="default" r:id="rId9"/>
+      <w:footerReference w:type="even" r:id="rId10"/>
+      <w:footerReference w:type="default" r:id="rId11"/>
+      <w:headerReference w:type="first" r:id="rId12"/>
+      <w:footerReference w:type="first" r:id="rId13"/>
       <w:pgSz w:w="12240" w:h="15840"/>
       <w:pgMar w:top="1440" w:right="1440" w:bottom="1440" w:left="1440" w:header="720" w:footer="720" w:gutter="0"/>
       <w:cols w:space="720"/>
@@ -14911,6 +15023,18 @@
     <w:uiPriority w:val="99"/>
     <w:rsid w:val="004C4506"/>
   </w:style>
+  <w:style w:type="character" w:styleId="FollowedHyperlink">
+    <w:name w:val="FollowedHyperlink"/>
+    <w:basedOn w:val="DefaultParagraphFont"/>
+    <w:uiPriority w:val="99"/>
+    <w:semiHidden/>
+    <w:unhideWhenUsed/>
+    <w:rsid w:val="00BB5AAB"/>
+    <w:rPr>
+      <w:color w:val="954F72" w:themeColor="followedHyperlink"/>
+      <w:u w:val="single"/>
+    </w:rPr>
+  </w:style>
 </w:styles>
 </file>
 

</xml_diff>